<commit_message>
SCFS pack: apply review 1 corrections
First held step at the CPC paid in two waves (22 Oct, 5 Nov); held
status read per keyword with untracked keywords of 5+ orders held
pending a rank, riders priced by their own bid, keyword bids tab;
premium labelled by held term and campaign; tiers and triggers on
confirmed stock only (shipments ready to ship); Twin Exacts paused by
the Cal King rule; colour cost table; spend rule stated with the
held-bases alternative priced; smaller points and acceptance checks.

Co-Authored-By: Claude Opus 5.5 <noreply@anthropic.com>
Claude-Session: https://claude.ai/code/session_01LdWeCD4TJ4W4nS4vdsqjHm
</commit_message>
<xml_diff>
--- a/reviews/SCFS-20260929/SCFS_Final_Plan_20261002.docx
+++ b/reviews/SCFS-20260929/SCFS_Final_Plan_20261002.docx
@@ -420,7 +420,7 @@
               <w:rPr>
                 <w:sz w:val="16"/>
               </w:rPr>
-              <w:t>1,449 sellable; 1,178 in FC transfer (dated 16 Oct); 1,899 on shipments (16 Oct, 5 Nov, 26 Nov provisional); Full White PO 468 (25 Jan 2027)</w:t>
+              <w:t>1,449 sellable; 1,178 in FC transfer (counted from 16 Oct); 1,899 on shipment lines, of which only 15 are being received — the rest show 'ready to ship' in Sellerboard (Aug–Oct); Full White PO 468 (25 Jan 2027)</w:t>
             </w:r>
           </w:p>
         </w:tc>
@@ -434,7 +434,7 @@
               <w:rPr>
                 <w:sz w:val="16"/>
               </w:rPr>
-              <w:t>Sellerboard 2 Oct; FBA shipments</w:t>
+              <w:t>Sellerboard 2 Oct; shipment lines</w:t>
             </w:r>
           </w:p>
         </w:tc>
@@ -619,7 +619,7 @@
     <w:p/>
     <w:p>
       <w:r>
-        <w:t>In one line: a cooling product turning down into Q4, ranking 2–6 on most of its terms, with its two White heroes in stock once the 16 Oct transfers land — and every top-of-search price on the main Queen and King terms paying $3–5 a click against a click worth $1.50–2.90. The ads can stop paying more than a click earns, keep the page-one terms served from children that have stock, hold everything still through the 7 Oct deal, and spend inside an envelope set by this week's sales.</w:t>
+        <w:t>In one line: a cooling product turning down into Q4, ranking 2–6 on most of its terms, with its two White heroes in stock and more in FC transfer — and every top-of-search price on the main Queen and King terms paying $3–5 a click against a click worth $1.50–2.90. The ads can stop paying more than a click earns, keep the page-one terms served from children that have stock, hold everything still through the 7 Oct deal, and let what a click earns set the spend, inside the envelope.</w:t>
       </w:r>
     </w:p>
     <w:p>
@@ -654,7 +654,7 @@
         <w:pStyle w:val="ListBullet"/>
       </w:pPr>
       <w:r>
-        <w:t>Run the 7 Oct Lightning Deal by SOP-32: writes on 2 Oct, arming on 6 Oct, bids held through the deal, no write 6–21 Oct, and the deal plus its 14-day settle left out of every read. The first held price step is on 22 Oct.</w:t>
+        <w:t>Run the 7 Oct Lightning Deal by SOP-32: writes on 2 Oct, arming on 6 Oct, bids held through the deal, no write 6–21 Oct, and the deal plus its 14-day settle left out of every read. The first held price steps are on 22 Oct (wave A) and 5 Nov (wave B).</w:t>
       </w:r>
     </w:p>
     <w:p>
@@ -662,7 +662,15 @@
         <w:pStyle w:val="ListBullet"/>
       </w:pPr>
       <w:r>
-        <w:t>Held page-one terms (13 campaigns: a ranking keyword at rank ≤20 on either source, 7-day medians, read keyword by keyword): walk the top-of-search price down toward its ceiling, each write at least 90% of the CPC paid before it. Held-term guard: before each write, compare the campaign's top-of-search impression share since the last write (leaving out 7–21 Oct, the Lightning Deal and its 14-day settle) with its share in 6–19 Sep, the last 14 days before the 20–30 Sep Best Deal; write the next price step only while the share stays at 70% or more of that pre-plan level, and undo the last step (end the walk) if it has fallen below 70% or the rank slipped more than 3 places (15% above rank 20); where the console reports no impression share, use top-of-search clicks divided by the season factor for the same comparison.</w:t>
+        <w:t>Held page-one terms (16 campaigns, read keyword by keyword: a ranking keyword at rank ≤20 on either source, 7-day medians — or an untracked keyword with ≥5 September orders, held pending a rank): the first step is the CPC paid itself, in two waves (22 Oct and 5 Nov); further steps of 90% of the new CPC paid only after a read. Held-term guard: before each write, compare the campaign's top-of-search impression share since the last write (leaving out 7–21 Oct, the Lightning Deal and its 14-day settle) with its share in 6–19 Sep, the last 14 days before the 20–30 Sep Best Deal; write the next price step only while the share stays at 70% or more of that pre-plan level, and undo the last step (end the walk) if it has fallen below 70% or the rank slipped more than 3 places (15% above rank 20); where the console reports no impression share, use top-of-search clicks divided by the season factor for the same comparison.</w:t>
+      </w:r>
+    </w:p>
+    <w:p>
+      <w:pPr>
+        <w:pStyle w:val="ListBullet"/>
+      </w:pPr>
+      <w:r>
+        <w:t>Spend is set by what a click earns; the envelope (12–14% of trailing-7-day sales) is an upper limit, not a target. On that rule the plan ends at $567 a week (9.5% of last week's sales); the owner confirms it or chooses to keep held bases (section 10).</w:t>
       </w:r>
     </w:p>
     <w:p>
@@ -678,7 +686,7 @@
         <w:pStyle w:val="ListBullet"/>
       </w:pPr>
       <w:r>
-        <w:t>Keep Queen White and King White on their Exacts (the audit's pivot to Queen Graphite is not needed without a push); move Full to Full Cool Grey (Full Cool Blue loses $1.55 a unit before ads); pause Cal King (no child pays for a click); hold Twin for its 5 Nov inbound.</w:t>
+        <w:t>Keep Queen White and King White on their Exacts (the audit's pivot to Queen Graphite is not needed without a push); move Full to Full Cool Grey (Full Cool Blue loses $1.55 a unit before ads); pause Cal King and both Twin Exacts (no margin: the $0.50 base floor would pay at least twice what a product-page click earns).</w:t>
       </w:r>
     </w:p>
     <w:p>
@@ -686,7 +694,7 @@
         <w:pStyle w:val="ListBullet"/>
       </w:pPr>
       <w:r>
-        <w:t>One lever per write on held and re-pointed campaigns (13), so a rank or conversion move can be traced to one change.</w:t>
+        <w:t>One lever per write on held and re-pointed campaigns (18), so a rank or conversion move can be traced to one change.</w:t>
       </w:r>
     </w:p>
     <w:p>
@@ -940,7 +948,7 @@
               <w:rPr>
                 <w:sz w:val="16"/>
               </w:rPr>
-              <w:t>Held terms walk down from 22 Oct (each step ≥90% of the CPC paid) under the impression-share guard; others step to the ceiling (≤30% a write)</w:t>
+              <w:t>Held terms take a first step to the CPC paid (wave A 22 Oct, wave B 5 Nov), then 90% steps only after a read under the impression-share guard; others step to the ceiling (≤30% a write)</w:t>
             </w:r>
           </w:p>
         </w:tc>
@@ -1133,7 +1141,7 @@
     </w:p>
     <w:p>
       <w:r>
-        <w:t>The Cooling Sheets 4 Piece pack went through three reviews (19 issues, 18 contradictions). Every rule it ended with is applied to this product; the workbook tab "SCS4 rules applied" lists them with this product's figures. What is new here: the deal window, the audit's single-day rank reads, the FC transfers and the children that lose money before ads.</w:t>
+        <w:t>The Cooling Sheets 4 Piece pack went through three reviews (19 issues, 18 contradictions). Every rule it ended with is applied to this product; the workbook tab "SCS4 rules applied" lists them with this product's figures. One rule changes after this product's own review (2d): the first held step is the CPC paid, not 90% of it. What is new here: the deal window, the audit's single-day rank reads, keyword-level held status, unconfirmed shipments and the children that lose money before ads.</w:t>
       </w:r>
     </w:p>
     <w:tbl>
@@ -1207,7 +1215,7 @@
               <w:rPr>
                 <w:sz w:val="16"/>
               </w:rPr>
-              <w:t>12.4% → amber; $716–835/wk; expected $690 → $465/wk</w:t>
+              <w:t>12.4% → amber; $716–835/wk; expected $701 → $567/wk</w:t>
             </w:r>
           </w:p>
         </w:tc>
@@ -1237,7 +1245,7 @@
               <w:rPr>
                 <w:sz w:val="16"/>
               </w:rPr>
-              <w:t>13 campaigns; same-day child and price 0</w:t>
+              <w:t>18 campaigns; same-day child and price 0</w:t>
             </w:r>
           </w:p>
         </w:tc>
@@ -1267,7 +1275,7 @@
               <w:rPr>
                 <w:sz w:val="16"/>
               </w:rPr>
-              <w:t>28 bases; 16 in more than one step; 0 raises</w:t>
+              <w:t>28 bases; 17 in more than one step; 0 raises</w:t>
             </w:r>
           </w:p>
         </w:tc>
@@ -1297,7 +1305,7 @@
               <w:rPr>
                 <w:sz w:val="16"/>
               </w:rPr>
-              <w:t>Exact orders 224 → 155 at 31 Dec (range 154–179)</w:t>
+              <w:t>Exact orders 224 → 178 at 31 Dec (range 174–190)</w:t>
             </w:r>
           </w:p>
         </w:tc>
@@ -1357,7 +1365,7 @@
               <w:rPr>
                 <w:sz w:val="16"/>
               </w:rPr>
-              <w:t>13 held campaigns; 14 multi-keyword campaigns read keyword by keyword</w:t>
+              <w:t>16 held campaigns; 14 multi-keyword campaigns read keyword by keyword</w:t>
             </w:r>
           </w:p>
         </w:tc>
@@ -1417,7 +1425,7 @@
               <w:rPr>
                 <w:sz w:val="16"/>
               </w:rPr>
-              <w:t>Held 44 of 171 (26%), not held 22 of 44 (50%)</w:t>
+              <w:t>Held 32 of 191 (16%), not held 12 of 24 (48%)</w:t>
             </w:r>
           </w:p>
         </w:tc>
@@ -1447,7 +1455,7 @@
               <w:rPr>
                 <w:sz w:val="16"/>
               </w:rPr>
-              <w:t>$501 a month, $98/wk</w:t>
+              <w:t>$866 a month, $169/wk</w:t>
             </w:r>
           </w:p>
         </w:tc>
@@ -1493,7 +1501,7 @@
               <w:rPr>
                 <w:sz w:val="16"/>
               </w:rPr>
-              <w:t>Each held step ≥90% of the CPC paid, rounded up; no −15% step on held terms</w:t>
+              <w:t>Held steps — changed by review 1: the first step is the CPC paid, 90% steps only after a read; no −15% step on held terms</w:t>
             </w:r>
           </w:p>
         </w:tc>
@@ -1507,7 +1515,7 @@
               <w:rPr>
                 <w:sz w:val="16"/>
               </w:rPr>
-              <w:t>Lowest first step 90.0%</w:t>
+              <w:t>Lowest first step 100.0% of the CPC paid; 4 rows with under 5% headroom hold</w:t>
             </w:r>
           </w:p>
         </w:tc>
@@ -1538,6 +1546,801 @@
                 <w:sz w:val="16"/>
               </w:rPr>
               <w:t>32 in the bulk file</w:t>
+            </w:r>
+          </w:p>
+        </w:tc>
+      </w:tr>
+    </w:tbl>
+    <w:p/>
+    <w:p>
+      <w:pPr>
+        <w:pStyle w:val="Heading1"/>
+      </w:pPr>
+      <w:r>
+        <w:t>2d. Review 1 (2 Oct): the corrections, and the acceptance checks</w:t>
+      </w:r>
+    </w:p>
+    <w:p>
+      <w:r>
+        <w:t>Each reviewer figure was re-checked against the workbook rows or live Sellerboard before it was applied; all seven corrections hold. One reviewer reading was incomplete: the Full sibling costs came from the first inventory page only — 10 of the 13 Full colours are recorded at about $15.45 (Colour costs tab). The workbook tab 'Review 1 fixes' lists the seven smaller points as well.</w:t>
+      </w:r>
+    </w:p>
+    <w:tbl>
+      <w:tblPr>
+        <w:tblStyle w:val="TableGrid"/>
+        <w:tblW w:type="auto" w:w="0"/>
+        <w:tblLook w:firstColumn="1" w:firstRow="1" w:lastColumn="0" w:lastRow="0" w:noHBand="0" w:noVBand="1" w:val="04A0"/>
+      </w:tblPr>
+      <w:tblGrid>
+        <w:gridCol w:w="3324"/>
+        <w:gridCol w:w="3324"/>
+        <w:gridCol w:w="3324"/>
+      </w:tblGrid>
+      <w:tr>
+        <w:tc>
+          <w:tcPr>
+            <w:tcW w:type="dxa" w:w="454"/>
+            <w:shd w:val="clear" w:color="auto" w:fill="1F3864"/>
+          </w:tcPr>
+          <w:p>
+            <w:r/>
+            <w:r>
+              <w:rPr>
+                <w:b/>
+                <w:color w:val="FFFFFF"/>
+                <w:sz w:val="16"/>
+              </w:rPr>
+              <w:t>#</w:t>
+            </w:r>
+          </w:p>
+        </w:tc>
+        <w:tc>
+          <w:tcPr>
+            <w:tcW w:type="dxa" w:w="2948"/>
+            <w:shd w:val="clear" w:color="auto" w:fill="1F3864"/>
+          </w:tcPr>
+          <w:p>
+            <w:r/>
+            <w:r>
+              <w:rPr>
+                <w:b/>
+                <w:color w:val="FFFFFF"/>
+                <w:sz w:val="16"/>
+              </w:rPr>
+              <w:t>Correction</w:t>
+            </w:r>
+          </w:p>
+        </w:tc>
+        <w:tc>
+          <w:tcPr>
+            <w:tcW w:type="dxa" w:w="6803"/>
+            <w:shd w:val="clear" w:color="auto" w:fill="1F3864"/>
+          </w:tcPr>
+          <w:p>
+            <w:r/>
+            <w:r>
+              <w:rPr>
+                <w:b/>
+                <w:color w:val="FFFFFF"/>
+                <w:sz w:val="16"/>
+              </w:rPr>
+              <w:t>What this version does</w:t>
+            </w:r>
+          </w:p>
+        </w:tc>
+      </w:tr>
+      <w:tr>
+        <w:tc>
+          <w:tcPr>
+            <w:tcW w:type="dxa" w:w="454"/>
+          </w:tcPr>
+          <w:p>
+            <w:r/>
+            <w:r>
+              <w:rPr>
+                <w:sz w:val="16"/>
+              </w:rPr>
+              <w:t>1</w:t>
+            </w:r>
+          </w:p>
+        </w:tc>
+        <w:tc>
+          <w:tcPr>
+            <w:tcW w:type="dxa" w:w="2948"/>
+          </w:tcPr>
+          <w:p>
+            <w:r/>
+            <w:r>
+              <w:rPr>
+                <w:sz w:val="16"/>
+              </w:rPr>
+              <w:t>First held step below what the auctions clear at</w:t>
+            </w:r>
+          </w:p>
+        </w:tc>
+        <w:tc>
+          <w:tcPr>
+            <w:tcW w:type="dxa" w:w="6803"/>
+          </w:tcPr>
+          <w:p>
+            <w:r/>
+            <w:r>
+              <w:rPr>
+                <w:sz w:val="16"/>
+              </w:rPr>
+              <w:t>First step = the CPC paid; a 90% step on today's prices could keep at most 45–84% of the clicks. Wave A 4 campaigns 22 Oct, wave B 8 on 5 Nov; further 90% steps only after a read. Undoing the first steps changes nothing in the forecast; the held saving is the base cuts.</w:t>
+            </w:r>
+          </w:p>
+        </w:tc>
+      </w:tr>
+      <w:tr>
+        <w:tc>
+          <w:tcPr>
+            <w:tcW w:type="dxa" w:w="454"/>
+          </w:tcPr>
+          <w:p>
+            <w:r/>
+            <w:r>
+              <w:rPr>
+                <w:sz w:val="16"/>
+              </w:rPr>
+              <w:t>2</w:t>
+            </w:r>
+          </w:p>
+        </w:tc>
+        <w:tc>
+          <w:tcPr>
+            <w:tcW w:type="dxa" w:w="2948"/>
+          </w:tcPr>
+          <w:p>
+            <w:r/>
+            <w:r>
+              <w:rPr>
+                <w:sz w:val="16"/>
+              </w:rPr>
+              <w:t>Held status decided on 17 of 53 Exact keywords</w:t>
+            </w:r>
+          </w:p>
+        </w:tc>
+        <w:tc>
+          <w:tcPr>
+            <w:tcW w:type="dxa" w:w="6803"/>
+          </w:tcPr>
+          <w:p>
+            <w:r/>
+            <w:r>
+              <w:rPr>
+                <w:sz w:val="16"/>
+              </w:rPr>
+              <w:t>Confirmed: no tracker (Command Center, Data Dive, ASINsight) covers the other 36. Held is read per keyword; untracked keywords with ≥5 September orders are held pending a rank (10); 4 riders priced by their own bid on 2 Oct; keyword-level bids in T3k; trackers to add listed (owner).</w:t>
+            </w:r>
+          </w:p>
+        </w:tc>
+      </w:tr>
+      <w:tr>
+        <w:tc>
+          <w:tcPr>
+            <w:tcW w:type="dxa" w:w="454"/>
+          </w:tcPr>
+          <w:p>
+            <w:r/>
+            <w:r>
+              <w:rPr>
+                <w:sz w:val="16"/>
+              </w:rPr>
+              <w:t>3</w:t>
+            </w:r>
+          </w:p>
+        </w:tc>
+        <w:tc>
+          <w:tcPr>
+            <w:tcW w:type="dxa" w:w="2948"/>
+          </w:tcPr>
+          <w:p>
+            <w:r/>
+            <w:r>
+              <w:rPr>
+                <w:sz w:val="16"/>
+              </w:rPr>
+              <w:t>Premium list named the wrong keyword</w:t>
+            </w:r>
+          </w:p>
+        </w:tc>
+        <w:tc>
+          <w:tcPr>
+            <w:tcW w:type="dxa" w:w="6803"/>
+          </w:tcPr>
+          <w:p>
+            <w:r/>
+            <w:r>
+              <w:rPr>
+                <w:sz w:val="16"/>
+              </w:rPr>
+              <w:t>Every premium row is labelled by its held term and campaign ID.</w:t>
+            </w:r>
+          </w:p>
+        </w:tc>
+      </w:tr>
+      <w:tr>
+        <w:tc>
+          <w:tcPr>
+            <w:tcW w:type="dxa" w:w="454"/>
+          </w:tcPr>
+          <w:p>
+            <w:r/>
+            <w:r>
+              <w:rPr>
+                <w:sz w:val="16"/>
+              </w:rPr>
+              <w:t>4</w:t>
+            </w:r>
+          </w:p>
+        </w:tc>
+        <w:tc>
+          <w:tcPr>
+            <w:tcW w:type="dxa" w:w="2948"/>
+          </w:tcPr>
+          <w:p>
+            <w:r/>
+            <w:r>
+              <w:rPr>
+                <w:sz w:val="16"/>
+              </w:rPr>
+              <w:t>16 Oct arrivals not confirmed</w:t>
+            </w:r>
+          </w:p>
+        </w:tc>
+        <w:tc>
+          <w:tcPr>
+            <w:tcW w:type="dxa" w:w="6803"/>
+          </w:tcPr>
+          <w:p>
+            <w:r/>
+            <w:r>
+              <w:rPr>
+                <w:sz w:val="16"/>
+              </w:rPr>
+              <w:t>Confirmed: 1,884 units 'ready to ship', 15 receiving. Tiers, triggers and run-outs now count only confirmed stock; shipment status per line in Stock &amp; reorder; the check reads OPEN.</w:t>
+            </w:r>
+          </w:p>
+        </w:tc>
+      </w:tr>
+      <w:tr>
+        <w:tc>
+          <w:tcPr>
+            <w:tcW w:type="dxa" w:w="454"/>
+          </w:tcPr>
+          <w:p>
+            <w:r/>
+            <w:r>
+              <w:rPr>
+                <w:sz w:val="16"/>
+              </w:rPr>
+              <w:t>5</w:t>
+            </w:r>
+          </w:p>
+        </w:tc>
+        <w:tc>
+          <w:tcPr>
+            <w:tcW w:type="dxa" w:w="2948"/>
+          </w:tcPr>
+          <w:p>
+            <w:r/>
+            <w:r>
+              <w:rPr>
+                <w:sz w:val="16"/>
+              </w:rPr>
+              <w:t>Twin campaigns armed at $5.18 and $3.80</w:t>
+            </w:r>
+          </w:p>
+        </w:tc>
+        <w:tc>
+          <w:tcPr>
+            <w:tcW w:type="dxa" w:w="6803"/>
+          </w:tcPr>
+          <w:p>
+            <w:r/>
+            <w:r>
+              <w:rPr>
+                <w:sz w:val="16"/>
+              </w:rPr>
+              <w:t>Both pause on 2 Oct by the Cal King rule.</w:t>
+            </w:r>
+          </w:p>
+        </w:tc>
+      </w:tr>
+      <w:tr>
+        <w:tc>
+          <w:tcPr>
+            <w:tcW w:type="dxa" w:w="454"/>
+          </w:tcPr>
+          <w:p>
+            <w:r/>
+            <w:r>
+              <w:rPr>
+                <w:sz w:val="16"/>
+              </w:rPr>
+              <w:t>6</w:t>
+            </w:r>
+          </w:p>
+        </w:tc>
+        <w:tc>
+          <w:tcPr>
+            <w:tcW w:type="dxa" w:w="2948"/>
+          </w:tcPr>
+          <w:p>
+            <w:r/>
+            <w:r>
+              <w:rPr>
+                <w:sz w:val="16"/>
+              </w:rPr>
+              <w:t>No stated cause for the loss-making colours</w:t>
+            </w:r>
+          </w:p>
+        </w:tc>
+        <w:tc>
+          <w:tcPr>
+            <w:tcW w:type="dxa" w:w="6803"/>
+          </w:tcPr>
+          <w:p>
+            <w:r/>
+            <w:r>
+              <w:rPr>
+                <w:sz w:val="16"/>
+              </w:rPr>
+              <w:t>Recorded cost, the size's usual cost, standard and realised price, and contribution three ways per colour; Queen Cool Blue's pace marked clearance demand; the Full move restated (it stands).</w:t>
+            </w:r>
+          </w:p>
+        </w:tc>
+      </w:tr>
+      <w:tr>
+        <w:tc>
+          <w:tcPr>
+            <w:tcW w:type="dxa" w:w="454"/>
+          </w:tcPr>
+          <w:p>
+            <w:r/>
+            <w:r>
+              <w:rPr>
+                <w:sz w:val="16"/>
+              </w:rPr>
+              <w:t>7</w:t>
+            </w:r>
+          </w:p>
+        </w:tc>
+        <w:tc>
+          <w:tcPr>
+            <w:tcW w:type="dxa" w:w="2948"/>
+          </w:tcPr>
+          <w:p>
+            <w:r/>
+            <w:r>
+              <w:rPr>
+                <w:sz w:val="16"/>
+              </w:rPr>
+              <w:t>Plan ends near 8% TACoS against a 12–14% envelope</w:t>
+            </w:r>
+          </w:p>
+        </w:tc>
+        <w:tc>
+          <w:tcPr>
+            <w:tcW w:type="dxa" w:w="6803"/>
+          </w:tcPr>
+          <w:p>
+            <w:r/>
+            <w:r>
+              <w:rPr>
+                <w:sz w:val="16"/>
+              </w:rPr>
+              <w:t>The rule is stated: spend is set by what a click earns, the envelope is an upper limit. The plan now ends at 9.5%; keeping held bases instead is priced (section 10).</w:t>
+            </w:r>
+          </w:p>
+        </w:tc>
+      </w:tr>
+    </w:tbl>
+    <w:p/>
+    <w:tbl>
+      <w:tblPr>
+        <w:tblStyle w:val="TableGrid"/>
+        <w:tblW w:type="auto" w:w="0"/>
+        <w:tblLook w:firstColumn="1" w:firstRow="1" w:lastColumn="0" w:lastRow="0" w:noHBand="0" w:noVBand="1" w:val="04A0"/>
+      </w:tblPr>
+      <w:tblGrid>
+        <w:gridCol w:w="4986"/>
+        <w:gridCol w:w="4986"/>
+      </w:tblGrid>
+      <w:tr>
+        <w:tc>
+          <w:tcPr>
+            <w:tcW w:type="dxa" w:w="5102"/>
+            <w:shd w:val="clear" w:color="auto" w:fill="1F3864"/>
+          </w:tcPr>
+          <w:p>
+            <w:r/>
+            <w:r>
+              <w:rPr>
+                <w:b/>
+                <w:color w:val="FFFFFF"/>
+                <w:sz w:val="16"/>
+              </w:rPr>
+              <w:t>Acceptance check (review 1)</w:t>
+            </w:r>
+          </w:p>
+        </w:tc>
+        <w:tc>
+          <w:tcPr>
+            <w:tcW w:type="dxa" w:w="5102"/>
+            <w:shd w:val="clear" w:color="auto" w:fill="1F3864"/>
+          </w:tcPr>
+          <w:p>
+            <w:r/>
+            <w:r>
+              <w:rPr>
+                <w:b/>
+                <w:color w:val="FFFFFF"/>
+                <w:sz w:val="16"/>
+              </w:rPr>
+              <w:t>State</w:t>
+            </w:r>
+          </w:p>
+        </w:tc>
+      </w:tr>
+      <w:tr>
+        <w:tc>
+          <w:tcPr>
+            <w:tcW w:type="dxa" w:w="5102"/>
+          </w:tcPr>
+          <w:p>
+            <w:r/>
+            <w:r>
+              <w:rPr>
+                <w:sz w:val="16"/>
+              </w:rPr>
+              <w:t>No held row's first price below its CPC paid</w:t>
+            </w:r>
+          </w:p>
+        </w:tc>
+        <w:tc>
+          <w:tcPr>
+            <w:tcW w:type="dxa" w:w="5102"/>
+          </w:tcPr>
+          <w:p>
+            <w:r/>
+            <w:r>
+              <w:rPr>
+                <w:sz w:val="16"/>
+              </w:rPr>
+              <w:t>Met: lowest 100.0%</w:t>
+            </w:r>
+          </w:p>
+        </w:tc>
+      </w:tr>
+      <w:tr>
+        <w:tc>
+          <w:tcPr>
+            <w:tcW w:type="dxa" w:w="5102"/>
+          </w:tcPr>
+          <w:p>
+            <w:r/>
+            <w:r>
+              <w:rPr>
+                <w:sz w:val="16"/>
+              </w:rPr>
+              <w:t>Held campaigns split across at least two write dates</w:t>
+            </w:r>
+          </w:p>
+        </w:tc>
+        <w:tc>
+          <w:tcPr>
+            <w:tcW w:type="dxa" w:w="5102"/>
+          </w:tcPr>
+          <w:p>
+            <w:r/>
+            <w:r>
+              <w:rPr>
+                <w:sz w:val="16"/>
+              </w:rPr>
+              <w:t>Met: 22 Oct (4), 5 Nov (8)</w:t>
+            </w:r>
+          </w:p>
+        </w:tc>
+      </w:tr>
+      <w:tr>
+        <w:tc>
+          <w:tcPr>
+            <w:tcW w:type="dxa" w:w="5102"/>
+          </w:tcPr>
+          <w:p>
+            <w:r/>
+            <w:r>
+              <w:rPr>
+                <w:sz w:val="16"/>
+              </w:rPr>
+              <w:t>A forecast line if the first held steps are undone</w:t>
+            </w:r>
+          </w:p>
+        </w:tc>
+        <w:tc>
+          <w:tcPr>
+            <w:tcW w:type="dxa" w:w="5102"/>
+          </w:tcPr>
+          <w:p>
+            <w:r/>
+            <w:r>
+              <w:rPr>
+                <w:sz w:val="16"/>
+              </w:rPr>
+              <w:t>Met (section 5b, Budget &amp; envelope)</w:t>
+            </w:r>
+          </w:p>
+        </w:tc>
+      </w:tr>
+      <w:tr>
+        <w:tc>
+          <w:tcPr>
+            <w:tcW w:type="dxa" w:w="5102"/>
+          </w:tcPr>
+          <w:p>
+            <w:r/>
+            <w:r>
+              <w:rPr>
+                <w:sz w:val="16"/>
+              </w:rPr>
+              <w:t>Every Exact keyword with ≥5 September orders has a 7-day rank</w:t>
+            </w:r>
+          </w:p>
+        </w:tc>
+        <w:tc>
+          <w:tcPr>
+            <w:tcW w:type="dxa" w:w="5102"/>
+          </w:tcPr>
+          <w:p>
+            <w:r/>
+            <w:r>
+              <w:rPr>
+                <w:sz w:val="16"/>
+              </w:rPr>
+              <w:t>Open: 10 need a tracker (owner); held pending a rank until then</w:t>
+            </w:r>
+          </w:p>
+        </w:tc>
+      </w:tr>
+      <w:tr>
+        <w:tc>
+          <w:tcPr>
+            <w:tcW w:type="dxa" w:w="5102"/>
+          </w:tcPr>
+          <w:p>
+            <w:r/>
+            <w:r>
+              <w:rPr>
+                <w:sz w:val="16"/>
+              </w:rPr>
+              <w:t>Held test per keyword; keyword-level bids</w:t>
+            </w:r>
+          </w:p>
+        </w:tc>
+        <w:tc>
+          <w:tcPr>
+            <w:tcW w:type="dxa" w:w="5102"/>
+          </w:tcPr>
+          <w:p>
+            <w:r/>
+            <w:r>
+              <w:rPr>
+                <w:sz w:val="16"/>
+              </w:rPr>
+              <w:t>Met (T3, T3k)</w:t>
+            </w:r>
+          </w:p>
+        </w:tc>
+      </w:tr>
+      <w:tr>
+        <w:tc>
+          <w:tcPr>
+            <w:tcW w:type="dxa" w:w="5102"/>
+          </w:tcPr>
+          <w:p>
+            <w:r/>
+            <w:r>
+              <w:rPr>
+                <w:sz w:val="16"/>
+              </w:rPr>
+              <w:t>Premium rows name the held term and campaign ID</w:t>
+            </w:r>
+          </w:p>
+        </w:tc>
+        <w:tc>
+          <w:tcPr>
+            <w:tcW w:type="dxa" w:w="5102"/>
+          </w:tcPr>
+          <w:p>
+            <w:r/>
+            <w:r>
+              <w:rPr>
+                <w:sz w:val="16"/>
+              </w:rPr>
+              <w:t>Met (sections 3, 5b, 10; Owner decisions)</w:t>
+            </w:r>
+          </w:p>
+        </w:tc>
+      </w:tr>
+      <w:tr>
+        <w:tc>
+          <w:tcPr>
+            <w:tcW w:type="dxa" w:w="5102"/>
+          </w:tcPr>
+          <w:p>
+            <w:r/>
+            <w:r>
+              <w:rPr>
+                <w:sz w:val="16"/>
+              </w:rPr>
+              <w:t>Shipment status and units received per line; the check reads OPEN or CONFIRMED</w:t>
+            </w:r>
+          </w:p>
+        </w:tc>
+        <w:tc>
+          <w:tcPr>
+            <w:tcW w:type="dxa" w:w="5102"/>
+          </w:tcPr>
+          <w:p>
+            <w:r/>
+            <w:r>
+              <w:rPr>
+                <w:sz w:val="16"/>
+              </w:rPr>
+              <w:t>Met: OPEN</w:t>
+            </w:r>
+          </w:p>
+        </w:tc>
+      </w:tr>
+      <w:tr>
+        <w:tc>
+          <w:tcPr>
+            <w:tcW w:type="dxa" w:w="5102"/>
+          </w:tcPr>
+          <w:p>
+            <w:r/>
+            <w:r>
+              <w:rPr>
+                <w:sz w:val="16"/>
+              </w:rPr>
+              <w:t>Both Twin campaigns at the ceiling or paused on 2 Oct</w:t>
+            </w:r>
+          </w:p>
+        </w:tc>
+        <w:tc>
+          <w:tcPr>
+            <w:tcW w:type="dxa" w:w="5102"/>
+          </w:tcPr>
+          <w:p>
+            <w:r/>
+            <w:r>
+              <w:rPr>
+                <w:sz w:val="16"/>
+              </w:rPr>
+              <w:t>Met: paused</w:t>
+            </w:r>
+          </w:p>
+        </w:tc>
+      </w:tr>
+      <w:tr>
+        <w:tc>
+          <w:tcPr>
+            <w:tcW w:type="dxa" w:w="5102"/>
+          </w:tcPr>
+          <w:p>
+            <w:r/>
+            <w:r>
+              <w:rPr>
+                <w:sz w:val="16"/>
+              </w:rPr>
+              <w:t>Each held-back colour shows recorded cost, list and realised price beside its contribution</w:t>
+            </w:r>
+          </w:p>
+        </w:tc>
+        <w:tc>
+          <w:tcPr>
+            <w:tcW w:type="dxa" w:w="5102"/>
+          </w:tcPr>
+          <w:p>
+            <w:r/>
+            <w:r>
+              <w:rPr>
+                <w:sz w:val="16"/>
+              </w:rPr>
+              <w:t>Met (Colour costs)</w:t>
+            </w:r>
+          </w:p>
+        </w:tc>
+      </w:tr>
+      <w:tr>
+        <w:tc>
+          <w:tcPr>
+            <w:tcW w:type="dxa" w:w="5102"/>
+          </w:tcPr>
+          <w:p>
+            <w:r/>
+            <w:r>
+              <w:rPr>
+                <w:sz w:val="16"/>
+              </w:rPr>
+              <w:t>Section 2 states which rule sets spend; the owner decision is recorded</w:t>
+            </w:r>
+          </w:p>
+        </w:tc>
+        <w:tc>
+          <w:tcPr>
+            <w:tcW w:type="dxa" w:w="5102"/>
+          </w:tcPr>
+          <w:p>
+            <w:r/>
+            <w:r>
+              <w:rPr>
+                <w:sz w:val="16"/>
+              </w:rPr>
+              <w:t>Met; decision recorded with the default (section 10)</w:t>
+            </w:r>
+          </w:p>
+        </w:tc>
+      </w:tr>
+      <w:tr>
+        <w:tc>
+          <w:tcPr>
+            <w:tcW w:type="dxa" w:w="5102"/>
+          </w:tcPr>
+          <w:p>
+            <w:r/>
+            <w:r>
+              <w:rPr>
+                <w:sz w:val="16"/>
+              </w:rPr>
+              <w:t>Deal SKUs, price and units in the pack</w:t>
+            </w:r>
+          </w:p>
+        </w:tc>
+        <w:tc>
+          <w:tcPr>
+            <w:tcW w:type="dxa" w:w="5102"/>
+          </w:tcPr>
+          <w:p>
+            <w:r/>
+            <w:r>
+              <w:rPr>
+                <w:sz w:val="16"/>
+              </w:rPr>
+              <w:t>Open: in no source the plan can read; asked of the owner</w:t>
+            </w:r>
+          </w:p>
+        </w:tc>
+      </w:tr>
+      <w:tr>
+        <w:tc>
+          <w:tcPr>
+            <w:tcW w:type="dxa" w:w="5102"/>
+          </w:tcPr>
+          <w:p>
+            <w:r/>
+            <w:r>
+              <w:rPr>
+                <w:sz w:val="16"/>
+              </w:rPr>
+              <w:t>No placeholder text printed where a value is missing</w:t>
+            </w:r>
+          </w:p>
+        </w:tc>
+        <w:tc>
+          <w:tcPr>
+            <w:tcW w:type="dxa" w:w="5102"/>
+          </w:tcPr>
+          <w:p>
+            <w:r/>
+            <w:r>
+              <w:rPr>
+                <w:sz w:val="16"/>
+              </w:rPr>
+              <w:t>Met (searched both files)</w:t>
             </w:r>
           </w:p>
         </w:tc>
@@ -1653,7 +2456,7 @@
               <w:rPr>
                 <w:sz w:val="16"/>
               </w:rPr>
-              <w:t>Lightning Deal 7 Oct (SOP-32): price, conversion, traffic and CPC all move in the window, so no write goes in and no read uses it. 2 Oct carries the child swaps, the pauses, the walls and the first non-held steps; held walks start 22 Oct.</w:t>
+              <w:t>Lightning Deal 7 Oct (SOP-32): price, conversion, traffic and CPC all move in the window, so no write goes in and no read uses it. 2 Oct carries the child swaps, the pauses, the walls, the rider bids and the first non-held steps; held first steps go on 22 Oct (wave A) and 5 Nov (wave B).</w:t>
             </w:r>
           </w:p>
         </w:tc>
@@ -1759,7 +2562,7 @@
               <w:rPr>
                 <w:sz w:val="16"/>
               </w:rPr>
-              <w:t>Twin on stock hold</w:t>
+              <w:t>Pause both Twin Exacts</w:t>
             </w:r>
           </w:p>
         </w:tc>
@@ -1773,7 +2576,7 @@
               <w:rPr>
                 <w:sz w:val="16"/>
               </w:rPr>
-              <w:t>Every Twin child is out except Twin Midnight Black (8 units + 48 in FC transfer). Twin Cool Grey restocks 60 on 5 Nov + 84 on 26 Nov; Twin White 12 on 16 Oct + 60 on 5 Nov. The two Twin Exacts hold (no write; they cannot serve) until 5 Nov, then price to the Twin ceiling. Twin contribution is thin (Twin Cool Grey $2.87 a unit, Apr–Sep, 56 units (Sep had 1)).</w:t>
+              <w:t>By the Cal King rule: Twin Cool Grey earns $2.87 a unit, so product pages afford $0.24 against a $0.50 base floor; the campaigns sat at $5.18 and $3.80 at top of search against a $0.61 ceiling and would restart by themselves when stock lands. Paused on 2 Oct; the Twin terms stay with the Auto.</w:t>
             </w:r>
           </w:p>
         </w:tc>
@@ -1789,7 +2592,7 @@
               <w:rPr>
                 <w:sz w:val="16"/>
               </w:rPr>
-              <w:t>Hold the page-one terms by walking down the clearing price</w:t>
+              <w:t>Hold the page-one terms: first step to the CPC paid, in two waves</w:t>
             </w:r>
           </w:p>
         </w:tc>
@@ -1803,7 +2606,7 @@
               <w:rPr>
                 <w:sz w:val="16"/>
               </w:rPr>
-              <w:t>On the 13 held campaigns each step is at least 90% of the CPC paid before it. Held-term guard: before each write, compare the campaign's top-of-search impression share since the last write (leaving out 7–21 Oct, the Lightning Deal and its 14-day settle) with its share in 6–19 Sep, the last 14 days before the 20–30 Sep Best Deal; write the next price step only while the share stays at 70% or more of that pre-plan level, and undo the last step (end the walk) if it has fallen below 70% or the rank slipped more than 3 places (15% above rank 20); where the console reports no impression share, use top-of-search clicks divided by the season factor for the same comparison. In the central case 10 take one step and stop. 'cooling fitted sheet': $2.79 on 22 Oct (from $3.78, CPC paid $3.10; ceiling $1.61).</w:t>
+              <w:t>On today's prices a step to 90% of the CPC paid could keep at most 45–84% of the clicks (a DO bid caps the price; T3), below the forecast's 81% on most rows, so the first step is the CPC paid itself: it removes headroom without bidding under the average clearing price. Wave A (one large Queen, one large King, two small: 4) on 22 Oct; wave B (8) on 5 Nov, read against wave A. 4 held rows have under 5% headroom and hold. Further steps, 90% of the new CPC paid, only after a read. Held-term guard: before each write, compare the campaign's top-of-search impression share since the last write (leaving out 7–21 Oct, the Lightning Deal and its 14-day settle) with its share in 6–19 Sep, the last 14 days before the 20–30 Sep Best Deal; write the next price step only while the share stays at 70% or more of that pre-plan level, and undo the last step (end the walk) if it has fallen below 70% or the rank slipped more than 3 places (15% above rank 20); where the console reports no impression share, use top-of-search clicks divided by the season factor for the same comparison. 'cooling fitted sheet': $3.10 on 22 Oct (from $3.78; ceiling $1.61).</w:t>
             </w:r>
           </w:p>
         </w:tc>
@@ -1819,7 +2622,7 @@
               <w:rPr>
                 <w:sz w:val="16"/>
               </w:rPr>
-              <w:t>Pay a sized rank-hold premium</w:t>
+              <w:t>Read held status per keyword</w:t>
             </w:r>
           </w:p>
         </w:tc>
@@ -1833,7 +2636,7 @@
               <w:rPr>
                 <w:sz w:val="16"/>
               </w:rPr>
-              <w:t>The held terms stop above their ceilings: $501 a month at September volume, $98/wk at last week's. Largest: 'cool fitted sheet king' $173; 'cooling fitted sheet' $165; 'cool fitted sheet queen' $68; 'cooling king fitted sheet' $28; 'king size fitted sheets only c' $19. The owner can release any of them (section 10).</w:t>
+              <w:t>Only 17 of 53 Exact keywords have a rank in any source (the other 36 carry $1,985 and 136 orders). An untracked keyword with ≥5 September orders is held pending a rank (10 keywords) until the trackers the owner adds give it a 7-day median; 4 riders above the ceiling are priced by their own bid on 2 Oct (T3k).</w:t>
             </w:r>
           </w:p>
         </w:tc>
@@ -1849,7 +2652,7 @@
               <w:rPr>
                 <w:sz w:val="16"/>
               </w:rPr>
-              <w:t>Everything else steps to its ceiling</w:t>
+              <w:t>Pay a sized rank-hold premium</w:t>
             </w:r>
           </w:p>
         </w:tc>
@@ -1863,7 +2666,7 @@
               <w:rPr>
                 <w:sz w:val="16"/>
               </w:rPr>
-              <w:t>5 non-held rows end under 70% of today's CPC, carrying 16 of 164 top-of-search orders a month.</w:t>
+              <w:t>The held terms stop above their ceilings: $866 a month at September volume, $169/wk at last week's. Largest, by held term (campaign): 'cooling fitted sheet' (277390956383530) $258; 'cooling fitted sheet king' (43491018068645) $257; 'cooling fitted sheet queen' (202444515473718) $128; 'cooling king fitted sheet' (25820387388275) $43; 'king cooling fitted sheet' (22290954617594) $35. The owner can release any of them (section 10).</w:t>
             </w:r>
           </w:p>
         </w:tc>
@@ -1879,6 +2682,36 @@
               <w:rPr>
                 <w:sz w:val="16"/>
               </w:rPr>
+              <w:t>Everything else steps to its ceiling</w:t>
+            </w:r>
+          </w:p>
+        </w:tc>
+        <w:tc>
+          <w:tcPr>
+            <w:tcW w:type="dxa" w:w="7370"/>
+          </w:tcPr>
+          <w:p>
+            <w:r/>
+            <w:r>
+              <w:rPr>
+                <w:sz w:val="16"/>
+              </w:rPr>
+              <w:t>3 non-held rows end under 70% of today's CPC, carrying 8 of 164 top-of-search orders a month.</w:t>
+            </w:r>
+          </w:p>
+        </w:tc>
+      </w:tr>
+      <w:tr>
+        <w:tc>
+          <w:tcPr>
+            <w:tcW w:type="dxa" w:w="2835"/>
+          </w:tcPr>
+          <w:p>
+            <w:r/>
+            <w:r>
+              <w:rPr>
+                <w:sz w:val="16"/>
+              </w:rPr>
               <w:t>Base: only where it pays, staged</w:t>
             </w:r>
           </w:p>
@@ -1893,7 +2726,7 @@
               <w:rPr>
                 <w:sz w:val="16"/>
               </w:rPr>
-              <w:t>Product-page orders cost $22.34 against $15.33 at top of search; 28 bases come down to what a product-page click affords ($0.83 on Queen White, $0.83 on King White), in dated steps; on held rows after the walk (4 stop at the order guard).</w:t>
+              <w:t>Product-page orders cost $22.34 against $15.33 at top of search; 28 bases come down to what a product-page click affords ($0.83 on Queen White, $0.83 on King White), in dated steps; on held rows after the walk (1 stop at the order guard).</w:t>
             </w:r>
           </w:p>
         </w:tc>
@@ -2285,7 +3118,7 @@
               <w:rPr>
                 <w:sz w:val="16"/>
               </w:rPr>
-              <w:t>Confirm FC transfers (1178) and arrival dates; read top-of-search impression share 6–19 Sep on the 13 held campaigns</w:t>
+              <w:t>Confirm with the forwarder that the August–October shipments have left (1,884 units 'ready to ship'); add the 10 untracked keywords with ≥5 orders to the rank trackers; read top-of-search impression share 6–19 Sep on the 16 held campaigns</w:t>
             </w:r>
           </w:p>
         </w:tc>
@@ -2313,7 +3146,7 @@
               <w:rPr>
                 <w:sz w:val="16"/>
               </w:rPr>
-              <w:t>Needs console IDs</w:t>
+              <w:t>Needs console IDs, Rank tracking</w:t>
             </w:r>
           </w:p>
         </w:tc>
@@ -2789,7 +3622,7 @@
               <w:rPr>
                 <w:sz w:val="16"/>
               </w:rPr>
-              <w:t>FC transfers and the August–September shipments sellable? Re-tier if not</w:t>
+              <w:t>FC transfers sellable? Shipments received? Re-tier on the day</w:t>
             </w:r>
           </w:p>
         </w:tc>
@@ -2847,7 +3680,7 @@
               <w:rPr>
                 <w:sz w:val="16"/>
               </w:rPr>
-              <w:t>22 Oct and every 14 days</w:t>
+              <w:t>22 Oct</w:t>
             </w:r>
           </w:p>
         </w:tc>
@@ -2861,7 +3694,7 @@
               <w:rPr>
                 <w:sz w:val="16"/>
               </w:rPr>
-              <w:t>Read (impression share, CPC paid, rank, total orders), then the next write — sized by the read, undone where the guard trips</w:t>
+              <w:t>Wave A first held steps (to the CPC paid): 4 campaigns</w:t>
             </w:r>
           </w:p>
         </w:tc>
@@ -2889,7 +3722,7 @@
               <w:rPr>
                 <w:sz w:val="16"/>
               </w:rPr>
-              <w:t>T3 Write dates</w:t>
+              <w:t>T3</w:t>
             </w:r>
           </w:p>
         </w:tc>
@@ -2903,7 +3736,7 @@
               <w:rPr>
                 <w:sz w:val="16"/>
               </w:rPr>
-              <w:t>Keep / undo written per row</w:t>
+              <w:t>Loaded</w:t>
             </w:r>
           </w:p>
         </w:tc>
@@ -2919,6 +3752,78 @@
               <w:rPr>
                 <w:sz w:val="16"/>
               </w:rPr>
+              <w:t>22 Oct and every 14 days</w:t>
+            </w:r>
+          </w:p>
+        </w:tc>
+        <w:tc>
+          <w:tcPr>
+            <w:tcW w:type="dxa" w:w="3685"/>
+          </w:tcPr>
+          <w:p>
+            <w:r/>
+            <w:r>
+              <w:rPr>
+                <w:sz w:val="16"/>
+              </w:rPr>
+              <w:t>Read (impression share, CPC paid, rank, total orders), then the next write — sized by the read, undone where the guard trips</w:t>
+            </w:r>
+          </w:p>
+        </w:tc>
+        <w:tc>
+          <w:tcPr>
+            <w:tcW w:type="dxa" w:w="1134"/>
+          </w:tcPr>
+          <w:p>
+            <w:r/>
+            <w:r>
+              <w:rPr>
+                <w:sz w:val="16"/>
+              </w:rPr>
+              <w:t>PPC</w:t>
+            </w:r>
+          </w:p>
+        </w:tc>
+        <w:tc>
+          <w:tcPr>
+            <w:tcW w:type="dxa" w:w="2098"/>
+          </w:tcPr>
+          <w:p>
+            <w:r/>
+            <w:r>
+              <w:rPr>
+                <w:sz w:val="16"/>
+              </w:rPr>
+              <w:t>T3 Write dates</w:t>
+            </w:r>
+          </w:p>
+        </w:tc>
+        <w:tc>
+          <w:tcPr>
+            <w:tcW w:type="dxa" w:w="1701"/>
+          </w:tcPr>
+          <w:p>
+            <w:r/>
+            <w:r>
+              <w:rPr>
+                <w:sz w:val="16"/>
+              </w:rPr>
+              <w:t>Keep / undo written per row</w:t>
+            </w:r>
+          </w:p>
+        </w:tc>
+      </w:tr>
+      <w:tr>
+        <w:tc>
+          <w:tcPr>
+            <w:tcW w:type="dxa" w:w="1587"/>
+          </w:tcPr>
+          <w:p>
+            <w:r/>
+            <w:r>
+              <w:rPr>
+                <w:sz w:val="16"/>
+              </w:rPr>
               <w:t>5 Nov</w:t>
             </w:r>
           </w:p>
@@ -2933,7 +3838,7 @@
               <w:rPr>
                 <w:sz w:val="16"/>
               </w:rPr>
-              <w:t>Twin inbound: restart the Twin Exacts at the Twin ceiling</w:t>
+              <w:t>Read wave A against wave B; wave B first steps (8); wave A's next step only if its guard holds</w:t>
             </w:r>
           </w:p>
         </w:tc>
@@ -2961,7 +3866,7 @@
               <w:rPr>
                 <w:sz w:val="16"/>
               </w:rPr>
-              <w:t>Monitoring</w:t>
+              <w:t>T3, Monitoring</w:t>
             </w:r>
           </w:p>
         </w:tc>
@@ -2975,7 +3880,7 @@
               <w:rPr>
                 <w:sz w:val="16"/>
               </w:rPr>
-              <w:t>Serving</w:t>
+              <w:t>Keep / undo written</w:t>
             </w:r>
           </w:p>
         </w:tc>
@@ -3255,7 +4160,7 @@
               <w:rPr>
                 <w:sz w:val="16"/>
               </w:rPr>
-              <w:t>17</w:t>
+              <w:t>14</w:t>
             </w:r>
           </w:p>
         </w:tc>
@@ -3313,7 +4218,7 @@
               <w:rPr>
                 <w:sz w:val="16"/>
               </w:rPr>
-              <w:t>2</w:t>
+              <w:t>4</w:t>
             </w:r>
           </w:p>
         </w:tc>
@@ -3371,7 +4276,7 @@
               <w:rPr>
                 <w:sz w:val="16"/>
               </w:rPr>
-              <w:t>28</w:t>
+              <w:t>29</w:t>
             </w:r>
           </w:p>
         </w:tc>
@@ -3545,7 +4450,7 @@
               <w:rPr>
                 <w:sz w:val="16"/>
               </w:rPr>
-              <w:t>13</w:t>
+              <w:t>16</w:t>
             </w:r>
           </w:p>
         </w:tc>
@@ -3858,7 +4763,7 @@
     <w:p/>
     <w:p>
       <w:r>
-        <w:t>129 rows load from the Bulk upload tab and 27 need an ID or a manual step from the console. Writes after 2 Oct (19 campaigns carry them, the last on 3 Dec 2026) are not in the upload file: each is re-sized by the read before it loads (T3 'Write dates'). No price and no bid goes up.</w:t>
+        <w:t>129 rows load from the Bulk upload tab and 30 need an ID or a manual step from the console. Writes after 2 Oct (20 campaigns carry them, the last on 31 Dec 2026) are not in the upload file: each is re-sized by the read before it loads (T3 'Write dates'). No price and no bid goes up.</w:t>
       </w:r>
     </w:p>
     <w:p>
@@ -4381,7 +5286,7 @@
               <w:rPr>
                 <w:sz w:val="14"/>
               </w:rPr>
-              <w:t>cooling fitted sheet (Queen White)</w:t>
+              <w:t>cooling fitted sheet (Queen White, 277390956383530)</w:t>
             </w:r>
           </w:p>
         </w:tc>
@@ -4395,7 +5300,7 @@
               <w:rPr>
                 <w:sz w:val="14"/>
               </w:rPr>
-              <w:t>held</w:t>
+              <w:t>held, wave A</w:t>
             </w:r>
           </w:p>
         </w:tc>
@@ -4437,7 +5342,7 @@
               <w:rPr>
                 <w:sz w:val="14"/>
               </w:rPr>
-              <w:t>$2.79</w:t>
+              <w:t>$3.10</w:t>
             </w:r>
           </w:p>
         </w:tc>
@@ -4451,7 +5356,7 @@
               <w:rPr>
                 <w:sz w:val="14"/>
               </w:rPr>
-              <w:t>22 Oct price $2.79; 5 Nov base $1.35</w:t>
+              <w:t>2 Oct 1 keyword(s) by their own bid; 22 Oct price $3.10; 5 Nov base $1.35; 19 Nov base $1.01; 3 Dec base $0.83</w:t>
             </w:r>
           </w:p>
         </w:tc>
@@ -4467,7 +5372,7 @@
               <w:rPr>
                 <w:sz w:val="14"/>
               </w:rPr>
-              <w:t>cool fitted sheet queen (Queen White)</w:t>
+              <w:t>cooling fitted sheet queen (Queen White, 202444515473718)</w:t>
             </w:r>
           </w:p>
         </w:tc>
@@ -4481,7 +5386,7 @@
               <w:rPr>
                 <w:sz w:val="14"/>
               </w:rPr>
-              <w:t>held</w:t>
+              <w:t>held, wave B</w:t>
             </w:r>
           </w:p>
         </w:tc>
@@ -4523,7 +5428,7 @@
               <w:rPr>
                 <w:sz w:val="14"/>
               </w:rPr>
-              <w:t>$3.56</w:t>
+              <w:t>$3.95</w:t>
             </w:r>
           </w:p>
         </w:tc>
@@ -4537,7 +5442,7 @@
               <w:rPr>
                 <w:sz w:val="14"/>
               </w:rPr>
-              <w:t>22 Oct price $3.56; 5 Nov base $1.50; 19 Nov base $1.12; 3 Dec base $0.84</w:t>
+              <w:t>5 Nov price $3.95; 19 Nov base $1.50; 3 Dec base $1.12; 17 Dec base $0.84</w:t>
             </w:r>
           </w:p>
         </w:tc>
@@ -4553,7 +5458,7 @@
               <w:rPr>
                 <w:sz w:val="14"/>
               </w:rPr>
-              <w:t>cool fitted sheet king (King White)</w:t>
+              <w:t>cooling fitted sheet king (King White, 43491018068645)</w:t>
             </w:r>
           </w:p>
         </w:tc>
@@ -4567,7 +5472,7 @@
               <w:rPr>
                 <w:sz w:val="14"/>
               </w:rPr>
-              <w:t>held</w:t>
+              <w:t>held, wave A</w:t>
             </w:r>
           </w:p>
         </w:tc>
@@ -4609,7 +5514,7 @@
               <w:rPr>
                 <w:sz w:val="14"/>
               </w:rPr>
-              <w:t>$3.19</w:t>
+              <w:t>$3.54</w:t>
             </w:r>
           </w:p>
         </w:tc>
@@ -4623,7 +5528,7 @@
               <w:rPr>
                 <w:sz w:val="14"/>
               </w:rPr>
-              <w:t>22 Oct price $3.19; 5 Nov base $1.42; 19 Nov base $1.06</w:t>
+              <w:t>2 Oct 1 keyword(s) by their own bid; 22 Oct price $3.54; 5 Nov base $1.42; 19 Nov base $1.06; 3 Dec base $0.83</w:t>
             </w:r>
           </w:p>
         </w:tc>
@@ -4639,7 +5544,7 @@
               <w:rPr>
                 <w:sz w:val="14"/>
               </w:rPr>
-              <w:t>king cooling fitted sheet (King White)</w:t>
+              <w:t>king cooling fitted sheet (King White, 22290954617594)</w:t>
             </w:r>
           </w:p>
         </w:tc>
@@ -4653,7 +5558,7 @@
               <w:rPr>
                 <w:sz w:val="14"/>
               </w:rPr>
-              <w:t>held</w:t>
+              <w:t>held, wave B</w:t>
             </w:r>
           </w:p>
         </w:tc>
@@ -4695,7 +5600,7 @@
               <w:rPr>
                 <w:sz w:val="14"/>
               </w:rPr>
-              <w:t>$2.83</w:t>
+              <w:t>$3.14</w:t>
             </w:r>
           </w:p>
         </w:tc>
@@ -4709,7 +5614,7 @@
               <w:rPr>
                 <w:sz w:val="14"/>
               </w:rPr>
-              <w:t>22 Oct price $2.83; 5 Nov base $1.42; 19 Nov base $1.06; 3 Dec base $0.83</w:t>
+              <w:t>5 Nov price $3.14; 19 Nov base $1.42; 3 Dec base $1.06; 17 Dec base $0.83</w:t>
             </w:r>
           </w:p>
         </w:tc>
@@ -4725,7 +5630,7 @@
               <w:rPr>
                 <w:sz w:val="14"/>
               </w:rPr>
-              <w:t>queen fitted sheet cooling (Queen White)</w:t>
+              <w:t>queen fitted sheet cooling (Queen White, 273480924605775)</w:t>
             </w:r>
           </w:p>
         </w:tc>
@@ -4739,7 +5644,7 @@
               <w:rPr>
                 <w:sz w:val="14"/>
               </w:rPr>
-              <w:t>held</w:t>
+              <w:t>held, wave B</w:t>
             </w:r>
           </w:p>
         </w:tc>
@@ -4781,7 +5686,7 @@
               <w:rPr>
                 <w:sz w:val="14"/>
               </w:rPr>
-              <w:t>$3.14</w:t>
+              <w:t>$3.48</w:t>
             </w:r>
           </w:p>
         </w:tc>
@@ -4795,7 +5700,7 @@
               <w:rPr>
                 <w:sz w:val="14"/>
               </w:rPr>
-              <w:t>22 Oct price $3.14; 5 Nov base $1.42; 19 Nov base $1.06; 3 Dec base $0.83</w:t>
+              <w:t>5 Nov price $3.48; 19 Nov base $1.42; 3 Dec base $1.06; 17 Dec base $0.83</w:t>
             </w:r>
           </w:p>
         </w:tc>
@@ -4811,7 +5716,7 @@
               <w:rPr>
                 <w:sz w:val="14"/>
               </w:rPr>
-              <w:t>king size fitted sheets coolin (King White)</w:t>
+              <w:t>king size fitted sheet cooling (King White, 124359900887254)</w:t>
             </w:r>
           </w:p>
         </w:tc>
@@ -4825,7 +5730,7 @@
               <w:rPr>
                 <w:sz w:val="14"/>
               </w:rPr>
-              <w:t>held</w:t>
+              <w:t>held, wave B</w:t>
             </w:r>
           </w:p>
         </w:tc>
@@ -4867,7 +5772,7 @@
               <w:rPr>
                 <w:sz w:val="14"/>
               </w:rPr>
-              <w:t>$3.23</w:t>
+              <w:t>$3.58</w:t>
             </w:r>
           </w:p>
         </w:tc>
@@ -4881,7 +5786,7 @@
               <w:rPr>
                 <w:sz w:val="14"/>
               </w:rPr>
-              <w:t>22 Oct price $3.23; 5 Nov base $1.42</w:t>
+              <w:t>5 Nov price $3.58; 19 Nov base $1.42; 3 Dec base $1.06; 17 Dec base $0.83</w:t>
             </w:r>
           </w:p>
         </w:tc>
@@ -4897,7 +5802,7 @@
               <w:rPr>
                 <w:sz w:val="14"/>
               </w:rPr>
-              <w:t>cooling king fitted sheet (King White)</w:t>
+              <w:t>cooling king fitted sheet (King White, 25820387388275)</w:t>
             </w:r>
           </w:p>
         </w:tc>
@@ -4911,7 +5816,7 @@
               <w:rPr>
                 <w:sz w:val="14"/>
               </w:rPr>
-              <w:t>held</w:t>
+              <w:t>held, wave A</w:t>
             </w:r>
           </w:p>
         </w:tc>
@@ -4953,7 +5858,7 @@
               <w:rPr>
                 <w:sz w:val="14"/>
               </w:rPr>
-              <w:t>$3.21</w:t>
+              <w:t>$3.56</w:t>
             </w:r>
           </w:p>
         </w:tc>
@@ -4967,7 +5872,7 @@
               <w:rPr>
                 <w:sz w:val="14"/>
               </w:rPr>
-              <w:t>22 Oct price $3.21; 5 Nov base $1.50; 19 Nov base $1.12; 3 Dec base $0.84</w:t>
+              <w:t>2 Oct 1 keyword(s) by their own bid; 22 Oct price $3.56; 5 Nov base $1.50; 19 Nov base $1.12; 3 Dec base $0.84</w:t>
             </w:r>
           </w:p>
         </w:tc>
@@ -4983,7 +5888,7 @@
               <w:rPr>
                 <w:sz w:val="14"/>
               </w:rPr>
-              <w:t>cool fitted sheet king (King White)</w:t>
+              <w:t>cool fitted sheet king (King White, 272683175998066)</w:t>
             </w:r>
           </w:p>
         </w:tc>
@@ -4997,6 +5902,7 @@
               <w:rPr>
                 <w:sz w:val="14"/>
               </w:rPr>
+              <w:t>held (pending rank), wave B</w:t>
             </w:r>
           </w:p>
         </w:tc>
@@ -5038,7 +5944,7 @@
               <w:rPr>
                 <w:sz w:val="14"/>
               </w:rPr>
-              <w:t>$1.87</w:t>
+              <w:t>$3.40</w:t>
             </w:r>
           </w:p>
         </w:tc>
@@ -5052,7 +5958,7 @@
               <w:rPr>
                 <w:sz w:val="14"/>
               </w:rPr>
-              <w:t>2 Oct price $2.93; 2 Oct base $1.42; 22 Oct price $2.05; 22 Oct base $1.06; 5 Nov price $1.87; 5 Nov base $0.83</w:t>
+              <w:t>5 Nov price $3.40; 19 Nov base $1.42</w:t>
             </w:r>
           </w:p>
         </w:tc>
@@ -5068,7 +5974,7 @@
               <w:rPr>
                 <w:sz w:val="14"/>
               </w:rPr>
-              <w:t>king size fitted sheets only c (King White)</w:t>
+              <w:t>king fitted sheet only cooling (King White, 247354433604883)</w:t>
             </w:r>
           </w:p>
         </w:tc>
@@ -5082,7 +5988,7 @@
               <w:rPr>
                 <w:sz w:val="14"/>
               </w:rPr>
-              <w:t>held</w:t>
+              <w:t>held, wave B</w:t>
             </w:r>
           </w:p>
         </w:tc>
@@ -5124,7 +6030,7 @@
               <w:rPr>
                 <w:sz w:val="14"/>
               </w:rPr>
-              <w:t>$3.45</w:t>
+              <w:t>$3.83</w:t>
             </w:r>
           </w:p>
         </w:tc>
@@ -5138,7 +6044,7 @@
               <w:rPr>
                 <w:sz w:val="14"/>
               </w:rPr>
-              <w:t>22 Oct price $3.45; 5 Nov base $1.96; 19 Nov base $1.47; 3 Dec base $1.10</w:t>
+              <w:t>2 Oct 1 keyword(s) by their own bid; 5 Nov price $3.83; 19 Nov base $1.96; 3 Dec base $1.47; 17 Dec base $1.10; 31 Dec base $0.83</w:t>
             </w:r>
           </w:p>
         </w:tc>
@@ -5154,7 +6060,7 @@
               <w:rPr>
                 <w:sz w:val="14"/>
               </w:rPr>
-              <w:t>queen fitted sheet only coolin (Queen White)</w:t>
+              <w:t>queen fitted sheet only coolin (Queen White, 659699120656)</w:t>
             </w:r>
           </w:p>
         </w:tc>
@@ -5168,7 +6074,7 @@
               <w:rPr>
                 <w:sz w:val="14"/>
               </w:rPr>
-              <w:t>held</w:t>
+              <w:t>held, wave A</w:t>
             </w:r>
           </w:p>
         </w:tc>
@@ -5210,7 +6116,7 @@
               <w:rPr>
                 <w:sz w:val="14"/>
               </w:rPr>
-              <w:t>$2.73</w:t>
+              <w:t>$3.03</w:t>
             </w:r>
           </w:p>
         </w:tc>
@@ -5224,7 +6130,7 @@
               <w:rPr>
                 <w:sz w:val="14"/>
               </w:rPr>
-              <w:t>22 Oct price $2.73; 5 Nov base $1.20; 19 Nov base $0.90; 3 Dec base $0.83</w:t>
+              <w:t>22 Oct price $3.03; 5 Nov base $1.20; 19 Nov base $0.90; 3 Dec base $0.83</w:t>
             </w:r>
           </w:p>
         </w:tc>
@@ -5240,7 +6146,7 @@
               <w:rPr>
                 <w:sz w:val="14"/>
               </w:rPr>
-              <w:t>cooling king fitted sheet only (King White)</w:t>
+              <w:t>cooling king fitted sheet only (King White, 75600562345312)</w:t>
             </w:r>
           </w:p>
         </w:tc>
@@ -5325,7 +6231,7 @@
               <w:rPr>
                 <w:sz w:val="14"/>
               </w:rPr>
-              <w:t>queen cooling fitted sheet onl (Queen White)</w:t>
+              <w:t>queen cooling fitted sheet onl (Queen White, 203583941785044)</w:t>
             </w:r>
           </w:p>
         </w:tc>
@@ -5339,6 +6245,7 @@
               <w:rPr>
                 <w:sz w:val="14"/>
               </w:rPr>
+              <w:t>held (pending rank), wave B</w:t>
             </w:r>
           </w:p>
         </w:tc>
@@ -5380,7 +6287,7 @@
               <w:rPr>
                 <w:sz w:val="14"/>
               </w:rPr>
-              <w:t>$2.20</w:t>
+              <w:t>$3.33</w:t>
             </w:r>
           </w:p>
         </w:tc>
@@ -5394,7 +6301,7 @@
               <w:rPr>
                 <w:sz w:val="14"/>
               </w:rPr>
-              <w:t>2 Oct price $3.57; 2 Oct base $1.91; 22 Oct price $2.50; 22 Oct base $1.43; 5 Nov price $2.20; 5 Nov base $1.07 …</w:t>
+              <w:t>5 Nov price $3.33; 19 Nov base $1.91; 3 Dec base $1.43; 17 Dec base $1.07; 31 Dec base $0.83</w:t>
             </w:r>
           </w:p>
         </w:tc>
@@ -5579,7 +6486,7 @@
               <w:rPr>
                 <w:sz w:val="16"/>
               </w:rPr>
-              <w:t>$2,697</w:t>
+              <w:t>$3,316</w:t>
             </w:r>
           </w:p>
         </w:tc>
@@ -5593,7 +6500,7 @@
               <w:rPr>
                 <w:sz w:val="16"/>
               </w:rPr>
-              <w:t>183</w:t>
+              <w:t>206</w:t>
             </w:r>
           </w:p>
         </w:tc>
@@ -5607,7 +6514,7 @@
               <w:rPr>
                 <w:sz w:val="16"/>
               </w:rPr>
-              <w:t>144</w:t>
+              <w:t>160</w:t>
             </w:r>
           </w:p>
         </w:tc>
@@ -5637,7 +6544,7 @@
               <w:rPr>
                 <w:sz w:val="16"/>
               </w:rPr>
-              <w:t>$2,408</w:t>
+              <w:t>$3,252</w:t>
             </w:r>
           </w:p>
         </w:tc>
@@ -5651,7 +6558,7 @@
               <w:rPr>
                 <w:sz w:val="16"/>
               </w:rPr>
-              <w:t>160</w:t>
+              <w:t>200</w:t>
             </w:r>
           </w:p>
         </w:tc>
@@ -5665,7 +6572,7 @@
               <w:rPr>
                 <w:sz w:val="16"/>
               </w:rPr>
-              <w:t>129</w:t>
+              <w:t>158</w:t>
             </w:r>
           </w:p>
         </w:tc>
@@ -5695,7 +6602,7 @@
               <w:rPr>
                 <w:sz w:val="16"/>
               </w:rPr>
-              <w:t>$2,498</w:t>
+              <w:t>$3,192</w:t>
             </w:r>
           </w:p>
         </w:tc>
@@ -5709,7 +6616,7 @@
               <w:rPr>
                 <w:sz w:val="16"/>
               </w:rPr>
-              <w:t>154</w:t>
+              <w:t>194</w:t>
             </w:r>
           </w:p>
         </w:tc>
@@ -5723,7 +6630,7 @@
               <w:rPr>
                 <w:sz w:val="16"/>
               </w:rPr>
-              <w:t>113</w:t>
+              <w:t>156</w:t>
             </w:r>
           </w:p>
         </w:tc>
@@ -5753,7 +6660,7 @@
               <w:rPr>
                 <w:sz w:val="16"/>
               </w:rPr>
-              <w:t>$2,545</w:t>
+              <w:t>$2,888</w:t>
             </w:r>
           </w:p>
         </w:tc>
@@ -5767,7 +6674,7 @@
               <w:rPr>
                 <w:sz w:val="16"/>
               </w:rPr>
-              <w:t>179</w:t>
+              <w:t>190</w:t>
             </w:r>
           </w:p>
         </w:tc>
@@ -5781,7 +6688,7 @@
               <w:rPr>
                 <w:sz w:val="16"/>
               </w:rPr>
-              <w:t>144</w:t>
+              <w:t>160</w:t>
             </w:r>
           </w:p>
         </w:tc>
@@ -5811,7 +6718,7 @@
               <w:rPr>
                 <w:sz w:val="16"/>
               </w:rPr>
-              <w:t>$2,261</w:t>
+              <w:t>$2,783</w:t>
             </w:r>
           </w:p>
         </w:tc>
@@ -5825,7 +6732,7 @@
               <w:rPr>
                 <w:sz w:val="16"/>
               </w:rPr>
-              <w:t>155</w:t>
+              <w:t>178</w:t>
             </w:r>
           </w:p>
         </w:tc>
@@ -5839,7 +6746,7 @@
               <w:rPr>
                 <w:sz w:val="16"/>
               </w:rPr>
-              <w:t>129</w:t>
+              <w:t>158</w:t>
             </w:r>
           </w:p>
         </w:tc>
@@ -5869,7 +6776,7 @@
               <w:rPr>
                 <w:sz w:val="16"/>
               </w:rPr>
-              <w:t>$2,478</w:t>
+              <w:t>$2,768</w:t>
             </w:r>
           </w:p>
         </w:tc>
@@ -5883,7 +6790,7 @@
               <w:rPr>
                 <w:sz w:val="16"/>
               </w:rPr>
-              <w:t>154</w:t>
+              <w:t>174</w:t>
             </w:r>
           </w:p>
         </w:tc>
@@ -5897,7 +6804,7 @@
               <w:rPr>
                 <w:sz w:val="16"/>
               </w:rPr>
-              <w:t>113</w:t>
+              <w:t>156</w:t>
             </w:r>
           </w:p>
         </w:tc>
@@ -6047,7 +6954,7 @@
               <w:rPr>
                 <w:sz w:val="16"/>
               </w:rPr>
-              <w:t>13</w:t>
+              <w:t>16</w:t>
             </w:r>
           </w:p>
         </w:tc>
@@ -6061,7 +6968,7 @@
               <w:rPr>
                 <w:sz w:val="16"/>
               </w:rPr>
-              <w:t>171</w:t>
+              <w:t>191</w:t>
             </w:r>
           </w:p>
         </w:tc>
@@ -6075,7 +6982,7 @@
               <w:rPr>
                 <w:sz w:val="16"/>
               </w:rPr>
-              <w:t>26</w:t>
+              <w:t>22</w:t>
             </w:r>
           </w:p>
         </w:tc>
@@ -6089,7 +6996,7 @@
               <w:rPr>
                 <w:sz w:val="16"/>
               </w:rPr>
-              <w:t>44 (26%)</w:t>
+              <w:t>32 (16%)</w:t>
             </w:r>
           </w:p>
         </w:tc>
@@ -6103,7 +7010,7 @@
               <w:rPr>
                 <w:sz w:val="16"/>
               </w:rPr>
-              <w:t>38</w:t>
+              <w:t>31</w:t>
             </w:r>
           </w:p>
         </w:tc>
@@ -6133,7 +7040,7 @@
               <w:rPr>
                 <w:sz w:val="16"/>
               </w:rPr>
-              <w:t>16</w:t>
+              <w:t>13</w:t>
             </w:r>
           </w:p>
         </w:tc>
@@ -6147,7 +7054,7 @@
               <w:rPr>
                 <w:sz w:val="16"/>
               </w:rPr>
-              <w:t>44</w:t>
+              <w:t>24</w:t>
             </w:r>
           </w:p>
         </w:tc>
@@ -6161,7 +7068,7 @@
               <w:rPr>
                 <w:sz w:val="16"/>
               </w:rPr>
-              <w:t>16</w:t>
+              <w:t>8</w:t>
             </w:r>
           </w:p>
         </w:tc>
@@ -6175,7 +7082,7 @@
               <w:rPr>
                 <w:sz w:val="16"/>
               </w:rPr>
-              <w:t>22 (50%)</w:t>
+              <w:t>12 (48%)</w:t>
             </w:r>
           </w:p>
         </w:tc>
@@ -6189,7 +7096,7 @@
               <w:rPr>
                 <w:sz w:val="16"/>
               </w:rPr>
-              <w:t>29</w:t>
+              <w:t>15</w:t>
             </w:r>
           </w:p>
         </w:tc>
@@ -6282,7 +7189,7 @@
     <w:p/>
     <w:p>
       <w:r>
-        <w:t>Clicks at a placement are unchanged while the price stays at or above the CPC paid there (or today's price, where dynamic bidding pays above it); below it they fall with the price ratio in the best case, its square in the central case, and in the worst case to 10% once the price is under 70% of it. Held-term guard: before each write, compare the campaign's top-of-search impression share since the last write (leaving out 7–21 Oct, the Lightning Deal and its 14-day settle) with its share in 6–19 Sep, the last 14 days before the 20–30 Sep Best Deal; write the next price step only while the share stays at 70% or more of that pre-plan level, and undo the last step (end the walk) if it has fallen below 70% or the rank slipped more than 3 places (15% above rank 20); where the console reports no impression share, use top-of-search clicks divided by the season factor for the same comparison. Held terms lose 44 of their 171 orders in the central case (26%): 27 from the first price step, the rest from the base steps the order guard allows. In the worst case they lose fewer (38), because the guard stops the walk and the base there earlier. The folded campaign's orders move to its owners and are not counted as lost; the Cal King pause (2 orders) and the Twin stock hold (1) are.</w:t>
+        <w:t>Clicks at a placement are unchanged while the price stays at or above the CPC paid there (or today's price, where dynamic bidding pays above it); below it they fall with the price ratio in the best case, its square in the central case, and in the worst case to 10% once the price is under 70% of it. Held-term guard: before each write, compare the campaign's top-of-search impression share since the last write (leaving out 7–21 Oct, the Lightning Deal and its 14-day settle) with its share in 6–19 Sep, the last 14 days before the 20–30 Sep Best Deal; write the next price step only while the share stays at 70% or more of that pre-plan level, and undo the last step (end the walk) if it has fallen below 70% or the rank slipped more than 3 places (15% above rank 20); where the console reports no impression share, use top-of-search clicks divided by the season factor for the same comparison. Held terms lose 32 of their 191 orders in the central case (16%), almost all from the economic base cuts the order guard allows (3 from price). If the first held steps are undone, the forecast does not change: a step to the CPC paid is forecast to keep every click and save nothing, and the held saving ($644 of $802 a month) is the base cuts. Keeping the held bases instead: 206 orders a month at $693/wk (11.6%). The folded campaign's orders move to its owners and are not counted as lost; the Cal King and Twin pauses (3 orders) are.</w:t>
       </w:r>
     </w:p>
     <w:p>
@@ -8282,7 +9189,7 @@
               <w:rPr>
                 <w:sz w:val="14"/>
               </w:rPr>
-              <w:t>Queen Navy Blue</w:t>
+              <w:t>Queen Beige</w:t>
             </w:r>
           </w:p>
         </w:tc>
@@ -8310,7 +9217,7 @@
               <w:rPr>
                 <w:sz w:val="14"/>
               </w:rPr>
-              <w:t>34</w:t>
+              <w:t>30</w:t>
             </w:r>
           </w:p>
         </w:tc>
@@ -8324,7 +9231,7 @@
               <w:rPr>
                 <w:sz w:val="14"/>
               </w:rPr>
-              <w:t>23</w:t>
+              <w:t>51</w:t>
             </w:r>
           </w:p>
         </w:tc>
@@ -8338,7 +9245,7 @@
               <w:rPr>
                 <w:sz w:val="14"/>
               </w:rPr>
-              <w:t>15 Nov</w:t>
+              <w:t>21 Feb 2027</w:t>
             </w:r>
           </w:p>
         </w:tc>
@@ -8352,7 +9259,7 @@
               <w:rPr>
                 <w:sz w:val="14"/>
               </w:rPr>
-              <w:t>now</w:t>
+              <w:t>24 Nov</w:t>
             </w:r>
           </w:p>
         </w:tc>
@@ -8366,7 +9273,7 @@
               <w:rPr>
                 <w:sz w:val="14"/>
               </w:rPr>
-              <w:t>191</w:t>
+              <w:t>43</w:t>
             </w:r>
           </w:p>
         </w:tc>
@@ -8380,7 +9287,7 @@
               <w:rPr>
                 <w:sz w:val="14"/>
               </w:rPr>
-              <w:t>356</w:t>
+              <w:t>126</w:t>
             </w:r>
           </w:p>
         </w:tc>
@@ -8396,7 +9303,7 @@
               <w:rPr>
                 <w:sz w:val="14"/>
               </w:rPr>
-              <w:t>Queen Beige</w:t>
+              <w:t>Queen Navy Blue</w:t>
             </w:r>
           </w:p>
         </w:tc>
@@ -8424,7 +9331,7 @@
               <w:rPr>
                 <w:sz w:val="14"/>
               </w:rPr>
-              <w:t>30</w:t>
+              <w:t>34</w:t>
             </w:r>
           </w:p>
         </w:tc>
@@ -8438,7 +9345,7 @@
               <w:rPr>
                 <w:sz w:val="14"/>
               </w:rPr>
-              <w:t>51</w:t>
+              <w:t>23</w:t>
             </w:r>
           </w:p>
         </w:tc>
@@ -8452,7 +9359,7 @@
               <w:rPr>
                 <w:sz w:val="14"/>
               </w:rPr>
-              <w:t>21 Feb 2027</w:t>
+              <w:t>15 Nov</w:t>
             </w:r>
           </w:p>
         </w:tc>
@@ -8466,7 +9373,7 @@
               <w:rPr>
                 <w:sz w:val="14"/>
               </w:rPr>
-              <w:t>24 Nov</w:t>
+              <w:t>now</w:t>
             </w:r>
           </w:p>
         </w:tc>
@@ -8480,7 +9387,7 @@
               <w:rPr>
                 <w:sz w:val="14"/>
               </w:rPr>
-              <w:t>43</w:t>
+              <w:t>191</w:t>
             </w:r>
           </w:p>
         </w:tc>
@@ -8494,7 +9401,7 @@
               <w:rPr>
                 <w:sz w:val="14"/>
               </w:rPr>
-              <w:t>126</w:t>
+              <w:t>356</w:t>
             </w:r>
           </w:p>
         </w:tc>
@@ -9643,7 +10550,7 @@
     <w:p/>
     <w:p>
       <w:r>
-        <w:t>One clock: every date in this pack — tiers, run-out dates, the −50% and pause triggers, whether inbound counts, and the reorders — runs on the planning pace × the season (Oct 0.59, Nov 0.61, Dec 0.5, Jan 0.38, Feb 0.57, Mar 1.15, Apr 1.3, May 1.21 of the Q3 rate) with dated arrivals. The season: Oct–Feb the higher of the cooling-category shape (Oct–Dec 2025 at 0.56× Jul–Sep in the SCS4 SQP) and this product's own pre-ads month; Mar–Sep its own months. Planning pace = the September in-stock rate ÷ the September season (0.75), or the Apr–Sep in-stock rate ÷ the Apr–Sep season (1.088), whichever is larger. Arrivals: 16 Oct (FC transfers and the shipments of 7 Aug–8 Sep: the audit's confirmed date), 5 Nov (21 Sep shipment, confirmed), 26 Nov (1 Oct shipment, provisional), 25 Jan 2027 (Full White PO, 468). Spring order 4,988 units; 798 units of demand on children that earn ≤$2 a unit before ads are not reordered until their cost or price is fixed.</w:t>
+        <w:t>One clock: every date in this pack — tiers, run-out dates, the −50% and pause triggers, whether inbound counts, and the reorders — runs on the planning pace × the season (Oct 0.59, Nov 0.61, Dec 0.5, Jan 0.38, Feb 0.57, Mar 1.15, Apr 1.3, May 1.21 of the Q3 rate). The season: Oct–Feb the higher of the cooling-category shape (Oct–Dec 2025 at 0.56× Jul–Sep in the SCS4 SQP) and this product's own pre-ads month; Mar–Sep its own months. Planning pace = the September in-stock rate ÷ the September season (0.75), or the Apr–Sep in-stock rate ÷ the Apr–Sep season (1.088), whichever is larger. Stock counted for tiers and triggers: in hand, FC transfers (1,178, from 16 Oct) and the 15 units Amazon is receiving. The 1,884 units on shipments Sellerboard shows 'ready to ship' (dated 16 Oct, 5 Nov or 26 Nov if they land) count for reorders only until the forwarder confirms them; 5 children would move up a tier if they land (Queen Graphite, the Queen back-up, among them). King Beige runs out about 13 Oct on hand: bids −50% now, ads pause 9 Oct. Spring order 4,988 units; 798 units of demand on colours that earn ≤$2 a unit before ads are held back until their cost records are checked (Colour costs tab: Queen Cool Blue and Light Pink carry $16.00–16.20 against $12.48 on most Queen colours; Queen Cool Blue's pace is clearance demand).</w:t>
       </w:r>
     </w:p>
     <w:p>
@@ -9864,7 +10771,7 @@
               <w:rPr>
                 <w:sz w:val="16"/>
               </w:rPr>
-              <w:t>$5,831</w:t>
+              <w:t>$5,857</w:t>
             </w:r>
           </w:p>
         </w:tc>
@@ -9878,7 +10785,7 @@
               <w:rPr>
                 <w:sz w:val="16"/>
               </w:rPr>
-              <w:t>$690</w:t>
+              <w:t>$701</w:t>
             </w:r>
           </w:p>
         </w:tc>
@@ -9892,7 +10799,7 @@
               <w:rPr>
                 <w:sz w:val="16"/>
               </w:rPr>
-              <w:t>11.8%</w:t>
+              <w:t>12.0%</w:t>
             </w:r>
           </w:p>
         </w:tc>
@@ -9906,7 +10813,7 @@
               <w:rPr>
                 <w:sz w:val="16"/>
               </w:rPr>
-              <w:t>$708</w:t>
+              <w:t>$703</w:t>
             </w:r>
           </w:p>
         </w:tc>
@@ -9936,7 +10843,7 @@
               <w:rPr>
                 <w:sz w:val="16"/>
               </w:rPr>
-              <w:t>$5,440</w:t>
+              <w:t>$5,616</w:t>
             </w:r>
           </w:p>
         </w:tc>
@@ -9950,7 +10857,7 @@
               <w:rPr>
                 <w:sz w:val="16"/>
               </w:rPr>
-              <w:t>$465</w:t>
+              <w:t>$567</w:t>
             </w:r>
           </w:p>
         </w:tc>
@@ -9964,7 +10871,7 @@
               <w:rPr>
                 <w:sz w:val="16"/>
               </w:rPr>
-              <w:t>8.5%</w:t>
+              <w:t>10.1%</w:t>
             </w:r>
           </w:p>
         </w:tc>
@@ -9978,7 +10885,7 @@
               <w:rPr>
                 <w:sz w:val="16"/>
               </w:rPr>
-              <w:t>$834</w:t>
+              <w:t>$776</w:t>
             </w:r>
           </w:p>
         </w:tc>
@@ -10008,7 +10915,7 @@
               <w:rPr>
                 <w:sz w:val="16"/>
               </w:rPr>
-              <w:t>$5,437</w:t>
+              <w:t>$5,589</w:t>
             </w:r>
           </w:p>
         </w:tc>
@@ -10022,7 +10929,7 @@
               <w:rPr>
                 <w:sz w:val="16"/>
               </w:rPr>
-              <w:t>$507</w:t>
+              <w:t>$564</w:t>
             </w:r>
           </w:p>
         </w:tc>
@@ -10036,7 +10943,7 @@
               <w:rPr>
                 <w:sz w:val="16"/>
               </w:rPr>
-              <w:t>9.3%</w:t>
+              <w:t>10.1%</w:t>
             </w:r>
           </w:p>
         </w:tc>
@@ -10050,7 +10957,7 @@
               <w:rPr>
                 <w:sz w:val="16"/>
               </w:rPr>
-              <w:t>$791</w:t>
+              <w:t>$772</w:t>
             </w:r>
           </w:p>
         </w:tc>
@@ -10080,7 +10987,7 @@
               <w:rPr>
                 <w:sz w:val="16"/>
               </w:rPr>
-              <w:t>$5,931</w:t>
+              <w:t>$5,937</w:t>
             </w:r>
           </w:p>
         </w:tc>
@@ -10094,7 +11001,7 @@
               <w:rPr>
                 <w:sz w:val="16"/>
               </w:rPr>
-              <w:t>$690</w:t>
+              <w:t>$701</w:t>
             </w:r>
           </w:p>
         </w:tc>
@@ -10108,7 +11015,7 @@
               <w:rPr>
                 <w:sz w:val="16"/>
               </w:rPr>
-              <w:t>11.6%</w:t>
+              <w:t>11.8%</w:t>
             </w:r>
           </w:p>
         </w:tc>
@@ -10122,7 +11029,7 @@
               <w:rPr>
                 <w:sz w:val="16"/>
               </w:rPr>
-              <w:t>$733</w:t>
+              <w:t>$723</w:t>
             </w:r>
           </w:p>
         </w:tc>
@@ -10152,7 +11059,7 @@
               <w:rPr>
                 <w:sz w:val="16"/>
               </w:rPr>
-              <w:t>$5,832</w:t>
+              <w:t>$5,876</w:t>
             </w:r>
           </w:p>
         </w:tc>
@@ -10166,7 +11073,7 @@
               <w:rPr>
                 <w:sz w:val="16"/>
               </w:rPr>
-              <w:t>$465</w:t>
+              <w:t>$567</w:t>
             </w:r>
           </w:p>
         </w:tc>
@@ -10180,7 +11087,7 @@
               <w:rPr>
                 <w:sz w:val="16"/>
               </w:rPr>
-              <w:t>8.0%</w:t>
+              <w:t>9.6%</w:t>
             </w:r>
           </w:p>
         </w:tc>
@@ -10194,7 +11101,7 @@
               <w:rPr>
                 <w:sz w:val="16"/>
               </w:rPr>
-              <w:t>$933</w:t>
+              <w:t>$842</w:t>
             </w:r>
           </w:p>
         </w:tc>
@@ -10224,7 +11131,7 @@
               <w:rPr>
                 <w:sz w:val="16"/>
               </w:rPr>
-              <w:t>−$524</w:t>
+              <w:t>−$348</w:t>
             </w:r>
           </w:p>
         </w:tc>
@@ -10238,7 +11145,7 @@
               <w:rPr>
                 <w:sz w:val="16"/>
               </w:rPr>
-              <w:t>−$277</w:t>
+              <w:t>−$175</w:t>
             </w:r>
           </w:p>
         </w:tc>
@@ -10265,7 +11172,7 @@
               <w:rPr>
                 <w:sz w:val="16"/>
               </w:rPr>
-              <w:t>+$145</w:t>
+              <w:t>+$87</w:t>
             </w:r>
           </w:p>
         </w:tc>
@@ -10295,7 +11202,7 @@
               <w:rPr>
                 <w:sz w:val="16"/>
               </w:rPr>
-              <w:t>−$132</w:t>
+              <w:t>−$88</w:t>
             </w:r>
           </w:p>
         </w:tc>
@@ -10309,7 +11216,7 @@
               <w:rPr>
                 <w:sz w:val="16"/>
               </w:rPr>
-              <w:t>−$277</w:t>
+              <w:t>−$175</w:t>
             </w:r>
           </w:p>
         </w:tc>
@@ -10336,7 +11243,7 @@
               <w:rPr>
                 <w:sz w:val="16"/>
               </w:rPr>
-              <w:t>+$244</w:t>
+              <w:t>+$153</w:t>
             </w:r>
           </w:p>
         </w:tc>
@@ -10379,7 +11286,7 @@
               <w:rPr>
                 <w:sz w:val="16"/>
               </w:rPr>
-              <w:t>$98</w:t>
+              <w:t>$169</w:t>
             </w:r>
           </w:p>
         </w:tc>
@@ -10588,7 +11495,7 @@
               <w:rPr>
                 <w:sz w:val="16"/>
               </w:rPr>
-              <w:t>22 Oct and every 14 days</w:t>
+              <w:t>22 Oct, then every 14 days</w:t>
             </w:r>
           </w:p>
         </w:tc>
@@ -10602,7 +11509,7 @@
               <w:rPr>
                 <w:sz w:val="16"/>
               </w:rPr>
-              <w:t>Held terms: top-of-search impression share, CPC paid, rank (7-day medians) and total orders</w:t>
+              <w:t>Held terms: top-of-search impression share, CPC paid, rank (7-day medians) and total orders; wave A against wave B on 5 Nov</w:t>
             </w:r>
           </w:p>
         </w:tc>
@@ -10616,7 +11523,7 @@
               <w:rPr>
                 <w:sz w:val="16"/>
               </w:rPr>
-              <w:t>Held-term guard: before each write, compare the campaign's top-of-search impression share since the last write (leaving out 7–21 Oct, the Lightning Deal and its 14-day settle) with its share in 6–19 Sep, the last 14 days before the 20–30 Sep Best Deal; write the next price step only while the share stays at 70% or more of that pre-plan level, and undo the last step (end the walk) if it has fallen below 70% or the rank slipped more than 3 places (15% above rank 20); where the console reports no impression share, use top-of-search clicks divided by the season factor for the same comparison. Otherwise the next step, at least 90% of the CPC paid; a held base step is undone if total orders (season-adjusted) fall under 70% of 6–19 Sep.</w:t>
+              <w:t>Held-term guard: before each write, compare the campaign's top-of-search impression share since the last write (leaving out 7–21 Oct, the Lightning Deal and its 14-day settle) with its share in 6–19 Sep, the last 14 days before the 20–30 Sep Best Deal; write the next price step only while the share stays at 70% or more of that pre-plan level, and undo the last step (end the walk) if it has fallen below 70% or the rank slipped more than 3 places (15% above rank 20); where the console reports no impression share, use top-of-search clicks divided by the season factor for the same comparison. Otherwise the next step, 90% of the new CPC paid; a held base step is undone if total orders (season-adjusted) fall under 70% of 6–19 Sep.</w:t>
             </w:r>
           </w:p>
         </w:tc>
@@ -10632,7 +11539,7 @@
               <w:rPr>
                 <w:sz w:val="16"/>
               </w:rPr>
-              <w:t>16 Oct</w:t>
+              <w:t>7 Oct</w:t>
             </w:r>
           </w:p>
         </w:tc>
@@ -10646,7 +11553,7 @@
               <w:rPr>
                 <w:sz w:val="16"/>
               </w:rPr>
-              <w:t>FC transfers and the dated shipments received</w:t>
+              <w:t>Deal-day caps</w:t>
             </w:r>
           </w:p>
         </w:tc>
@@ -10660,7 +11567,7 @@
               <w:rPr>
                 <w:sz w:val="16"/>
               </w:rPr>
-              <w:t>Not received → re-tier; Queen White under 14 days of cover → enable Queen Graphite</w:t>
+              <w:t>Expected to cap first (30-day budget use ≥50%): 'cool fitted sheet queen' 79% of $30; 'king cooling fitted sheet' 58% of $10; 'queen fitted sheet cooling' 56% of $10; 'cooling fitted sheet' 52% of $50; 'king size fitted sheets cooling' 52% of $10 — recorded, not raised</w:t>
             </w:r>
           </w:p>
         </w:tc>
@@ -10676,7 +11583,7 @@
               <w:rPr>
                 <w:sz w:val="16"/>
               </w:rPr>
-              <w:t>Daily</w:t>
+              <w:t>16 Oct</w:t>
             </w:r>
           </w:p>
         </w:tc>
@@ -10690,7 +11597,7 @@
               <w:rPr>
                 <w:sz w:val="16"/>
               </w:rPr>
-              <w:t>Days of cover on each ranking child</w:t>
+              <w:t>FC transfers and shipments received</w:t>
             </w:r>
           </w:p>
         </w:tc>
@@ -10704,7 +11611,7 @@
               <w:rPr>
                 <w:sz w:val="16"/>
               </w:rPr>
-              <w:t>Under 14 days → back-up switch</w:t>
+              <w:t>Not received → re-tier on stock in hand; Queen White under 14 days of cover → enable Queen Graphite</w:t>
             </w:r>
           </w:p>
         </w:tc>
@@ -10720,7 +11627,7 @@
               <w:rPr>
                 <w:sz w:val="16"/>
               </w:rPr>
-              <w:t>Daily, week 1</w:t>
+              <w:t>Daily</w:t>
             </w:r>
           </w:p>
         </w:tc>
@@ -10734,7 +11641,7 @@
               <w:rPr>
                 <w:sz w:val="16"/>
               </w:rPr>
-              <w:t>Every re-priced campaign still serves</w:t>
+              <w:t>Days of cover on each ranking child</w:t>
             </w:r>
           </w:p>
         </w:tc>
@@ -10748,7 +11655,7 @@
               <w:rPr>
                 <w:sz w:val="16"/>
               </w:rPr>
-              <w:t>No impressions after 48 h → a non-held row is priced out at its ceiling: leave it</w:t>
+              <w:t>Under 14 days → back-up switch</w:t>
             </w:r>
           </w:p>
         </w:tc>
@@ -10764,7 +11671,7 @@
               <w:rPr>
                 <w:sz w:val="16"/>
               </w:rPr>
-              <w:t>5 Nov</w:t>
+              <w:t>Daily, week 1</w:t>
             </w:r>
           </w:p>
         </w:tc>
@@ -10778,7 +11685,7 @@
               <w:rPr>
                 <w:sz w:val="16"/>
               </w:rPr>
-              <w:t>Twin inbound</w:t>
+              <w:t>Every re-priced campaign still serves</w:t>
             </w:r>
           </w:p>
         </w:tc>
@@ -10792,7 +11699,51 @@
               <w:rPr>
                 <w:sz w:val="16"/>
               </w:rPr>
-              <w:t>Restart the Twin Exacts at the Twin ceiling</w:t>
+              <w:t>No impressions after 48 h → a non-held row is priced out at its ceiling: leave it</w:t>
+            </w:r>
+          </w:p>
+        </w:tc>
+      </w:tr>
+      <w:tr>
+        <w:tc>
+          <w:tcPr>
+            <w:tcW w:type="dxa" w:w="1701"/>
+          </w:tcPr>
+          <w:p>
+            <w:r/>
+            <w:r>
+              <w:rPr>
+                <w:sz w:val="16"/>
+              </w:rPr>
+              <w:t>2 Oct (today)</w:t>
+            </w:r>
+          </w:p>
+        </w:tc>
+        <w:tc>
+          <w:tcPr>
+            <w:tcW w:type="dxa" w:w="3118"/>
+          </w:tcPr>
+          <w:p>
+            <w:r/>
+            <w:r>
+              <w:rPr>
+                <w:sz w:val="16"/>
+              </w:rPr>
+              <w:t>Forwarder confirmation; rank trackers</w:t>
+            </w:r>
+          </w:p>
+        </w:tc>
+        <w:tc>
+          <w:tcPr>
+            <w:tcW w:type="dxa" w:w="5386"/>
+          </w:tcPr>
+          <w:p>
+            <w:r/>
+            <w:r>
+              <w:rPr>
+                <w:sz w:val="16"/>
+              </w:rPr>
+              <w:t>Each August–October shipment has left with a delivery appointment; the untracked keywords are added before 22 Oct</w:t>
             </w:r>
           </w:p>
         </w:tc>
@@ -10856,6 +11807,30 @@
         <w:pStyle w:val="ListBullet"/>
       </w:pPr>
       <w:r>
+        <w:t>Spend level (review 1, decision 3): the plan's default lets what a click earns set spend — $567/wk at 31 Dec, 9.5% of last week's sales, $149–268/wk under the envelope. The alternative, keeping the held bases, spends $693/wk (11.6%) for 28 more Exact orders a month — about $23 each against $9.79 of contribution. Confirm the default or choose the alternative.</w:t>
+      </w:r>
+    </w:p>
+    <w:p>
+      <w:pPr>
+        <w:pStyle w:val="ListBullet"/>
+      </w:pPr>
+      <w:r>
+        <w:t>First held step (review 1, decision 1): the plan's default is the CPC paid, in two waves; the alternative is the 90% step on all held rows at once (at most 45–84% of the clicks kept).</w:t>
+      </w:r>
+    </w:p>
+    <w:p>
+      <w:pPr>
+        <w:pStyle w:val="ListBullet"/>
+      </w:pPr>
+      <w:r>
+        <w:t>Loss-making colours (review 1, decision 2): the plan's default holds Cal King Graphite, Queen Cool Blue, Queen Light Pink out of the spring order until their cost records are checked against the supplier invoices; the alternative is to fix the records first and reorder on the corrected contribution.</w:t>
+      </w:r>
+    </w:p>
+    <w:p>
+      <w:pPr>
+        <w:pStyle w:val="ListBullet"/>
+      </w:pPr>
+      <w:r>
         <w:t>The band: 12.0% is declared by this plan; confirm it, and the envelope follows.</w:t>
       </w:r>
     </w:p>
@@ -10864,7 +11839,7 @@
         <w:pStyle w:val="ListBullet"/>
       </w:pPr>
       <w:r>
-        <w:t>The rank-hold premium: $98/wk across the held terms. Keep it, or release terms where the rank is not worth it — largest: 'cool fitted sheet king' $173/month; 'cooling fitted sheet' $165/month; 'cool fitted sheet queen' $68/month; 'cooling king fitted sheet' $28/month.</w:t>
+        <w:t>The rank-hold premium: $169/wk across the held terms. Keep it, or release terms where the rank is not worth it — largest, by held term (campaign): 'cooling fitted sheet' (277390956383530) $258/month; 'cooling fitted sheet king' (43491018068645) $257/month; 'cooling fitted sheet queen' (202444515473718) $128/month; 'cooling king fitted sheet' (25820387388275) $43/month.</w:t>
       </w:r>
     </w:p>
     <w:p>
@@ -10912,7 +11887,23 @@
         <w:pStyle w:val="ListBullet"/>
       </w:pPr>
       <w:r>
-        <w:t>Arrival dates: confirm the 16 Oct FC transfers (1178) and the 26 Nov shipment.</w:t>
+        <w:t>Shipments: confirm with the forwarder that the August–October lines have left (1,884 units 'ready to ship'); confirm the 16 Oct FC transfers (1178).</w:t>
+      </w:r>
+    </w:p>
+    <w:p>
+      <w:pPr>
+        <w:pStyle w:val="ListBullet"/>
+      </w:pPr>
+      <w:r>
+        <w:t>Rank trackers: add the untracked keywords with ≥5 September orders (Rank tracking tab) to Data Dive and Command Center now.</w:t>
+      </w:r>
+    </w:p>
+    <w:p>
+      <w:pPr>
+        <w:pStyle w:val="ListBullet"/>
+      </w:pPr>
+      <w:r>
+        <w:t>Deal details: send the 7 Oct Lightning Deal SKUs, deal price and committed units; they are in no source the plan can read.</w:t>
       </w:r>
     </w:p>
     <w:p>
@@ -10944,7 +11935,7 @@
         <w:pStyle w:val="ListBullet"/>
       </w:pPr>
       <w:r>
-        <w:t>The settings: the 90% CPC floor and the 30% guard on held terms, the delivery cases, the 0.8 rate haircut, the 15/50-click blend, the 25%/30% step caps, the $0.50 base floor, the $3.22 bound, the season, the 16 Oct arrival date are choices, not numbers the data fixes.</w:t>
+        <w:t>The settings: the first step at the CPC paid and the 90% further steps, the 30% guard on held terms, the ≥5-order pending-rank rule, the delivery cases, the 0.8 rate haircut, the 15/50-click blend, the 25%/30% step caps, the $0.50 base floor, the $3.22 bound, the season and the 16 Oct FC-transfer date are choices, not numbers the data fixes.</w:t>
       </w:r>
     </w:p>
     <w:p>
@@ -11040,7 +12031,7 @@
         <w:t xml:space="preserve">Verdict: </w:t>
       </w:r>
       <w:r>
-        <w:t>defend, do not push. Every ranking term was tested on its own: market (≥2 purchases a day), trend (Q3 ≥ 90% of Q2), the season ahead, proven paid conversion (50+ clicks at or above the family's 14.9%), reach and a tier-A ranking child. None passes; all 29 fail the season test and 20 the conversion test (section A9).</w:t>
+        <w:t>defend, do not push. Every ranking term was tested on its own: market (≥2 purchases a day), trend (Q3 ≥ 90% of Q2), the season ahead, proven paid conversion (50+ clicks at or above the family's 14.9%), reach and a tier-A ranking child. No term passes; all 29 fail the season test and 20 the conversion test (section A9).</w:t>
       </w:r>
     </w:p>
     <w:p>
@@ -11082,7 +12073,7 @@
         <w:t xml:space="preserve">Children: </w:t>
       </w:r>
       <w:r>
-        <w:t>Queen White and King White keep their Exacts; Full moves to Full Cool Grey; Cal King pauses; Twin waits for 5 Nov. The audit's 11 Queen swaps are rejected.</w:t>
+        <w:t>Queen White and King White keep their Exacts; Full moves to Full Cool Grey; Cal King and both Twin Exacts pause (no margin). The audit's 11 Queen swaps are rejected.</w:t>
       </w:r>
     </w:p>
     <w:p>
@@ -11096,7 +12087,7 @@
         <w:t xml:space="preserve">Prices: </w:t>
       </w:r>
       <w:r>
-        <w:t>14 of 29 priced Exact rows pay above $3.22 today; the main Queen and King terms pay $3–5 against ceilings of $1.50–2.90. The 13 held page-one campaigns walk down from 22 Oct, each step at least 90% of the CPC paid; in the central case 10 take one step and stop. The rest step to their ceilings. None rises.</w:t>
+        <w:t>14 of 29 priced Exact rows pay above $3.22 today; the main Queen and King terms pay $3–5 against ceilings of $1.50–2.90. The 16 held page-one campaigns (held per keyword; 10 keywords pending a rank) take a first step to the CPC paid in two waves (22 Oct, 5 Nov) and walk further only after a read. The rest step to their ceilings. No price rises.</w:t>
       </w:r>
     </w:p>
     <w:p>
@@ -11124,7 +12115,7 @@
         <w:t xml:space="preserve">Money: </w:t>
       </w:r>
       <w:r>
-        <w:t>expected spend (central) $690/wk after 2 Oct, $494 at 5 Nov and $465 at 31 Dec, against $742 last week, including a $98/wk rank-hold premium; Exact orders 224 → 155 a month (range 154–179).</w:t>
+        <w:t>expected spend (central) $701/wk after 2 Oct, $659 at 5 Nov and $567 at 31 Dec, against $742 last week, including a $169/wk rank-hold premium; Exact orders 224 → 178 a month (range 174–190).</w:t>
       </w:r>
     </w:p>
     <w:p>
@@ -11138,7 +12129,7 @@
         <w:t xml:space="preserve">Stock: </w:t>
       </w:r>
       <w:r>
-        <w:t>1,449 sellable, 1,178 in FC transfer and 1,899 on shipments. Spring order 4,988 units by 1 Dec.</w:t>
+        <w:t>1,449 sellable, 1,178 in FC transfer, 1,899 on shipment lines (1,884 'ready to ship', unconfirmed: tiers and triggers do not count them). Spring order 4,988 units by 1 Dec.</w:t>
       </w:r>
     </w:p>
     <w:p>
@@ -14235,7 +15226,7 @@
               <w:rPr>
                 <w:sz w:val="14"/>
               </w:rPr>
-              <w:t>Queen Navy Blue</w:t>
+              <w:t>Queen Beige</w:t>
             </w:r>
           </w:p>
         </w:tc>
@@ -14263,7 +15254,7 @@
               <w:rPr>
                 <w:sz w:val="14"/>
               </w:rPr>
-              <w:t>34</w:t>
+              <w:t>15</w:t>
             </w:r>
           </w:p>
         </w:tc>
@@ -14277,7 +15268,7 @@
               <w:rPr>
                 <w:sz w:val="14"/>
               </w:rPr>
-              <w:t>34</w:t>
+              <w:t>30</w:t>
             </w:r>
           </w:p>
         </w:tc>
@@ -14291,7 +15282,7 @@
               <w:rPr>
                 <w:sz w:val="14"/>
               </w:rPr>
-              <w:t>23</w:t>
+              <w:t>51</w:t>
             </w:r>
           </w:p>
         </w:tc>
@@ -14305,7 +15296,7 @@
               <w:rPr>
                 <w:sz w:val="14"/>
               </w:rPr>
-              <w:t>44</w:t>
+              <w:t>142</w:t>
             </w:r>
           </w:p>
         </w:tc>
@@ -14319,7 +15310,7 @@
               <w:rPr>
                 <w:sz w:val="14"/>
               </w:rPr>
-              <w:t>$12.66</w:t>
+              <w:t>$7.33</w:t>
             </w:r>
           </w:p>
         </w:tc>
@@ -14363,7 +15354,7 @@
               <w:rPr>
                 <w:sz w:val="14"/>
               </w:rPr>
-              <w:t>Queen Beige</w:t>
+              <w:t>Queen Navy Blue</w:t>
             </w:r>
           </w:p>
         </w:tc>
@@ -14391,7 +15382,7 @@
               <w:rPr>
                 <w:sz w:val="14"/>
               </w:rPr>
-              <w:t>15</w:t>
+              <w:t>34</w:t>
             </w:r>
           </w:p>
         </w:tc>
@@ -14405,7 +15396,7 @@
               <w:rPr>
                 <w:sz w:val="14"/>
               </w:rPr>
-              <w:t>30</w:t>
+              <w:t>34</w:t>
             </w:r>
           </w:p>
         </w:tc>
@@ -14419,7 +15410,7 @@
               <w:rPr>
                 <w:sz w:val="14"/>
               </w:rPr>
-              <w:t>51</w:t>
+              <w:t>23</w:t>
             </w:r>
           </w:p>
         </w:tc>
@@ -14433,7 +15424,7 @@
               <w:rPr>
                 <w:sz w:val="14"/>
               </w:rPr>
-              <w:t>142</w:t>
+              <w:t>44</w:t>
             </w:r>
           </w:p>
         </w:tc>
@@ -14447,7 +15438,7 @@
               <w:rPr>
                 <w:sz w:val="14"/>
               </w:rPr>
-              <w:t>$7.33</w:t>
+              <w:t>$12.66</w:t>
             </w:r>
           </w:p>
         </w:tc>
@@ -22056,7 +23047,7 @@
         <w:t xml:space="preserve">'cooling fitted sheet' — </w:t>
       </w:r>
       <w:r>
-        <w:t>market 1.61 purchases/day (Q3), 1.47 in Q2; 90 days: 438 paid clicks, 67 orders (15.3%); rank CC 2 (30 days ago 2), DD 2; owner on Queen White: top of search $3.78 → $2.79 (ceiling $1.61), DESCEND.</w:t>
+        <w:t>market 1.61 purchases/day (Q3), 1.47 in Q2; 90 days: 438 paid clicks, 67 orders (15.3%); rank CC 2 (30 days ago 2), DD 2; owner on Queen White: top of search $3.78 → $3.10 (ceiling $1.61), DESCEND.</w:t>
       </w:r>
     </w:p>
     <w:p>
@@ -22070,7 +23061,7 @@
         <w:t xml:space="preserve">'cooling fitted sheet king' — </w:t>
       </w:r>
       <w:r>
-        <w:t>market 2.33 purchases/day (Q3), 2.54 in Q2; 90 days: 665 paid clicks, 103 orders (15.5%); rank CC 2 (30 days ago 2), DD 2; owner on King White: top of search $4.18 → $3.19 (ceiling $1.50), DESCEND.</w:t>
+        <w:t>market 2.33 purchases/day (Q3), 2.54 in Q2; 90 days: 665 paid clicks, 103 orders (15.5%); rank CC 2 (30 days ago 2), DD 2; owner on King White: top of search $4.18 → $3.54 (ceiling $1.50), DESCEND.</w:t>
       </w:r>
     </w:p>
     <w:p>
@@ -22084,7 +23075,7 @@
         <w:t xml:space="preserve">'cooling fitted sheet queen' — </w:t>
       </w:r>
       <w:r>
-        <w:t>market 3.18 purchases/day (Q3), 3.04 in Q2; 90 days: 647 paid clicks, 103 orders (15.9%); rank CC 4 (30 days ago 2), DD 3; owner on Queen White: top of search $4.84 → $3.56 (ceiling $2.83), DESCEND.</w:t>
+        <w:t>market 3.18 purchases/day (Q3), 3.04 in Q2; 90 days: 647 paid clicks, 103 orders (15.9%); rank CC 4 (30 days ago 2), DD 3; owner on Queen White: top of search $4.84 → $3.95 (ceiling $2.83), DESCEND.</w:t>
       </w:r>
     </w:p>
     <w:p>
@@ -22112,7 +23103,7 @@
         <w:t xml:space="preserve">'king size fitted sheet cooling' — </w:t>
       </w:r>
       <w:r>
-        <w:t>market 0.82 purchases/day (Q3), 0.92 in Q2; 90 days: 167 paid clicks, 47 orders (28.1%); rank CC 4 (30 days ago 5), DD 5; owner on King White: top of search $4.18 → $3.23 (ceiling $2.93), DESCEND.</w:t>
+        <w:t>market 0.82 purchases/day (Q3), 0.92 in Q2; 90 days: 167 paid clicks, 47 orders (28.1%); rank CC 4 (30 days ago 5), DD 5; owner on King White: top of search $4.18 → $3.58 (ceiling $2.93), DESCEND.</w:t>
       </w:r>
     </w:p>
     <w:p>
@@ -22126,7 +23117,7 @@
         <w:t xml:space="preserve">'queen fitted sheet cooling' — </w:t>
       </w:r>
       <w:r>
-        <w:t>market 1.28 purchases/day (Q3), 0.76 in Q2; 90 days: 239 paid clicks, 21 orders (8.8%); rank CC 4 (30 days ago 5), DD 6; owner on Queen White: top of search $3.99 → $3.14 (ceiling $2.44), DESCEND.</w:t>
+        <w:t>market 1.28 purchases/day (Q3), 0.76 in Q2; 90 days: 239 paid clicks, 21 orders (8.8%); rank CC 4 (30 days ago 5), DD 6; owner on Queen White: top of search $3.99 → $3.48 (ceiling $2.44), DESCEND.</w:t>
       </w:r>
     </w:p>
     <w:p>
@@ -22196,7 +23187,7 @@
         <w:t xml:space="preserve">'king size cooling fitted sheet' — </w:t>
       </w:r>
       <w:r>
-        <w:t>market 0.0 purchases/day (Q3), 0.0 in Q2; 90 days: 100 paid clicks, 24 orders (24.0%); rank CC 3 (30 days ago 3.5), DD —; owner on King White: top of search $3.80 → $2.83 (ceiling $2.41), DESCEND.</w:t>
+        <w:t>market 0.0 purchases/day (Q3), 0.0 in Q2; 90 days: 100 paid clicks, 24 orders (24.0%); rank CC 3 (30 days ago 3.5), DD —; owner on King White: top of search $3.80 → $3.14 (ceiling $2.41), DESCEND.</w:t>
       </w:r>
     </w:p>
     <w:p>
@@ -22210,7 +23201,7 @@
         <w:t xml:space="preserve">'queen fitted sheet only cooling' — </w:t>
       </w:r>
       <w:r>
-        <w:t>market 0.49 purchases/day (Q3), 0.58 in Q2; 90 days: 140 paid clicks, 4 orders (2.9%); rank CC 5 (30 days ago 9), DD 6; owner on Queen White: top of search $3.41 → $2.73 (ceiling $2.20), DESCEND.</w:t>
+        <w:t>market 0.49 purchases/day (Q3), 0.58 in Q2; 90 days: 140 paid clicks, 4 orders (2.9%); rank CC 5 (30 days ago 9), DD 6; owner on Queen White: top of search $3.41 → $3.03 (ceiling $2.20), DESCEND.</w:t>
       </w:r>
     </w:p>
     <w:p>
@@ -22224,7 +23215,7 @@
         <w:t xml:space="preserve">'fitted cooling sheet queen' — </w:t>
       </w:r>
       <w:r>
-        <w:t>market 0.0 purchases/day (Q3), 0.0 in Q2; 90 days: 62 paid clicks, 4 orders (6.5%); rank CC 5.5 (30 days ago —), DD —; owner on Queen White: top of search $2.80 → $2.20 (ceiling $2.20), DESCEND.</w:t>
+        <w:t>market 0.0 purchases/day (Q3), 0.0 in Q2; 90 days: 62 paid clicks, 4 orders (6.5%); rank CC 5.5 (30 days ago —), DD —; owner on Queen White: top of search $2.80 → $2.59 (ceiling $2.20), DESCEND.</w:t>
       </w:r>
     </w:p>
     <w:p>
@@ -22238,7 +23229,7 @@
         <w:t xml:space="preserve">'cooling king fitted sheet' — </w:t>
       </w:r>
       <w:r>
-        <w:t>market 0.0 purchases/day (Q3), 0.0 in Q2; 90 days: 120 paid clicks, 15 orders (12.5%); rank CC 3 (30 days ago —), DD —; owner on King White: top of search $4.46 → $3.21 (ceiling $1.91), DESCEND.</w:t>
+        <w:t>market 0.0 purchases/day (Q3), 0.0 in Q2; 90 days: 120 paid clicks, 15 orders (12.5%); rank CC 3 (30 days ago —), DD —; owner on King White: top of search $4.46 → $3.56 (ceiling $1.91), DESCEND.</w:t>
       </w:r>
     </w:p>
     <w:p>
@@ -22252,7 +23243,7 @@
         <w:t xml:space="preserve">'king cooling fitted sheet' — </w:t>
       </w:r>
       <w:r>
-        <w:t>market 0.0 purchases/day (Q3), 0.0 in Q2; 90 days: 85 paid clicks, 19 orders (22.4%); rank CC 2 (30 days ago —), DD —; owner on King White: top of search $3.80 → $2.83 (ceiling $2.41), DESCEND.</w:t>
+        <w:t>market 0.0 purchases/day (Q3), 0.0 in Q2; 90 days: 85 paid clicks, 19 orders (22.4%); rank CC 2 (30 days ago —), DD —; owner on King White: top of search $3.80 → $3.14 (ceiling $2.41), DESCEND.</w:t>
       </w:r>
     </w:p>
     <w:p>
@@ -22292,7 +23283,7 @@
         <w:pStyle w:val="ListBullet"/>
       </w:pPr>
       <w:r>
-        <w:t>Twin: every Twin child but one is out until 5 Nov.</w:t>
+        <w:t>Twin: every Twin child but one is out, Twin earns too little to pay for a product-page click, and both Twin Exacts pause.</w:t>
       </w:r>
     </w:p>
     <w:p>
@@ -25410,7 +26401,7 @@
               <w:rPr>
                 <w:sz w:val="14"/>
               </w:rPr>
-              <w:t>22 Oct price $2.79; 5 Nov base bid $1.35</w:t>
+              <w:t>2 Oct rider bids 1 keyword(s) by their own bid; 22 Oct price $3.10; 5 Nov base bid $1.35; 19 Nov base bid $1.01; 3 Dec b</w:t>
             </w:r>
           </w:p>
         </w:tc>
@@ -25496,7 +26487,7 @@
               <w:rPr>
                 <w:sz w:val="14"/>
               </w:rPr>
-              <w:t>22 Oct price $3.19; 5 Nov base bid $1.42; 19 Nov base bid $1.06</w:t>
+              <w:t>2 Oct rider bids 1 keyword(s) by their own bid; 22 Oct price $3.54; 5 Nov base bid $1.42; 19 Nov base bid $1.06; 3 Dec b</w:t>
             </w:r>
           </w:p>
         </w:tc>
@@ -25582,7 +26573,7 @@
               <w:rPr>
                 <w:sz w:val="14"/>
               </w:rPr>
-              <w:t>22 Oct price $2.83; 5 Nov base bid $1.42; 19 Nov base bid $1.06; 3 Dec base bid $0.83</w:t>
+              <w:t>5 Nov price $3.14; 19 Nov base bid $1.42; 3 Dec base bid $1.06; 17 Dec base bid $0.83</w:t>
             </w:r>
           </w:p>
         </w:tc>
@@ -25668,7 +26659,7 @@
               <w:rPr>
                 <w:sz w:val="14"/>
               </w:rPr>
-              <w:t>22 Oct price $3.45; 5 Nov base bid $1.96; 19 Nov base bid $1.47; 3 Dec base bid $1.10</w:t>
+              <w:t>2 Oct rider bids 1 keyword(s) by their own bid; 5 Nov price $3.83; 19 Nov base bid $1.96; 3 Dec base bid $1.47; 17 Dec b</w:t>
             </w:r>
           </w:p>
         </w:tc>
@@ -25754,7 +26745,7 @@
               <w:rPr>
                 <w:sz w:val="14"/>
               </w:rPr>
-              <w:t>22 Oct price $3.56; 5 Nov base bid $1.50; 19 Nov base bid $1.12; 3 Dec base bid $0.84</w:t>
+              <w:t>5 Nov price $3.95; 19 Nov base bid $1.50; 3 Dec base bid $1.12; 17 Dec base bid $0.84</w:t>
             </w:r>
           </w:p>
         </w:tc>
@@ -25840,7 +26831,7 @@
               <w:rPr>
                 <w:sz w:val="14"/>
               </w:rPr>
-              <w:t>22 Oct price $3.21; 5 Nov base bid $1.50; 19 Nov base bid $1.12; 3 Dec base bid $0.84</w:t>
+              <w:t>2 Oct rider bids 1 keyword(s) by their own bid; 22 Oct price $3.56; 5 Nov base bid $1.50; 19 Nov base bid $1.12; 3 Dec b</w:t>
             </w:r>
           </w:p>
         </w:tc>
@@ -26012,7 +27003,7 @@
               <w:rPr>
                 <w:sz w:val="14"/>
               </w:rPr>
-              <w:t>22 Oct price $3.23; 5 Nov base bid $1.42</w:t>
+              <w:t>5 Nov price $3.58; 19 Nov base bid $1.42; 3 Dec base bid $1.06; 17 Dec base bid $0.83</w:t>
             </w:r>
           </w:p>
         </w:tc>
@@ -26098,7 +27089,7 @@
               <w:rPr>
                 <w:sz w:val="14"/>
               </w:rPr>
-              <w:t>22 Oct price $3.14; 5 Nov base bid $1.42; 19 Nov base bid $1.06; 3 Dec base bid $0.83</w:t>
+              <w:t>5 Nov price $3.48; 19 Nov base bid $1.42; 3 Dec base bid $1.06; 17 Dec base bid $0.83</w:t>
             </w:r>
           </w:p>
         </w:tc>
@@ -26184,7 +27175,7 @@
               <w:rPr>
                 <w:sz w:val="14"/>
               </w:rPr>
-              <w:t>22 Oct price $2.73; 5 Nov base bid $1.20; 19 Nov base bid $0.90; 3 Dec base bid $0.83</w:t>
+              <w:t>22 Oct price $3.03; 5 Nov base bid $1.20; 19 Nov base bid $0.90; 3 Dec base bid $0.83</w:t>
             </w:r>
           </w:p>
         </w:tc>
@@ -26270,7 +27261,7 @@
               <w:rPr>
                 <w:sz w:val="14"/>
               </w:rPr>
-              <w:t>22 Oct price $2.34; 5 Nov price $2.20; 19 Nov base bid $1.05; 3 Dec base bid $0.83</w:t>
+              <w:t>5 Nov price $2.59; 19 Nov base bid $1.05; 3 Dec base bid $0.83</w:t>
             </w:r>
           </w:p>
         </w:tc>
@@ -26442,7 +27433,265 @@
               <w:rPr>
                 <w:sz w:val="14"/>
               </w:rPr>
-              <w:t>22 Oct price $2.60; 5 Nov base bid $0.83</w:t>
+              <w:t>22 Oct base bid $0.83</w:t>
+            </w:r>
+          </w:p>
+        </w:tc>
+      </w:tr>
+      <w:tr>
+        <w:tc>
+          <w:tcPr>
+            <w:tcW w:type="dxa" w:w="1662"/>
+          </w:tcPr>
+          <w:p>
+            <w:r/>
+            <w:r>
+              <w:rPr>
+                <w:sz w:val="14"/>
+              </w:rPr>
+              <w:t>cool fitted sheet king</w:t>
+            </w:r>
+          </w:p>
+        </w:tc>
+        <w:tc>
+          <w:tcPr>
+            <w:tcW w:type="dxa" w:w="1662"/>
+          </w:tcPr>
+          <w:p>
+            <w:r/>
+            <w:r>
+              <w:rPr>
+                <w:sz w:val="14"/>
+              </w:rPr>
+              <w:t>—</w:t>
+            </w:r>
+          </w:p>
+        </w:tc>
+        <w:tc>
+          <w:tcPr>
+            <w:tcW w:type="dxa" w:w="1662"/>
+          </w:tcPr>
+          <w:p>
+            <w:r/>
+            <w:r>
+              <w:rPr>
+                <w:sz w:val="14"/>
+              </w:rPr>
+              <w:t>King White</w:t>
+            </w:r>
+          </w:p>
+        </w:tc>
+        <w:tc>
+          <w:tcPr>
+            <w:tcW w:type="dxa" w:w="1662"/>
+          </w:tcPr>
+          <w:p>
+            <w:r/>
+            <w:r>
+              <w:rPr>
+                <w:sz w:val="14"/>
+              </w:rPr>
+              <w:t>$4.18</w:t>
+            </w:r>
+          </w:p>
+        </w:tc>
+        <w:tc>
+          <w:tcPr>
+            <w:tcW w:type="dxa" w:w="1662"/>
+          </w:tcPr>
+          <w:p>
+            <w:r/>
+            <w:r>
+              <w:rPr>
+                <w:sz w:val="14"/>
+              </w:rPr>
+              <w:t>$3.40</w:t>
+            </w:r>
+          </w:p>
+        </w:tc>
+        <w:tc>
+          <w:tcPr>
+            <w:tcW w:type="dxa" w:w="1662"/>
+          </w:tcPr>
+          <w:p>
+            <w:r/>
+            <w:r>
+              <w:rPr>
+                <w:sz w:val="14"/>
+              </w:rPr>
+              <w:t>5 Nov price $3.40; 19 Nov base bid $1.42</w:t>
+            </w:r>
+          </w:p>
+        </w:tc>
+      </w:tr>
+      <w:tr>
+        <w:tc>
+          <w:tcPr>
+            <w:tcW w:type="dxa" w:w="1662"/>
+          </w:tcPr>
+          <w:p>
+            <w:r/>
+            <w:r>
+              <w:rPr>
+                <w:sz w:val="14"/>
+              </w:rPr>
+              <w:t>queen cooling fitted sheet only</w:t>
+            </w:r>
+          </w:p>
+        </w:tc>
+        <w:tc>
+          <w:tcPr>
+            <w:tcW w:type="dxa" w:w="1662"/>
+          </w:tcPr>
+          <w:p>
+            <w:r/>
+            <w:r>
+              <w:rPr>
+                <w:sz w:val="14"/>
+              </w:rPr>
+              <w:t>—</w:t>
+            </w:r>
+          </w:p>
+        </w:tc>
+        <w:tc>
+          <w:tcPr>
+            <w:tcW w:type="dxa" w:w="1662"/>
+          </w:tcPr>
+          <w:p>
+            <w:r/>
+            <w:r>
+              <w:rPr>
+                <w:sz w:val="14"/>
+              </w:rPr>
+              <w:t>Queen White</w:t>
+            </w:r>
+          </w:p>
+        </w:tc>
+        <w:tc>
+          <w:tcPr>
+            <w:tcW w:type="dxa" w:w="1662"/>
+          </w:tcPr>
+          <w:p>
+            <w:r/>
+            <w:r>
+              <w:rPr>
+                <w:sz w:val="14"/>
+              </w:rPr>
+              <w:t>$5.10</w:t>
+            </w:r>
+          </w:p>
+        </w:tc>
+        <w:tc>
+          <w:tcPr>
+            <w:tcW w:type="dxa" w:w="1662"/>
+          </w:tcPr>
+          <w:p>
+            <w:r/>
+            <w:r>
+              <w:rPr>
+                <w:sz w:val="14"/>
+              </w:rPr>
+              <w:t>$3.33</w:t>
+            </w:r>
+          </w:p>
+        </w:tc>
+        <w:tc>
+          <w:tcPr>
+            <w:tcW w:type="dxa" w:w="1662"/>
+          </w:tcPr>
+          <w:p>
+            <w:r/>
+            <w:r>
+              <w:rPr>
+                <w:sz w:val="14"/>
+              </w:rPr>
+              <w:t>5 Nov price $3.33; 19 Nov base bid $1.91; 3 Dec base bid $1.43; 17 Dec base bid $1.07; 31 Dec base bid $0.83</w:t>
+            </w:r>
+          </w:p>
+        </w:tc>
+      </w:tr>
+      <w:tr>
+        <w:tc>
+          <w:tcPr>
+            <w:tcW w:type="dxa" w:w="1662"/>
+          </w:tcPr>
+          <w:p>
+            <w:r/>
+            <w:r>
+              <w:rPr>
+                <w:sz w:val="14"/>
+              </w:rPr>
+              <w:t>king size cooling fitted sheets only</w:t>
+            </w:r>
+          </w:p>
+        </w:tc>
+        <w:tc>
+          <w:tcPr>
+            <w:tcW w:type="dxa" w:w="1662"/>
+          </w:tcPr>
+          <w:p>
+            <w:r/>
+            <w:r>
+              <w:rPr>
+                <w:sz w:val="14"/>
+              </w:rPr>
+              <w:t>—</w:t>
+            </w:r>
+          </w:p>
+        </w:tc>
+        <w:tc>
+          <w:tcPr>
+            <w:tcW w:type="dxa" w:w="1662"/>
+          </w:tcPr>
+          <w:p>
+            <w:r/>
+            <w:r>
+              <w:rPr>
+                <w:sz w:val="14"/>
+              </w:rPr>
+              <w:t>King White</w:t>
+            </w:r>
+          </w:p>
+        </w:tc>
+        <w:tc>
+          <w:tcPr>
+            <w:tcW w:type="dxa" w:w="1662"/>
+          </w:tcPr>
+          <w:p>
+            <w:r/>
+            <w:r>
+              <w:rPr>
+                <w:sz w:val="14"/>
+              </w:rPr>
+              <w:t>$2.06</w:t>
+            </w:r>
+          </w:p>
+        </w:tc>
+        <w:tc>
+          <w:tcPr>
+            <w:tcW w:type="dxa" w:w="1662"/>
+          </w:tcPr>
+          <w:p>
+            <w:r/>
+            <w:r>
+              <w:rPr>
+                <w:sz w:val="14"/>
+              </w:rPr>
+              <w:t>$2.03</w:t>
+            </w:r>
+          </w:p>
+        </w:tc>
+        <w:tc>
+          <w:tcPr>
+            <w:tcW w:type="dxa" w:w="1662"/>
+          </w:tcPr>
+          <w:p>
+            <w:r/>
+            <w:r>
+              <w:rPr>
+                <w:sz w:val="14"/>
+              </w:rPr>
+              <w:t>22 Oct base bid $0.83</w:t>
             </w:r>
           </w:p>
         </w:tc>
@@ -29886,7 +31135,7 @@
               <w:rPr>
                 <w:sz w:val="14"/>
               </w:rPr>
-              <w:t>Every Twin child is out except Twin Midnight Black (8 units + 48 in FC transfer). Twin Cool Grey restocks 60 on 5 Nov + 84 on 26 Nov; Twin White 12 on 16 Oct + 60 on 5 Nov. The two Twin Exacts hold (no write; they cannot serve) until 5 Nov, then price to the Twin ceiling. Twin contribution is thin (Twin Cool Grey $2.87 a unit, Apr–Sep, 56 units (Sep had 1)).</w:t>
+              <w:t>Every Twin child is out except Twin Midnight Black (8 units + 48 in FC transfer). Twin Cool Grey restocks 12 on 5 Nov + 12 on 5 Nov + 12 on 5 Nov + 12 on 5 Nov + 12 on 5 Nov + 12 on 26 Nov + 12 on 26 Nov + 12 on 26 Nov + 24 on 26 Nov + 24 on 26 Nov; Twin White 12 on 16 Oct + 12 on 5 Nov + 12 on 5 Nov + 12 on 5 Nov + 12 on 5 Nov + 12 on 5 Nov. The two Twin Exacts hold (no write; they cannot serve) until 5 Nov, then pr</w:t>
             </w:r>
           </w:p>
         </w:tc>
@@ -30301,7 +31550,7 @@
               <w:rPr>
                 <w:sz w:val="14"/>
               </w:rPr>
-              <w:t>3 Mar 2027</w:t>
+              <w:t>5 Feb 2027</w:t>
             </w:r>
           </w:p>
         </w:tc>
@@ -30858,7 +32107,7 @@
     </w:p>
     <w:p>
       <w:r>
-        <w:t>Calls: PUSH = climbing a ranking term (none); PROTECT = holds a rank and nothing is cut (the revived owner); OPTIMISE = a specific change (child, price step, base); REDUCE = paused or folded; KEEP = no change. Counts: OPTIMISE 31, KEEP 15, REDUCE 4, PROTECT 1.</w:t>
+        <w:t>Calls: PUSH = climbing a ranking term (none); PROTECT = holds a rank and nothing is cut (the revived owner); OPTIMISE = a specific change (child, price step, base); REDUCE = paused or folded; KEEP = no change. Counts: OPTIMISE 31, KEEP 13, REDUCE 6, PROTECT 1.</w:t>
       </w:r>
     </w:p>
     <w:tbl>
@@ -31028,7 +32277,7 @@
               <w:rPr>
                 <w:sz w:val="14"/>
               </w:rPr>
-              <w:t>Held page-one term (cooling fitted sheet; best rank 2): price $3.78, CPC paid $3.10, ceiling $1.61. Planned: $2.79, each at least 90% of the CPC paid before it,</w:t>
+              <w:t xml:space="preserve">Held page-one term 'cooling fitted sheet' (rank 2): price $3.78, CPC paid $3.10, ceiling $1.61. First step $3.10 = the CPC paid, on 22 Oct (wave A): it removes </w:t>
             </w:r>
           </w:p>
         </w:tc>
@@ -31100,7 +32349,7 @@
               <w:rPr>
                 <w:sz w:val="14"/>
               </w:rPr>
-              <w:t>Held page-one term (cooling fitted sheet queen; best rank 3): price $4.84, CPC paid $3.95, ceiling $2.83. Planned: $3.56, each at least 90% of the CPC paid befo</w:t>
+              <w:t>Held page-one term 'cooling fitted sheet queen' (rank 3): price $4.84, CPC paid $3.95, ceiling $2.83. First step $3.95 = the CPC paid, on 5 Nov (wave B): it rem</w:t>
             </w:r>
           </w:p>
         </w:tc>
@@ -31172,7 +32421,7 @@
               <w:rPr>
                 <w:sz w:val="14"/>
               </w:rPr>
-              <w:t>Held page-one term (cooling fitted sheet king; best rank 2): price $4.18, CPC paid $3.54, ceiling $1.50. Planned: $3.19, each at least 90% of the CPC paid befor</w:t>
+              <w:t>Held page-one term 'cooling fitted sheet king' (rank 2): price $4.18, CPC paid $3.54, ceiling $1.50. First step $3.54 = the CPC paid, on 22 Oct (wave A): it rem</w:t>
             </w:r>
           </w:p>
         </w:tc>
@@ -31244,7 +32493,7 @@
               <w:rPr>
                 <w:sz w:val="14"/>
               </w:rPr>
-              <w:t>Held page-one term (king cooling fitted sheet, king size cooling fitted sheet; best rank 2): price $3.80, CPC paid $3.14, ceiling $2.41. Planned: $2.83, each at</w:t>
+              <w:t>Held page-one term 'king cooling fitted sheet' (rank 2): price $3.80, CPC paid $3.14, ceiling $2.41. First step $3.14 = the CPC paid, on 5 Nov (wave B): it remo</w:t>
             </w:r>
           </w:p>
         </w:tc>
@@ -31316,7 +32565,7 @@
               <w:rPr>
                 <w:sz w:val="14"/>
               </w:rPr>
-              <w:t>Held page-one term (queen fitted sheet cooling; best rank 4): price $3.99, CPC paid $3.48, ceiling $2.44. Planned: $3.14, each at least 90% of the CPC paid befo</w:t>
+              <w:t>Held page-one term 'queen fitted sheet cooling' (rank 4): price $3.99, CPC paid $3.48, ceiling $2.44. First step $3.48 = the CPC paid, on 5 Nov (wave B): it rem</w:t>
             </w:r>
           </w:p>
         </w:tc>
@@ -31388,7 +32637,7 @@
               <w:rPr>
                 <w:sz w:val="14"/>
               </w:rPr>
-              <w:t xml:space="preserve">Held page-one term (king size fitted sheet cooling; best rank 4): price $4.18, CPC paid $3.58, ceiling $2.93. Planned: $3.23, each at least 90% of the CPC paid </w:t>
+              <w:t>Held page-one term 'king size fitted sheet cooling' (rank 4): price $4.18, CPC paid $3.58, ceiling $2.93. First step $3.58 = the CPC paid, on 5 Nov (wave B): it</w:t>
             </w:r>
           </w:p>
         </w:tc>
@@ -31532,7 +32781,7 @@
               <w:rPr>
                 <w:sz w:val="14"/>
               </w:rPr>
-              <w:t>Held page-one term (cooling king fitted sheet; best rank 3): price $4.46, CPC paid $3.56, ceiling $1.91. Planned: $3.21, each at least 90% of the CPC paid befor</w:t>
+              <w:t>Held page-one term 'cooling king fitted sheet' (rank 3): price $4.46, CPC paid $3.56, ceiling $1.91. First step $3.56 = the CPC paid, on 22 Oct (wave A): it rem</w:t>
             </w:r>
           </w:p>
         </w:tc>
@@ -31604,7 +32853,7 @@
               <w:rPr>
                 <w:sz w:val="14"/>
               </w:rPr>
-              <w:t>Not a held term: top-of-search price $4.18 steps to its ceiling $1.87 (≤30% a write); delivery is expected to fall where the price drops under today's CPC.</w:t>
+              <w:t>Held page-one term 'cool fitted sheet king' (no rank yet: held while tracking is added (≥5 September orders)): price $4.18, CPC paid $3.40, ceiling $1.87. First</w:t>
             </w:r>
           </w:p>
         </w:tc>
@@ -31676,7 +32925,7 @@
               <w:rPr>
                 <w:sz w:val="14"/>
               </w:rPr>
-              <w:t>Held page-one term (king fitted sheet only cooling; best rank 2.5): price $5.48, CPC paid $3.83, ceiling $2.20. Planned: $3.45, each at least 90% of the CPC pai</w:t>
+              <w:t xml:space="preserve">Held page-one term 'king fitted sheet only cooling' (rank 2.5): price $5.48, CPC paid $3.83, ceiling $2.20. First step $3.83 = the CPC paid, on 5 Nov (wave B): </w:t>
             </w:r>
           </w:p>
         </w:tc>
@@ -31748,7 +32997,7 @@
               <w:rPr>
                 <w:sz w:val="14"/>
               </w:rPr>
-              <w:t>Held page-one term (queen fitted sheet only cooling, queen size fitted sheet only cooling; best rank 5): price $3.41, CPC paid $3.03, ceiling $2.20. Planned: $2</w:t>
+              <w:t xml:space="preserve">Held page-one term 'queen fitted sheet only cooling' (rank 5): price $3.41, CPC paid $3.03, ceiling $2.20. First step $3.03 = the CPC paid, on 22 Oct (wave A): </w:t>
             </w:r>
           </w:p>
         </w:tc>
@@ -31892,7 +33141,7 @@
               <w:rPr>
                 <w:sz w:val="14"/>
               </w:rPr>
-              <w:t>Not a held term: top-of-search price $5.10 steps to its ceiling $2.20 (≤30% a write); delivery is expected to fall where the price drops under today's CPC.</w:t>
+              <w:t>Held page-one term 'queen cooling fitted sheet only' (no rank yet: held while tracking is added (≥5 September orders)): price $5.10, CPC paid $3.33, ceiling $2.</w:t>
             </w:r>
           </w:p>
         </w:tc>
@@ -32036,7 +33285,7 @@
               <w:rPr>
                 <w:sz w:val="14"/>
               </w:rPr>
-              <w:t>Not a held term: top-of-search price $2.06 steps to its ceiling $1.96 (≤30% a write); delivery is expected to fall where the price drops under today's CPC. Chan</w:t>
+              <w:t>At or under its ceiling: hold.</w:t>
             </w:r>
           </w:p>
         </w:tc>
@@ -32180,7 +33429,7 @@
               <w:rPr>
                 <w:sz w:val="14"/>
               </w:rPr>
-              <w:t xml:space="preserve">Held page-one term (fitted cooling sheet queen; best rank 5.5): price $2.80, CPC paid $2.59, ceiling $2.20. Planned: $2.34, $2.20, each at least 90% of the CPC </w:t>
+              <w:t>Held page-one term 'fitted cooling sheet queen' (rank 5.5): price $2.80, CPC paid $2.59, ceiling $2.20. First step $2.59 = the CPC paid, on 5 Nov (wave B): it r</w:t>
             </w:r>
           </w:p>
         </w:tc>
@@ -32526,7 +33775,7 @@
               <w:rPr>
                 <w:sz w:val="14"/>
               </w:rPr>
-              <w:t>KEEP</w:t>
+              <w:t>REDUCE</w:t>
             </w:r>
           </w:p>
         </w:tc>
@@ -32540,7 +33789,7 @@
               <w:rPr>
                 <w:sz w:val="14"/>
               </w:rPr>
-              <w:t>Twin Cool Grey has 0 units; its inbound lands 5 Nov (144 units). The ad cannot serve until then; no write. Re-read on its arrival: price to the Twin ceiling the</w:t>
+              <w:t>Twin Cool Grey earns $2.87 a unit before ads (Apr–Sep, 56 units (Sep had 1)): top of search affords $0.61, product pages $0.24, so the $0.50 base floor would pa</w:t>
             </w:r>
           </w:p>
         </w:tc>
@@ -34416,7 +35665,7 @@
               <w:rPr>
                 <w:sz w:val="14"/>
               </w:rPr>
-              <w:t>22 Oct TOS $2.79; 5 Nov base bid $1.35</w:t>
+              <w:t>2 Oct rider bids 1 keyword(s) by their own bid; 22 Oct TOS $3.10; 5 Nov base bid $1.35; 19 Nov base bid $1.01; 3 Dec base bid $0.83</w:t>
             </w:r>
           </w:p>
         </w:tc>
@@ -34474,7 +35723,7 @@
               <w:rPr>
                 <w:sz w:val="14"/>
               </w:rPr>
-              <w:t>22 Oct TOS $3.56; 5 Nov base bid $1.50; 19 Nov base bid $1.12; 3 Dec base bid $0.84</w:t>
+              <w:t>5 Nov TOS $3.95; 19 Nov base bid $1.50; 3 Dec base bid $1.12; 17 Dec base bid $0.84</w:t>
             </w:r>
           </w:p>
         </w:tc>
@@ -34532,7 +35781,7 @@
               <w:rPr>
                 <w:sz w:val="14"/>
               </w:rPr>
-              <w:t>22 Oct TOS $3.19; 5 Nov base bid $1.42; 19 Nov base bid $1.06</w:t>
+              <w:t>2 Oct rider bids 1 keyword(s) by their own bid; 22 Oct TOS $3.54; 5 Nov base bid $1.42; 19 Nov base bid $1.06; 3 Dec base bid $0.83</w:t>
             </w:r>
           </w:p>
         </w:tc>
@@ -34590,7 +35839,7 @@
               <w:rPr>
                 <w:sz w:val="14"/>
               </w:rPr>
-              <w:t>22 Oct TOS $2.83; 5 Nov base bid $1.42; 19 Nov base bid $1.06; 3 Dec base bid $0.83</w:t>
+              <w:t>5 Nov TOS $3.14; 19 Nov base bid $1.42; 3 Dec base bid $1.06; 17 Dec base bid $0.83</w:t>
             </w:r>
           </w:p>
         </w:tc>
@@ -34648,7 +35897,7 @@
               <w:rPr>
                 <w:sz w:val="14"/>
               </w:rPr>
-              <w:t>22 Oct TOS $3.14; 5 Nov base bid $1.42; 19 Nov base bid $1.06; 3 Dec base bid $0.83</w:t>
+              <w:t>5 Nov TOS $3.48; 19 Nov base bid $1.42; 3 Dec base bid $1.06; 17 Dec base bid $0.83</w:t>
             </w:r>
           </w:p>
         </w:tc>
@@ -34706,7 +35955,7 @@
               <w:rPr>
                 <w:sz w:val="14"/>
               </w:rPr>
-              <w:t>22 Oct TOS $3.23; 5 Nov base bid $1.42</w:t>
+              <w:t>5 Nov TOS $3.58; 19 Nov base bid $1.42; 3 Dec base bid $1.06; 17 Dec base bid $0.83</w:t>
             </w:r>
           </w:p>
         </w:tc>
@@ -34822,7 +36071,7 @@
               <w:rPr>
                 <w:sz w:val="14"/>
               </w:rPr>
-              <w:t>22 Oct TOS $3.21; 5 Nov base bid $1.50; 19 Nov base bid $1.12; 3 Dec base bid $0.84</w:t>
+              <w:t>2 Oct rider bids 1 keyword(s) by their own bid; 22 Oct TOS $3.56; 5 Nov base bid $1.50; 19 Nov base bid $1.12; 3 Dec base bid $0.84</w:t>
             </w:r>
           </w:p>
         </w:tc>
@@ -34880,7 +36129,7 @@
               <w:rPr>
                 <w:sz w:val="14"/>
               </w:rPr>
-              <w:t>2 Oct TOS $2.93; 2 Oct base bid $1.42; 22 Oct TOS $2.05; 22 Oct base bid $1.06; 5 Nov TOS $1.87; 5 Nov base bid $0.83</w:t>
+              <w:t>5 Nov TOS $3.40; 19 Nov base bid $1.42</w:t>
             </w:r>
           </w:p>
         </w:tc>
@@ -34938,7 +36187,7 @@
               <w:rPr>
                 <w:sz w:val="14"/>
               </w:rPr>
-              <w:t>22 Oct TOS $3.45; 5 Nov base bid $1.96; 19 Nov base bid $1.47; 3 Dec base bid $1.10</w:t>
+              <w:t>2 Oct rider bids 1 keyword(s) by their own bid; 5 Nov TOS $3.83; 19 Nov base bid $1.96; 3 Dec base bid $1.47; 17 Dec base bid $1.10; 31 Dec base bid $0.83</w:t>
             </w:r>
           </w:p>
         </w:tc>
@@ -34996,7 +36245,7 @@
               <w:rPr>
                 <w:sz w:val="14"/>
               </w:rPr>
-              <w:t>22 Oct TOS $2.73; 5 Nov base bid $1.20; 19 Nov base bid $0.90; 3 Dec base bid $0.83</w:t>
+              <w:t>22 Oct TOS $3.03; 5 Nov base bid $1.20; 19 Nov base bid $0.90; 3 Dec base bid $0.83</w:t>
             </w:r>
           </w:p>
         </w:tc>
@@ -35112,7 +36361,7 @@
               <w:rPr>
                 <w:sz w:val="14"/>
               </w:rPr>
-              <w:t>2 Oct TOS $3.57; 2 Oct base bid $1.91; 22 Oct TOS $2.50; 22 Oct base bid $1.43; 5 Nov TOS $2.20; 5 Nov base bid $1.07; 19 Nov base bid $0.83</w:t>
+              <w:t>5 Nov TOS $3.33; 19 Nov base bid $1.91; 3 Dec base bid $1.43; 17 Dec base bid $1.07; 31 Dec base bid $0.83</w:t>
             </w:r>
           </w:p>
         </w:tc>
@@ -35170,7 +36419,7 @@
               <w:rPr>
                 <w:sz w:val="14"/>
               </w:rPr>
-              <w:t>2 Oct base bid $0.83</w:t>
+              <w:t>22 Oct base bid $0.83</w:t>
             </w:r>
           </w:p>
         </w:tc>
@@ -35240,7 +36489,7 @@
         <w:pStyle w:val="ListBullet"/>
       </w:pPr>
       <w:r>
-        <w:t>18 of 29 priced Exact campaigns step their top-of-search price down; 11 hold it (at or under the ceiling) and may still cut the base. 13 held page-one campaigns walk down from 22 Oct; 7 prices move on 2 Oct.</w:t>
+        <w:t>17 of 29 priced Exact campaigns step their top-of-search price down; 12 hold it (at or under the ceiling) and may still cut the base. 16 held page-one campaigns take a first step to the CPC paid (22 Oct, 5 Nov); 5 prices move on 2 Oct.</w:t>
       </w:r>
     </w:p>
     <w:p>
@@ -35248,7 +36497,7 @@
         <w:pStyle w:val="ListBullet"/>
       </w:pPr>
       <w:r>
-        <w:t>A base cut is capped at 25% a write on a row with sales and 50% without, floor $0.50 (the floor only stops a cut), and repeats until the base is within 5% of what a product-page click affords: 28 bases, 16 of them in more than one step. On the 12 held rows the cut waits for the price walk and stops where total orders would fall under 70% of 6–19 Sep (4 stop there).</w:t>
+        <w:t>A base cut is capped at 25% a write on a row with sales and 50% without, floor $0.50 (the floor only stops a cut), and repeats until the base is within 5% of what a product-page click affords: 28 bases, 17 of them in more than one step. On the 15 held rows the cut waits for the price walk and stops where total orders would fall under 70% of 6–19 Sep (1 stop there).</w:t>
       </w:r>
     </w:p>
     <w:p>
@@ -36593,7 +37842,7 @@
               <w:rPr>
                 <w:sz w:val="14"/>
               </w:rPr>
-              <w:t>A</w:t>
+              <w:t>C</w:t>
             </w:r>
           </w:p>
         </w:tc>
@@ -36749,7 +37998,7 @@
               <w:rPr>
                 <w:sz w:val="14"/>
               </w:rPr>
-              <w:t>B</w:t>
+              <w:t>C</w:t>
             </w:r>
           </w:p>
         </w:tc>
@@ -37217,7 +38466,7 @@
               <w:rPr>
                 <w:sz w:val="14"/>
               </w:rPr>
-              <w:t>A</w:t>
+              <w:t>B</w:t>
             </w:r>
           </w:p>
         </w:tc>
@@ -37685,7 +38934,7 @@
               <w:rPr>
                 <w:sz w:val="14"/>
               </w:rPr>
-              <w:t>A</w:t>
+              <w:t>C</w:t>
             </w:r>
           </w:p>
         </w:tc>
@@ -37997,7 +39246,7 @@
               <w:rPr>
                 <w:sz w:val="14"/>
               </w:rPr>
-              <w:t>A</w:t>
+              <w:t>B</w:t>
             </w:r>
           </w:p>
         </w:tc>
@@ -38013,7 +39262,7 @@
               <w:rPr>
                 <w:sz w:val="14"/>
               </w:rPr>
-              <w:t>Queen Navy Blue</w:t>
+              <w:t>Queen Beige</w:t>
             </w:r>
           </w:p>
         </w:tc>
@@ -38027,7 +39276,7 @@
               <w:rPr>
                 <w:sz w:val="14"/>
               </w:rPr>
-              <w:t>2.16</w:t>
+              <w:t>1.08</w:t>
             </w:r>
           </w:p>
         </w:tc>
@@ -38041,7 +39290,7 @@
               <w:rPr>
                 <w:sz w:val="14"/>
               </w:rPr>
-              <w:t>34</w:t>
+              <w:t>30</w:t>
             </w:r>
           </w:p>
         </w:tc>
@@ -38055,7 +39304,7 @@
               <w:rPr>
                 <w:sz w:val="14"/>
               </w:rPr>
-              <w:t>23</w:t>
+              <w:t>51</w:t>
             </w:r>
           </w:p>
         </w:tc>
@@ -38069,7 +39318,7 @@
               <w:rPr>
                 <w:sz w:val="14"/>
               </w:rPr>
-              <w:t>15 Nov</w:t>
+              <w:t>21 Feb 2027</w:t>
             </w:r>
           </w:p>
         </w:tc>
@@ -38083,7 +39332,7 @@
               <w:rPr>
                 <w:sz w:val="14"/>
               </w:rPr>
-              <w:t>248</w:t>
+              <w:t>124</w:t>
             </w:r>
           </w:p>
         </w:tc>
@@ -38097,7 +39346,7 @@
               <w:rPr>
                 <w:sz w:val="14"/>
               </w:rPr>
-              <w:t>191</w:t>
+              <w:t>43</w:t>
             </w:r>
           </w:p>
         </w:tc>
@@ -38111,7 +39360,7 @@
               <w:rPr>
                 <w:sz w:val="14"/>
               </w:rPr>
-              <w:t>413</w:t>
+              <w:t>207</w:t>
             </w:r>
           </w:p>
         </w:tc>
@@ -38125,7 +39374,7 @@
               <w:rPr>
                 <w:sz w:val="14"/>
               </w:rPr>
-              <w:t>356</w:t>
+              <w:t>126</w:t>
             </w:r>
           </w:p>
         </w:tc>
@@ -38139,7 +39388,7 @@
               <w:rPr>
                 <w:sz w:val="14"/>
               </w:rPr>
-              <w:t>now</w:t>
+              <w:t>24 Nov</w:t>
             </w:r>
           </w:p>
         </w:tc>
@@ -38153,7 +39402,7 @@
               <w:rPr>
                 <w:sz w:val="14"/>
               </w:rPr>
-              <w:t>C</w:t>
+              <w:t>B</w:t>
             </w:r>
           </w:p>
         </w:tc>
@@ -38169,7 +39418,7 @@
               <w:rPr>
                 <w:sz w:val="14"/>
               </w:rPr>
-              <w:t>Queen Beige</w:t>
+              <w:t>Queen Navy Blue</w:t>
             </w:r>
           </w:p>
         </w:tc>
@@ -38183,7 +39432,7 @@
               <w:rPr>
                 <w:sz w:val="14"/>
               </w:rPr>
-              <w:t>1.08</w:t>
+              <w:t>2.16</w:t>
             </w:r>
           </w:p>
         </w:tc>
@@ -38197,7 +39446,7 @@
               <w:rPr>
                 <w:sz w:val="14"/>
               </w:rPr>
-              <w:t>30</w:t>
+              <w:t>34</w:t>
             </w:r>
           </w:p>
         </w:tc>
@@ -38211,7 +39460,7 @@
               <w:rPr>
                 <w:sz w:val="14"/>
               </w:rPr>
-              <w:t>51</w:t>
+              <w:t>23</w:t>
             </w:r>
           </w:p>
         </w:tc>
@@ -38225,7 +39474,7 @@
               <w:rPr>
                 <w:sz w:val="14"/>
               </w:rPr>
-              <w:t>21 Feb 2027</w:t>
+              <w:t>15 Nov</w:t>
             </w:r>
           </w:p>
         </w:tc>
@@ -38239,7 +39488,7 @@
               <w:rPr>
                 <w:sz w:val="14"/>
               </w:rPr>
-              <w:t>124</w:t>
+              <w:t>248</w:t>
             </w:r>
           </w:p>
         </w:tc>
@@ -38253,7 +39502,7 @@
               <w:rPr>
                 <w:sz w:val="14"/>
               </w:rPr>
-              <w:t>43</w:t>
+              <w:t>191</w:t>
             </w:r>
           </w:p>
         </w:tc>
@@ -38267,7 +39516,7 @@
               <w:rPr>
                 <w:sz w:val="14"/>
               </w:rPr>
-              <w:t>207</w:t>
+              <w:t>413</w:t>
             </w:r>
           </w:p>
         </w:tc>
@@ -38281,7 +39530,7 @@
               <w:rPr>
                 <w:sz w:val="14"/>
               </w:rPr>
-              <w:t>126</w:t>
+              <w:t>356</w:t>
             </w:r>
           </w:p>
         </w:tc>
@@ -38295,7 +39544,7 @@
               <w:rPr>
                 <w:sz w:val="14"/>
               </w:rPr>
-              <w:t>24 Nov</w:t>
+              <w:t>now</w:t>
             </w:r>
           </w:p>
         </w:tc>
@@ -38309,7 +39558,7 @@
               <w:rPr>
                 <w:sz w:val="14"/>
               </w:rPr>
-              <w:t>B</w:t>
+              <w:t>C</w:t>
             </w:r>
           </w:p>
         </w:tc>
@@ -40112,7 +41361,7 @@
               <w:rPr>
                 <w:sz w:val="16"/>
               </w:rPr>
-              <w:t>$5,831</w:t>
+              <w:t>$5,857</w:t>
             </w:r>
           </w:p>
         </w:tc>
@@ -40126,7 +41375,7 @@
               <w:rPr>
                 <w:sz w:val="16"/>
               </w:rPr>
-              <w:t>$690</w:t>
+              <w:t>$701</w:t>
             </w:r>
           </w:p>
         </w:tc>
@@ -40140,7 +41389,7 @@
               <w:rPr>
                 <w:sz w:val="16"/>
               </w:rPr>
-              <w:t>11.8%</w:t>
+              <w:t>12.0%</w:t>
             </w:r>
           </w:p>
         </w:tc>
@@ -40154,7 +41403,7 @@
               <w:rPr>
                 <w:sz w:val="16"/>
               </w:rPr>
-              <w:t>$708</w:t>
+              <w:t>$703</w:t>
             </w:r>
           </w:p>
         </w:tc>
@@ -40168,7 +41417,7 @@
               <w:rPr>
                 <w:sz w:val="16"/>
               </w:rPr>
-              <w:t>+$19</w:t>
+              <w:t>+$14</w:t>
             </w:r>
           </w:p>
         </w:tc>
@@ -40198,7 +41447,7 @@
               <w:rPr>
                 <w:sz w:val="16"/>
               </w:rPr>
-              <w:t>$5,440</w:t>
+              <w:t>$5,616</w:t>
             </w:r>
           </w:p>
         </w:tc>
@@ -40212,7 +41461,7 @@
               <w:rPr>
                 <w:sz w:val="16"/>
               </w:rPr>
-              <w:t>$465</w:t>
+              <w:t>$567</w:t>
             </w:r>
           </w:p>
         </w:tc>
@@ -40226,7 +41475,7 @@
               <w:rPr>
                 <w:sz w:val="16"/>
               </w:rPr>
-              <w:t>8.5%</w:t>
+              <w:t>10.1%</w:t>
             </w:r>
           </w:p>
         </w:tc>
@@ -40240,7 +41489,7 @@
               <w:rPr>
                 <w:sz w:val="16"/>
               </w:rPr>
-              <w:t>$834</w:t>
+              <w:t>$776</w:t>
             </w:r>
           </w:p>
         </w:tc>
@@ -40254,7 +41503,7 @@
               <w:rPr>
                 <w:sz w:val="16"/>
               </w:rPr>
-              <w:t>+$145</w:t>
+              <w:t>+$87</w:t>
             </w:r>
           </w:p>
         </w:tc>
@@ -40284,7 +41533,7 @@
               <w:rPr>
                 <w:sz w:val="16"/>
               </w:rPr>
-              <w:t>$5,931</w:t>
+              <w:t>$5,937</w:t>
             </w:r>
           </w:p>
         </w:tc>
@@ -40298,7 +41547,7 @@
               <w:rPr>
                 <w:sz w:val="16"/>
               </w:rPr>
-              <w:t>$690</w:t>
+              <w:t>$701</w:t>
             </w:r>
           </w:p>
         </w:tc>
@@ -40312,7 +41561,7 @@
               <w:rPr>
                 <w:sz w:val="16"/>
               </w:rPr>
-              <w:t>11.6%</w:t>
+              <w:t>11.8%</w:t>
             </w:r>
           </w:p>
         </w:tc>
@@ -40326,7 +41575,7 @@
               <w:rPr>
                 <w:sz w:val="16"/>
               </w:rPr>
-              <w:t>$733</w:t>
+              <w:t>$723</w:t>
             </w:r>
           </w:p>
         </w:tc>
@@ -40340,7 +41589,7 @@
               <w:rPr>
                 <w:sz w:val="16"/>
               </w:rPr>
-              <w:t>+$44</w:t>
+              <w:t>+$34</w:t>
             </w:r>
           </w:p>
         </w:tc>
@@ -40370,7 +41619,7 @@
               <w:rPr>
                 <w:sz w:val="16"/>
               </w:rPr>
-              <w:t>$5,832</w:t>
+              <w:t>$5,876</w:t>
             </w:r>
           </w:p>
         </w:tc>
@@ -40384,7 +41633,7 @@
               <w:rPr>
                 <w:sz w:val="16"/>
               </w:rPr>
-              <w:t>$465</w:t>
+              <w:t>$567</w:t>
             </w:r>
           </w:p>
         </w:tc>
@@ -40398,7 +41647,7 @@
               <w:rPr>
                 <w:sz w:val="16"/>
               </w:rPr>
-              <w:t>8.0%</w:t>
+              <w:t>9.6%</w:t>
             </w:r>
           </w:p>
         </w:tc>
@@ -40412,7 +41661,7 @@
               <w:rPr>
                 <w:sz w:val="16"/>
               </w:rPr>
-              <w:t>$933</w:t>
+              <w:t>$842</w:t>
             </w:r>
           </w:p>
         </w:tc>
@@ -40426,7 +41675,7 @@
               <w:rPr>
                 <w:sz w:val="16"/>
               </w:rPr>
-              <w:t>+$244</w:t>
+              <w:t>+$153</w:t>
             </w:r>
           </w:p>
         </w:tc>
@@ -40612,7 +41861,7 @@
               <w:rPr>
                 <w:sz w:val="16"/>
               </w:rPr>
-              <w:t>666</w:t>
+              <w:t>677</w:t>
             </w:r>
           </w:p>
         </w:tc>
@@ -40626,7 +41875,7 @@
               <w:rPr>
                 <w:sz w:val="16"/>
               </w:rPr>
-              <w:t>470</w:t>
+              <w:t>635</w:t>
             </w:r>
           </w:p>
         </w:tc>
@@ -40640,7 +41889,7 @@
               <w:rPr>
                 <w:sz w:val="16"/>
               </w:rPr>
-              <w:t>441</w:t>
+              <w:t>543</w:t>
             </w:r>
           </w:p>
         </w:tc>
@@ -40722,7 +41971,7 @@
               <w:rPr>
                 <w:sz w:val="16"/>
               </w:rPr>
-              <w:t>98</w:t>
+              <w:t>169</w:t>
             </w:r>
           </w:p>
         </w:tc>
@@ -41124,7 +42373,7 @@
               <w:rPr>
                 <w:sz w:val="16"/>
               </w:rPr>
-              <w:t>690</w:t>
+              <w:t>701</w:t>
             </w:r>
           </w:p>
         </w:tc>
@@ -41138,7 +42387,7 @@
               <w:rPr>
                 <w:sz w:val="16"/>
               </w:rPr>
-              <w:t>494</w:t>
+              <w:t>659</w:t>
             </w:r>
           </w:p>
         </w:tc>
@@ -41152,7 +42401,7 @@
               <w:rPr>
                 <w:sz w:val="16"/>
               </w:rPr>
-              <w:t>465</w:t>
+              <w:t>567</w:t>
             </w:r>
           </w:p>
         </w:tc>
@@ -41161,7 +42410,7 @@
     <w:p/>
     <w:p>
       <w:r>
-        <w:t>Envelope $716–835 a week (12–14% of 25 Sep–1 Oct sales). Caps are ceilings, not a forecast: daily budgets on live campaigns total $450 a day; the 5 new campaigns add $40.00 a day of caps only once posture is green.</w:t>
+        <w:t>Envelope $716–835 a week (12–14% of 25 Sep–1 Oct sales), an upper limit: spend is set by what a click earns. Caps are ceilings, not a forecast: $455 a day on the 35 live Exact campaigns today, $450 a day after the 2 Oct pauses and revive, with the Auto; the 5 new campaigns add $40.00 a day of caps only once posture is green.</w:t>
       </w:r>
     </w:p>
     <w:p>
@@ -41217,7 +42466,7 @@
         <w:pStyle w:val="ListBullet"/>
       </w:pPr>
       <w:r>
-        <w:t>5. 5 Nov: Twin restarts on its inbound.</w:t>
+        <w:t>5. 22 Oct wave A, 5 Nov wave B: the first held steps, to the CPC paid.</w:t>
       </w:r>
     </w:p>
     <w:p>
@@ -41523,7 +42772,7 @@
               <w:rPr>
                 <w:sz w:val="14"/>
               </w:rPr>
-              <w:t>Audit (dated, confirmed) vs Sellerboard (0 received since 28 Aug)</w:t>
+              <w:t>Audit (dated, confirmed) vs Sellerboard shipment status</w:t>
             </w:r>
           </w:p>
         </w:tc>
@@ -41537,7 +42786,7 @@
               <w:rPr>
                 <w:sz w:val="14"/>
               </w:rPr>
-              <w:t>16 Oct / 5 Nov vs undated</w:t>
+              <w:t>16 Oct / 5 Nov vs 1,884 units 'ready to ship', 15 receiving</w:t>
             </w:r>
           </w:p>
         </w:tc>
@@ -41551,7 +42800,7 @@
               <w:rPr>
                 <w:sz w:val="14"/>
               </w:rPr>
-              <w:t>Audit dates, provisional 26 Nov for 1 Oct</w:t>
+              <w:t>Confirmed stock for tiers; all for reorders</w:t>
             </w:r>
           </w:p>
         </w:tc>
@@ -41792,7 +43041,7 @@
     <w:p/>
     <w:p>
       <w:r>
-        <w:t>Checks (E Checks): Sellerboard per-SKU units = family total, 1 Apr–30 Sep — PASS; Exact spend = plan rows (Command Center, 30 days) — PASS; Audit decisions reconciled — PASS; No top-of-search price rises — PASS; No bid rises anywhere — PASS; Non-held price paths end within 5% of their ceiling; held paths end where the guard stops them — PASS; 90% rule: every held first step at or above 90% of the CPC paid — PASS; Deal window (SOP-32): no write on any campaign 6–21 Oct — PASS; Rank-hold premium on the ceiling rate — PASS; One lever per write on held and re-pointed campaigns — PASS; Held status read on every live keyword, either rank source (7-day medians) — PASS; Audit single-day ranks checked against 7-day medians — PASS; Non-held bases end within 5% of what a product-page click affords; held bases stop where the order guard binds — PASS; One stock clock with dated arrivals — PASS; Held terms keep more of their delivery than the rest (central) — PASS; Rows priced on the plan child — PASS; No row advertises a child that loses money before ads — PASS; Spend envelope — PASS; Shipments vs Sellerboard inbound — PASS; FC transfers dated — OPEN; Top-of-search impression share (guard metric) — OPEN.</w:t>
+        <w:t>Checks (E Checks): Sellerboard per-SKU units = family total, 1 Apr–30 Sep — PASS; Exact spend = plan rows (Command Center, 30 days) — PASS; Audit decisions reconciled — PASS; No top-of-search price rises — PASS; No bid rises anywhere — PASS; Non-held price paths end within 5% of their ceiling; held paths end where the guard stops them — PASS; First held step at the CPC paid (review 1) — PASS; Deal window (SOP-32): no write on any campaign 6–21 Oct — PASS; Rank-hold premium on the ceiling rate — PASS; One lever per write on held and re-pointed campaigns — PASS; Held rollout split across two dates (review 1) — PASS; Held test per keyword (review 1) — PASS; Rank coverage (review 1) — OPEN; Twin at the Cal King rule (review 1) — PASS; Held status read on every live keyword, either rank source (7-day medians) — PASS; Audit single-day ranks checked against 7-day medians — PASS; Non-held bases end within 5% of what a product-page click affords; held bases stop where the order guard binds — PASS; One stock clock; tiers and triggers on confirmed stock only — PASS; Held terms keep more of their delivery than the rest (central) — PASS; Rows priced on the plan child — PASS; No row advertises a child that loses money before ads — PASS; Spend envelope — PASS; Shipments: units reconcile; arrival not confirmed — OPEN; FC transfers dated — OPEN; Top-of-search impression share (guard metric) — OPEN.</w:t>
       </w:r>
     </w:p>
     <w:p>

</xml_diff>

<commit_message>
SCFS pack: top of search first
Exact top of search is protected and, on tier-A stock (Full Cool
Grey), raised to its ceiling; rest-of-search modifiers to 0%;
product pages keep stepping to what they earn. New TOS-first tab and
section 5c with the placement mix now and at 31 Dec.

Co-Authored-By: Claude Opus 5.5 <noreply@anthropic.com>
Claude-Session: https://claude.ai/code/session_01LdWeCD4TJ4W4nS4vdsqjHm
</commit_message>
<xml_diff>
--- a/reviews/SCFS-20260929/SCFS_Final_Plan_20261002.docx
+++ b/reviews/SCFS-20260929/SCFS_Final_Plan_20261002.docx
@@ -646,7 +646,7 @@
         <w:pStyle w:val="ListBullet"/>
       </w:pPr>
       <w:r>
-        <w:t>Read posture on the trailing 7 days: 12.4% is 1.03× the band, amber — no climbs, no new campaigns until it is green; the only premium is the rank-hold cost on held terms.</w:t>
+        <w:t>Read posture on the trailing 7 days: 12.4% is 1.03× the band, amber — no climb past a ceiling, no new campaigns until it is green; the only premium is the rank-hold cost on held terms.</w:t>
       </w:r>
     </w:p>
     <w:p>
@@ -670,7 +670,15 @@
         <w:pStyle w:val="ListBullet"/>
       </w:pPr>
       <w:r>
-        <w:t>Spend is set by what a click earns; the envelope (12–14% of trailing-7-day sales) is an upper limit, not a target. On that rule the plan ends at $567 a week (9.5% of last week's sales); the owner confirms it or chooses to keep held bases (section 10).</w:t>
+        <w:t>Top of search first (owner, 2 Oct): Exact top of search converts at 21.2% against 8.3% on product pages and 1.7% in rest of search, so it is protected and, where stock is healthy, raised to its ceiling; product pages and rest of search take the cuts. By 31 Dec (central) top of search carries 86.9% of Exact spend (now 69.8%) and 89.6% of orders (now 76.3%). Section 5c.</w:t>
+      </w:r>
+    </w:p>
+    <w:p>
+      <w:pPr>
+        <w:pStyle w:val="ListBullet"/>
+      </w:pPr>
+      <w:r>
+        <w:t>Spend is set by what a click earns; the envelope (12–14% of trailing-7-day sales) is an upper limit, not a target. On that rule the plan ends at $566 a week (9.5% of last week's sales); the owner confirms it or chooses to keep held bases (section 10).</w:t>
       </w:r>
     </w:p>
     <w:p>
@@ -1036,7 +1044,7 @@
               <w:rPr>
                 <w:sz w:val="16"/>
               </w:rPr>
-              <w:t>Trailing 7 days 12.4%: amber; no climbs; new campaigns gated</w:t>
+              <w:t>Trailing 7 days 12.4%: amber; no climb past a ceiling; new campaigns gated</w:t>
             </w:r>
           </w:p>
         </w:tc>
@@ -1215,7 +1223,7 @@
               <w:rPr>
                 <w:sz w:val="16"/>
               </w:rPr>
-              <w:t>12.4% → amber; $716–835/wk; expected $701 → $567/wk</w:t>
+              <w:t>12.4% → amber; $716–835/wk; expected $697 → $566/wk</w:t>
             </w:r>
           </w:p>
         </w:tc>
@@ -1305,7 +1313,7 @@
               <w:rPr>
                 <w:sz w:val="16"/>
               </w:rPr>
-              <w:t>Exact orders 224 → 178 at 31 Dec (range 174–190)</w:t>
+              <w:t>Exact orders 224 → 177 at 31 Dec (range 170–189)</w:t>
             </w:r>
           </w:p>
         </w:tc>
@@ -1425,7 +1433,7 @@
               <w:rPr>
                 <w:sz w:val="16"/>
               </w:rPr>
-              <w:t>Held 32 of 191 (16%), not held 12 of 24 (48%)</w:t>
+              <w:t>Held 33 of 191 (17%), not held 12 of 24 (48%)</w:t>
             </w:r>
           </w:p>
         </w:tc>
@@ -1712,7 +1720,7 @@
               <w:rPr>
                 <w:sz w:val="16"/>
               </w:rPr>
-              <w:t>Confirmed: no tracker (Command Center, Data Dive, ASINsight) covers the other 36. Held is read per keyword; untracked keywords with ≥5 September orders are held pending a rank (10); 4 riders priced by their own bid on 2 Oct; keyword-level bids in T3k; trackers to add listed (owner).</w:t>
+              <w:t>Confirmed: no tracker (Command Center, Data Dive, ASINsight) covers the other 36. Held is read per keyword; untracked keywords with ≥5 September orders are held pending a rank (10); 3 riders priced by their own bid on 2 Oct; keyword-level bids in T3k; trackers to add listed (owner).</w:t>
             </w:r>
           </w:p>
         </w:tc>
@@ -2412,7 +2420,7 @@
               <w:rPr>
                 <w:sz w:val="16"/>
               </w:rPr>
-              <w:t>No push, no climbs</w:t>
+              <w:t>No push, no climb past a ceiling</w:t>
             </w:r>
           </w:p>
         </w:tc>
@@ -2442,7 +2450,7 @@
               <w:rPr>
                 <w:sz w:val="16"/>
               </w:rPr>
-              <w:t>Nothing moves 6–21 Oct</w:t>
+              <w:t>Top of search first</w:t>
             </w:r>
           </w:p>
         </w:tc>
@@ -2456,7 +2464,7 @@
               <w:rPr>
                 <w:sz w:val="16"/>
               </w:rPr>
-              <w:t>Lightning Deal 7 Oct (SOP-32): price, conversion, traffic and CPC all move in the window, so no write goes in and no read uses it. 2 Oct carries the child swaps, the pauses, the walls, the rider bids and the first non-held steps; held first steps go on 22 Oct (wave A) and 5 Nov (wave B).</w:t>
+              <w:t>Owner instruction. Top of search costs $15.33 an order against $22.34 on product pages and $21.34 in rest of search. Held terms keep their top-of-search price at the CPC paid; the two Full rows on Full Cool Grey (tier A, 206 days confirmed) rise to their $1.38 ceiling; both rest-of-search modifiers go to 0%; product-page bids come down to what those clicks earn. King White and Queen White are tier B, so no top-of-search raise there: the stock gate. Section 5c.</w:t>
             </w:r>
           </w:p>
         </w:tc>
@@ -2472,7 +2480,7 @@
               <w:rPr>
                 <w:sz w:val="16"/>
               </w:rPr>
-              <w:t>Keep Queen White on Queen (reject the 11 swaps to Graphite)</w:t>
+              <w:t>Nothing moves 6–21 Oct</w:t>
             </w:r>
           </w:p>
         </w:tc>
@@ -2486,7 +2494,7 @@
               <w:rPr>
                 <w:sz w:val="16"/>
               </w:rPr>
-              <w:t>The audit's NO_ROOM read used 61 units on 29 Sep at the push pace. On 2 Oct: 110 sellable + 151 in FC transfer (16 Oct) = 117 days on the seasonal clock. Without a push there is room; a swap re-prices 11 campaigns on a child with no Exact history. Queen Graphite (129 + 168) loads paused as the back-up.</w:t>
+              <w:t>Lightning Deal 7 Oct (SOP-32): price, conversion, traffic and CPC all move in the window, so no write goes in and no read uses it. 2 Oct carries the child swaps, the pauses, the walls, the rider bids and the first non-held steps; held first steps go on 22 Oct (wave A) and 5 Nov (wave B).</w:t>
             </w:r>
           </w:p>
         </w:tc>
@@ -2502,7 +2510,7 @@
               <w:rPr>
                 <w:sz w:val="16"/>
               </w:rPr>
-              <w:t>Full to Full Cool Grey</w:t>
+              <w:t>Keep Queen White on Queen (reject the 11 swaps to Graphite)</w:t>
             </w:r>
           </w:p>
         </w:tc>
@@ -2516,7 +2524,7 @@
               <w:rPr>
                 <w:sz w:val="16"/>
               </w:rPr>
-              <w:t>Full White is out until January. The audit's Full Cool Blue loses $1.55 a unit before ads; Full Cool Grey earns $8.15 with 46 + 59 units (206 days).</w:t>
+              <w:t>The audit's NO_ROOM read used 61 units on 29 Sep at the push pace. On 2 Oct: 110 sellable + 151 in FC transfer (16 Oct) = 117 days on the seasonal clock. Without a push there is room; a swap re-prices 11 campaigns on a child with no Exact history. Queen Graphite (129 + 168) loads paused as the back-up.</w:t>
             </w:r>
           </w:p>
         </w:tc>
@@ -2532,7 +2540,7 @@
               <w:rPr>
                 <w:sz w:val="16"/>
               </w:rPr>
-              <w:t>Pause Cal King Exact</w:t>
+              <w:t>Full to Full Cool Grey</w:t>
             </w:r>
           </w:p>
         </w:tc>
@@ -2546,7 +2554,7 @@
               <w:rPr>
                 <w:sz w:val="16"/>
               </w:rPr>
-              <w:t>No Cal King child pays for a click: Cal King White $2.38 a unit (23 units); Cal King Light Pink $2.22 a unit (13 units); Cal King Sage Green $0.87 a unit (6 units); Cal King Cream −$2.05 a unit (15 units). Cal King fees run $20–22 a unit against $13–15 on King. The one Cal King Exact pauses; the Auto keeps the term.</w:t>
+              <w:t>Full White is out until January. The audit's Full Cool Blue loses $1.55 a unit before ads; Full Cool Grey earns $8.15 with 46 + 59 units (206 days).</w:t>
             </w:r>
           </w:p>
         </w:tc>
@@ -2562,7 +2570,7 @@
               <w:rPr>
                 <w:sz w:val="16"/>
               </w:rPr>
-              <w:t>Pause both Twin Exacts</w:t>
+              <w:t>Pause Cal King Exact</w:t>
             </w:r>
           </w:p>
         </w:tc>
@@ -2576,7 +2584,7 @@
               <w:rPr>
                 <w:sz w:val="16"/>
               </w:rPr>
-              <w:t>By the Cal King rule: Twin Cool Grey earns $2.87 a unit, so product pages afford $0.24 against a $0.50 base floor; the campaigns sat at $5.18 and $3.80 at top of search against a $0.61 ceiling and would restart by themselves when stock lands. Paused on 2 Oct; the Twin terms stay with the Auto.</w:t>
+              <w:t>No Cal King child pays for a click: Cal King White $2.38 a unit (23 units); Cal King Light Pink $2.22 a unit (13 units); Cal King Sage Green $0.87 a unit (6 units); Cal King Cream −$2.05 a unit (15 units). Cal King fees run $20–22 a unit against $13–15 on King. The one Cal King Exact pauses; the Auto keeps the term.</w:t>
             </w:r>
           </w:p>
         </w:tc>
@@ -2592,7 +2600,7 @@
               <w:rPr>
                 <w:sz w:val="16"/>
               </w:rPr>
-              <w:t>Hold the page-one terms: first step to the CPC paid, in two waves</w:t>
+              <w:t>Pause both Twin Exacts</w:t>
             </w:r>
           </w:p>
         </w:tc>
@@ -2606,7 +2614,7 @@
               <w:rPr>
                 <w:sz w:val="16"/>
               </w:rPr>
-              <w:t>On today's prices a step to 90% of the CPC paid could keep at most 45–84% of the clicks (a DO bid caps the price; T3), below the forecast's 81% on most rows, so the first step is the CPC paid itself: it removes headroom without bidding under the average clearing price. Wave A (one large Queen, one large King, two small: 4) on 22 Oct; wave B (8) on 5 Nov, read against wave A. 4 held rows have under 5% headroom and hold. Further steps, 90% of the new CPC paid, only after a read. Held-term guard: before each write, compare the campaign's top-of-search impression share since the last write (leaving out 7–21 Oct, the Lightning Deal and its 14-day settle) with its share in 6–19 Sep, the last 14 days before the 20–30 Sep Best Deal; write the next price step only while the share stays at 70% or more of that pre-plan level, and undo the last step (end the walk) if it has fallen below 70% or the rank slipped more than 3 places (15% above rank 20); where the console reports no impression share, use top-of-search clicks divided by the season factor for the same comparison. 'cooling fitted sheet': $3.10 on 22 Oct (from $3.78; ceiling $1.61).</w:t>
+              <w:t>By the Cal King rule: Twin Cool Grey earns $2.87 a unit, so product pages afford $0.24 against a $0.50 base floor; the campaigns sat at $5.18 and $3.80 at top of search against a $0.61 ceiling and would restart by themselves when stock lands. Paused on 2 Oct; the Twin terms stay with the Auto.</w:t>
             </w:r>
           </w:p>
         </w:tc>
@@ -2622,6 +2630,36 @@
               <w:rPr>
                 <w:sz w:val="16"/>
               </w:rPr>
+              <w:t>Hold the page-one terms: first step to the CPC paid, in two waves</w:t>
+            </w:r>
+          </w:p>
+        </w:tc>
+        <w:tc>
+          <w:tcPr>
+            <w:tcW w:type="dxa" w:w="7370"/>
+          </w:tcPr>
+          <w:p>
+            <w:r/>
+            <w:r>
+              <w:rPr>
+                <w:sz w:val="16"/>
+              </w:rPr>
+              <w:t>On today's prices a step to 90% of the CPC paid could keep at most 45–84% of the clicks (a DO bid caps the price; T3), below the forecast's 81% on most rows, so the first step is the CPC paid itself: it removes headroom without bidding under the average clearing price. Wave A (one large Queen, one large King, two small: 4) on 22 Oct; wave B (8) on 5 Nov, read against wave A. 4 held rows have under 5% headroom and hold. Further steps, 90% of the new CPC paid, only after a read. Held-term guard: before each write, compare the campaign's top-of-search impression share since the last write (leaving out 7–21 Oct, the Lightning Deal and its 14-day settle) with its share in 6–19 Sep, the last 14 days before the 20–30 Sep Best Deal; write the next price step only while the share stays at 70% or more of that pre-plan level, and undo the last step (end the walk) if it has fallen below 70% or the rank slipped more than 3 places (15% above rank 20); where the console reports no impression share, use top-of-search clicks divided by the season factor for the same comparison. 'cooling fitted sheet': $3.10 on 22 Oct (from $3.78; ceiling $1.61).</w:t>
+            </w:r>
+          </w:p>
+        </w:tc>
+      </w:tr>
+      <w:tr>
+        <w:tc>
+          <w:tcPr>
+            <w:tcW w:type="dxa" w:w="2835"/>
+          </w:tcPr>
+          <w:p>
+            <w:r/>
+            <w:r>
+              <w:rPr>
+                <w:sz w:val="16"/>
+              </w:rPr>
               <w:t>Read held status per keyword</w:t>
             </w:r>
           </w:p>
@@ -2636,7 +2674,7 @@
               <w:rPr>
                 <w:sz w:val="16"/>
               </w:rPr>
-              <w:t>Only 17 of 53 Exact keywords have a rank in any source (the other 36 carry $1,985 and 136 orders). An untracked keyword with ≥5 September orders is held pending a rank (10 keywords) until the trackers the owner adds give it a 7-day median; 4 riders above the ceiling are priced by their own bid on 2 Oct (T3k).</w:t>
+              <w:t>Only 17 of 53 Exact keywords have a rank in any source (the other 36 carry $1,985 and 136 orders). An untracked keyword with ≥5 September orders is held pending a rank (10 keywords) until the trackers the owner adds give it a 7-day median; 3 riders above the ceiling are priced by their own bid on 2 Oct (T3k).</w:t>
             </w:r>
           </w:p>
         </w:tc>
@@ -4160,7 +4198,7 @@
               <w:rPr>
                 <w:sz w:val="16"/>
               </w:rPr>
-              <w:t>14</w:t>
+              <w:t>16</w:t>
             </w:r>
           </w:p>
         </w:tc>
@@ -4276,7 +4314,7 @@
               <w:rPr>
                 <w:sz w:val="16"/>
               </w:rPr>
-              <w:t>29</w:t>
+              <w:t>28</w:t>
             </w:r>
           </w:p>
         </w:tc>
@@ -4763,7 +4801,7 @@
     <w:p/>
     <w:p>
       <w:r>
-        <w:t>129 rows load from the Bulk upload tab and 30 need an ID or a manual step from the console. Writes after 2 Oct (20 campaigns carry them, the last on 31 Dec 2026) are not in the upload file: each is re-sized by the read before it loads (T3 'Write dates'). No price and no bid goes up.</w:t>
+        <w:t>130 rows load from the Bulk upload tab and 30 need an ID or a manual step from the console. Writes after 2 Oct (21 campaigns carry them, the last on 31 Dec 2026) are not in the upload file: each is re-sized by the read before it loads (T3 'Write dates'). No price and no bid goes up.</w:t>
       </w:r>
     </w:p>
     <w:p>
@@ -5356,7 +5394,7 @@
               <w:rPr>
                 <w:sz w:val="14"/>
               </w:rPr>
-              <w:t>2 Oct 1 keyword(s) by their own bid; 22 Oct price $3.10; 5 Nov base $1.35; 19 Nov base $1.01; 3 Dec base $0.83</w:t>
+              <w:t>2 Oct ; 22 Oct price $3.10; 5 Nov base $1.35; 19 Nov base $1.01; 3 Dec base $0.83</w:t>
             </w:r>
           </w:p>
         </w:tc>
@@ -5958,7 +5996,7 @@
               <w:rPr>
                 <w:sz w:val="14"/>
               </w:rPr>
-              <w:t>5 Nov price $3.40; 19 Nov base $1.42</w:t>
+              <w:t>2 Oct ; 5 Nov price $3.40; 19 Nov base $1.42</w:t>
             </w:r>
           </w:p>
         </w:tc>
@@ -6486,7 +6524,7 @@
               <w:rPr>
                 <w:sz w:val="16"/>
               </w:rPr>
-              <w:t>$3,316</w:t>
+              <w:t>$3,302</w:t>
             </w:r>
           </w:p>
         </w:tc>
@@ -6500,7 +6538,7 @@
               <w:rPr>
                 <w:sz w:val="16"/>
               </w:rPr>
-              <w:t>206</w:t>
+              <w:t>204</w:t>
             </w:r>
           </w:p>
         </w:tc>
@@ -6544,7 +6582,7 @@
               <w:rPr>
                 <w:sz w:val="16"/>
               </w:rPr>
-              <w:t>$3,252</w:t>
+              <w:t>$3,235</w:t>
             </w:r>
           </w:p>
         </w:tc>
@@ -6558,7 +6596,7 @@
               <w:rPr>
                 <w:sz w:val="16"/>
               </w:rPr>
-              <w:t>200</w:t>
+              <w:t>198</w:t>
             </w:r>
           </w:p>
         </w:tc>
@@ -6602,7 +6640,7 @@
               <w:rPr>
                 <w:sz w:val="16"/>
               </w:rPr>
-              <w:t>$3,192</w:t>
+              <w:t>$3,168</w:t>
             </w:r>
           </w:p>
         </w:tc>
@@ -6616,7 +6654,7 @@
               <w:rPr>
                 <w:sz w:val="16"/>
               </w:rPr>
-              <w:t>194</w:t>
+              <w:t>190</w:t>
             </w:r>
           </w:p>
         </w:tc>
@@ -6660,7 +6698,7 @@
               <w:rPr>
                 <w:sz w:val="16"/>
               </w:rPr>
-              <w:t>$2,888</w:t>
+              <w:t>$2,880</w:t>
             </w:r>
           </w:p>
         </w:tc>
@@ -6674,7 +6712,7 @@
               <w:rPr>
                 <w:sz w:val="16"/>
               </w:rPr>
-              <w:t>190</w:t>
+              <w:t>189</w:t>
             </w:r>
           </w:p>
         </w:tc>
@@ -6718,7 +6756,7 @@
               <w:rPr>
                 <w:sz w:val="16"/>
               </w:rPr>
-              <w:t>$2,783</w:t>
+              <w:t>$2,776</w:t>
             </w:r>
           </w:p>
         </w:tc>
@@ -6732,7 +6770,7 @@
               <w:rPr>
                 <w:sz w:val="16"/>
               </w:rPr>
-              <w:t>178</w:t>
+              <w:t>177</w:t>
             </w:r>
           </w:p>
         </w:tc>
@@ -6776,7 +6814,7 @@
               <w:rPr>
                 <w:sz w:val="16"/>
               </w:rPr>
-              <w:t>$2,768</w:t>
+              <w:t>$2,731</w:t>
             </w:r>
           </w:p>
         </w:tc>
@@ -6790,7 +6828,7 @@
               <w:rPr>
                 <w:sz w:val="16"/>
               </w:rPr>
-              <w:t>174</w:t>
+              <w:t>170</w:t>
             </w:r>
           </w:p>
         </w:tc>
@@ -6982,7 +7020,7 @@
               <w:rPr>
                 <w:sz w:val="16"/>
               </w:rPr>
-              <w:t>22</w:t>
+              <w:t>23</w:t>
             </w:r>
           </w:p>
         </w:tc>
@@ -6996,7 +7034,7 @@
               <w:rPr>
                 <w:sz w:val="16"/>
               </w:rPr>
-              <w:t>32 (16%)</w:t>
+              <w:t>33 (17%)</w:t>
             </w:r>
           </w:p>
         </w:tc>
@@ -7010,7 +7048,7 @@
               <w:rPr>
                 <w:sz w:val="16"/>
               </w:rPr>
-              <w:t>31</w:t>
+              <w:t>36</w:t>
             </w:r>
           </w:p>
         </w:tc>
@@ -7189,7 +7227,295 @@
     <w:p/>
     <w:p>
       <w:r>
-        <w:t>Clicks at a placement are unchanged while the price stays at or above the CPC paid there (or today's price, where dynamic bidding pays above it); below it they fall with the price ratio in the best case, its square in the central case, and in the worst case to 10% once the price is under 70% of it. Held-term guard: before each write, compare the campaign's top-of-search impression share since the last write (leaving out 7–21 Oct, the Lightning Deal and its 14-day settle) with its share in 6–19 Sep, the last 14 days before the 20–30 Sep Best Deal; write the next price step only while the share stays at 70% or more of that pre-plan level, and undo the last step (end the walk) if it has fallen below 70% or the rank slipped more than 3 places (15% above rank 20); where the console reports no impression share, use top-of-search clicks divided by the season factor for the same comparison. Held terms lose 32 of their 191 orders in the central case (16%), almost all from the economic base cuts the order guard allows (3 from price). If the first held steps are undone, the forecast does not change: a step to the CPC paid is forecast to keep every click and save nothing, and the held saving ($644 of $802 a month) is the base cuts. Keeping the held bases instead: 206 orders a month at $693/wk (11.6%). The folded campaign's orders move to its owners and are not counted as lost; the Cal King and Twin pauses (3 orders) are.</w:t>
+        <w:t>Clicks at a placement are unchanged while the price stays at or above the CPC paid there (or today's price, where dynamic bidding pays above it); below it they fall with the price ratio in the best case, its square in the central case, and in the worst case to 10% once the price is under 70% of it. Held-term guard: before each write, compare the campaign's top-of-search impression share since the last write (leaving out 7–21 Oct, the Lightning Deal and its 14-day settle) with its share in 6–19 Sep, the last 14 days before the 20–30 Sep Best Deal; write the next price step only while the share stays at 70% or more of that pre-plan level, and undo the last step (end the walk) if it has fallen below 70% or the rank slipped more than 3 places (15% above rank 20); where the console reports no impression share, use top-of-search clicks divided by the season factor for the same comparison. Held terms lose 33 of their 191 orders in the central case (17%), almost all from the economic base cuts the order guard allows (5 from price). If the first held steps are undone, the forecast does not change: a step to the CPC paid is forecast to keep every click and save nothing, and the held saving ($652 of $810 a month) is the base cuts. Keeping the held bases instead: 204 orders a month at $690/wk (11.6%). The folded campaign's orders move to its owners and are not counted as lost; the Cal King and Twin pauses (3 orders) are.</w:t>
+      </w:r>
+    </w:p>
+    <w:p>
+      <w:pPr>
+        <w:pStyle w:val="Heading1"/>
+      </w:pPr>
+      <w:r>
+        <w:t>5c. Top of search first — what it changes, and where stock stops it</w:t>
+      </w:r>
+    </w:p>
+    <w:p>
+      <w:r>
+        <w:t>Owner instruction, 2 Oct: put Exact clicks on top of search, which converts best, while respecting stock and avoiding spend where inventory is thin. The plan already prices each placement from its own conversion — the serving child's contribution × that placement's conversion rate — so top of search, converting about 2.6× product pages, is allowed about that many times the price. On top of that, three things now favour it:</w:t>
+      </w:r>
+    </w:p>
+    <w:p>
+      <w:pPr>
+        <w:pStyle w:val="ListBullet"/>
+      </w:pPr>
+      <w:r>
+        <w:t>Top of search is not cut on held terms below the CPC paid (wave A 22 Oct, wave B 5 Nov); on the rest it steps to its own ceiling, which is the highest of the three placements.</w:t>
+      </w:r>
+    </w:p>
+    <w:p>
+      <w:pPr>
+        <w:pStyle w:val="ListBullet"/>
+      </w:pPr>
+      <w:r>
+        <w:t>Where the child is tier A with at least 90 days of confirmed cover, a top-of-search price under its ceiling rises to the ceiling, never past it (break-even, no premium): the two Full rows on Full Cool Grey, $1.18 → $1.38 on 22 Oct, and $0.53 → $1.38 in four steps. No other row qualifies: King White (57 days in hand, tier B) and Queen White (43 days, tier B) get no top-of-search raise: their held terms keep the CPC paid and their other rows step to the ceiling; Twin and Cal King are paused.</w:t>
+      </w:r>
+    </w:p>
+    <w:p>
+      <w:pPr>
+        <w:pStyle w:val="ListBullet"/>
+      </w:pPr>
+      <w:r>
+        <w:t>Product pages come down to what a product-page click earns, and both rest-of-search modifiers (20% and 50%) go to 0% on 2 Oct. Rest-of-search and off-Amazon clicks average $0.36, under every base bid, and cannot be priced separately from product pages (Amazon placement adjustments only raise a bid), so most of them remain.</w:t>
+      </w:r>
+    </w:p>
+    <w:tbl>
+      <w:tblPr>
+        <w:tblStyle w:val="TableGrid"/>
+        <w:tblW w:type="auto" w:w="0"/>
+        <w:tblLook w:firstColumn="1" w:firstRow="1" w:lastColumn="0" w:lastRow="0" w:noHBand="0" w:noVBand="1" w:val="04A0"/>
+      </w:tblPr>
+      <w:tblGrid>
+        <w:gridCol w:w="1994"/>
+        <w:gridCol w:w="1994"/>
+        <w:gridCol w:w="1994"/>
+        <w:gridCol w:w="1994"/>
+        <w:gridCol w:w="1994"/>
+      </w:tblGrid>
+      <w:tr>
+        <w:tc>
+          <w:tcPr>
+            <w:tcW w:type="dxa" w:w="1814"/>
+            <w:shd w:val="clear" w:color="auto" w:fill="1F3864"/>
+          </w:tcPr>
+          <w:p>
+            <w:r/>
+            <w:r>
+              <w:rPr>
+                <w:b/>
+                <w:color w:val="FFFFFF"/>
+                <w:sz w:val="14"/>
+              </w:rPr>
+              <w:t>Exact, per 30 days (central)</w:t>
+            </w:r>
+          </w:p>
+        </w:tc>
+        <w:tc>
+          <w:tcPr>
+            <w:tcW w:type="dxa" w:w="2608"/>
+            <w:shd w:val="clear" w:color="auto" w:fill="1F3864"/>
+          </w:tcPr>
+          <w:p>
+            <w:r/>
+            <w:r>
+              <w:rPr>
+                <w:b/>
+                <w:color w:val="FFFFFF"/>
+                <w:sz w:val="14"/>
+              </w:rPr>
+              <w:t>Clicks</w:t>
+            </w:r>
+          </w:p>
+        </w:tc>
+        <w:tc>
+          <w:tcPr>
+            <w:tcW w:type="dxa" w:w="2608"/>
+            <w:shd w:val="clear" w:color="auto" w:fill="1F3864"/>
+          </w:tcPr>
+          <w:p>
+            <w:r/>
+            <w:r>
+              <w:rPr>
+                <w:b/>
+                <w:color w:val="FFFFFF"/>
+                <w:sz w:val="14"/>
+              </w:rPr>
+              <w:t>Spend</w:t>
+            </w:r>
+          </w:p>
+        </w:tc>
+        <w:tc>
+          <w:tcPr>
+            <w:tcW w:type="dxa" w:w="1928"/>
+            <w:shd w:val="clear" w:color="auto" w:fill="1F3864"/>
+          </w:tcPr>
+          <w:p>
+            <w:r/>
+            <w:r>
+              <w:rPr>
+                <w:b/>
+                <w:color w:val="FFFFFF"/>
+                <w:sz w:val="14"/>
+              </w:rPr>
+              <w:t>Orders</w:t>
+            </w:r>
+          </w:p>
+        </w:tc>
+        <w:tc>
+          <w:tcPr>
+            <w:tcW w:type="dxa" w:w="1814"/>
+            <w:shd w:val="clear" w:color="auto" w:fill="1F3864"/>
+          </w:tcPr>
+          <w:p>
+            <w:r/>
+            <w:r>
+              <w:rPr>
+                <w:b/>
+                <w:color w:val="FFFFFF"/>
+                <w:sz w:val="14"/>
+              </w:rPr>
+              <w:t>Top-of-search share of clicks / spend / orders</w:t>
+            </w:r>
+          </w:p>
+        </w:tc>
+      </w:tr>
+      <w:tr>
+        <w:tc>
+          <w:tcPr>
+            <w:tcW w:type="dxa" w:w="1814"/>
+          </w:tcPr>
+          <w:p>
+            <w:r/>
+            <w:r>
+              <w:rPr>
+                <w:sz w:val="14"/>
+              </w:rPr>
+              <w:t>Last 30 days</w:t>
+            </w:r>
+          </w:p>
+        </w:tc>
+        <w:tc>
+          <w:tcPr>
+            <w:tcW w:type="dxa" w:w="2608"/>
+          </w:tcPr>
+          <w:p>
+            <w:r/>
+            <w:r>
+              <w:rPr>
+                <w:sz w:val="14"/>
+              </w:rPr>
+              <w:t>TOS 766 · PP 386 · other 960</w:t>
+            </w:r>
+          </w:p>
+        </w:tc>
+        <w:tc>
+          <w:tcPr>
+            <w:tcW w:type="dxa" w:w="2608"/>
+          </w:tcPr>
+          <w:p>
+            <w:r/>
+            <w:r>
+              <w:rPr>
+                <w:sz w:val="14"/>
+              </w:rPr>
+              <w:t>TOS $2,502 · PP $720 · other $363</w:t>
+            </w:r>
+          </w:p>
+        </w:tc>
+        <w:tc>
+          <w:tcPr>
+            <w:tcW w:type="dxa" w:w="1928"/>
+          </w:tcPr>
+          <w:p>
+            <w:r/>
+            <w:r>
+              <w:rPr>
+                <w:sz w:val="14"/>
+              </w:rPr>
+              <w:t>TOS 164 · PP 33 · other 18</w:t>
+            </w:r>
+          </w:p>
+        </w:tc>
+        <w:tc>
+          <w:tcPr>
+            <w:tcW w:type="dxa" w:w="1814"/>
+          </w:tcPr>
+          <w:p>
+            <w:r/>
+            <w:r>
+              <w:rPr>
+                <w:sz w:val="14"/>
+              </w:rPr>
+              <w:t>36.3% / 69.8% / 76.3%</w:t>
+            </w:r>
+          </w:p>
+        </w:tc>
+      </w:tr>
+      <w:tr>
+        <w:tc>
+          <w:tcPr>
+            <w:tcW w:type="dxa" w:w="1814"/>
+          </w:tcPr>
+          <w:p>
+            <w:r/>
+            <w:r>
+              <w:rPr>
+                <w:sz w:val="14"/>
+              </w:rPr>
+              <w:t>31 Dec</w:t>
+            </w:r>
+          </w:p>
+        </w:tc>
+        <w:tc>
+          <w:tcPr>
+            <w:tcW w:type="dxa" w:w="2608"/>
+          </w:tcPr>
+          <w:p>
+            <w:r/>
+            <w:r>
+              <w:rPr>
+                <w:sz w:val="14"/>
+              </w:rPr>
+              <w:t>TOS 743 · PP 107 · other 801</w:t>
+            </w:r>
+          </w:p>
+        </w:tc>
+        <w:tc>
+          <w:tcPr>
+            <w:tcW w:type="dxa" w:w="2608"/>
+          </w:tcPr>
+          <w:p>
+            <w:r/>
+            <w:r>
+              <w:rPr>
+                <w:sz w:val="14"/>
+              </w:rPr>
+              <w:t>TOS $2,413 · PP $116 · other $247</w:t>
+            </w:r>
+          </w:p>
+        </w:tc>
+        <w:tc>
+          <w:tcPr>
+            <w:tcW w:type="dxa" w:w="1928"/>
+          </w:tcPr>
+          <w:p>
+            <w:r/>
+            <w:r>
+              <w:rPr>
+                <w:sz w:val="14"/>
+              </w:rPr>
+              <w:t>TOS 158 · PP 8 · other 10</w:t>
+            </w:r>
+          </w:p>
+        </w:tc>
+        <w:tc>
+          <w:tcPr>
+            <w:tcW w:type="dxa" w:w="1814"/>
+          </w:tcPr>
+          <w:p>
+            <w:r/>
+            <w:r>
+              <w:rPr>
+                <w:sz w:val="14"/>
+              </w:rPr>
+              <w:t>45.0% / 86.9% / 89.6%</w:t>
+            </w:r>
+          </w:p>
+        </w:tc>
+      </w:tr>
+    </w:tbl>
+    <w:p/>
+    <w:p>
+      <w:r>
+        <w:t>Top of search keeps 97% of its clicks while product pages keep 28%: the spend that leaves is the dearer-per-order spend. Top of search cannot grow its click count from here without paying past its ceiling — the main Queen and King terms already pay $3–5 against ceilings of $1.50–2.90 — so more qualified top-of-search traffic comes from the rank the held terms keep, not from a higher bid. Per campaign: workbook tab TOS-first.</w:t>
       </w:r>
     </w:p>
     <w:p>
@@ -10771,7 +11097,7 @@
               <w:rPr>
                 <w:sz w:val="16"/>
               </w:rPr>
-              <w:t>$5,857</w:t>
+              <w:t>$5,840</w:t>
             </w:r>
           </w:p>
         </w:tc>
@@ -10785,7 +11111,7 @@
               <w:rPr>
                 <w:sz w:val="16"/>
               </w:rPr>
-              <w:t>$701</w:t>
+              <w:t>$697</w:t>
             </w:r>
           </w:p>
         </w:tc>
@@ -10799,7 +11125,7 @@
               <w:rPr>
                 <w:sz w:val="16"/>
               </w:rPr>
-              <w:t>12.0%</w:t>
+              <w:t>11.9%</w:t>
             </w:r>
           </w:p>
         </w:tc>
@@ -10843,7 +11169,7 @@
               <w:rPr>
                 <w:sz w:val="16"/>
               </w:rPr>
-              <w:t>$5,616</w:t>
+              <w:t>$5,606</w:t>
             </w:r>
           </w:p>
         </w:tc>
@@ -10857,7 +11183,7 @@
               <w:rPr>
                 <w:sz w:val="16"/>
               </w:rPr>
-              <w:t>$567</w:t>
+              <w:t>$566</w:t>
             </w:r>
           </w:p>
         </w:tc>
@@ -10885,7 +11211,7 @@
               <w:rPr>
                 <w:sz w:val="16"/>
               </w:rPr>
-              <w:t>$776</w:t>
+              <w:t>$775</w:t>
             </w:r>
           </w:p>
         </w:tc>
@@ -10915,7 +11241,7 @@
               <w:rPr>
                 <w:sz w:val="16"/>
               </w:rPr>
-              <w:t>$5,589</w:t>
+              <w:t>$5,553</w:t>
             </w:r>
           </w:p>
         </w:tc>
@@ -10929,7 +11255,7 @@
               <w:rPr>
                 <w:sz w:val="16"/>
               </w:rPr>
-              <w:t>$564</w:t>
+              <w:t>$557</w:t>
             </w:r>
           </w:p>
         </w:tc>
@@ -10943,7 +11269,7 @@
               <w:rPr>
                 <w:sz w:val="16"/>
               </w:rPr>
-              <w:t>10.1%</w:t>
+              <w:t>10.0%</w:t>
             </w:r>
           </w:p>
         </w:tc>
@@ -10957,7 +11283,7 @@
               <w:rPr>
                 <w:sz w:val="16"/>
               </w:rPr>
-              <w:t>$772</w:t>
+              <w:t>$770</w:t>
             </w:r>
           </w:p>
         </w:tc>
@@ -10987,7 +11313,7 @@
               <w:rPr>
                 <w:sz w:val="16"/>
               </w:rPr>
-              <w:t>$5,937</w:t>
+              <w:t>$5,933</w:t>
             </w:r>
           </w:p>
         </w:tc>
@@ -11001,7 +11327,7 @@
               <w:rPr>
                 <w:sz w:val="16"/>
               </w:rPr>
-              <w:t>$701</w:t>
+              <w:t>$697</w:t>
             </w:r>
           </w:p>
         </w:tc>
@@ -11015,7 +11341,7 @@
               <w:rPr>
                 <w:sz w:val="16"/>
               </w:rPr>
-              <w:t>11.8%</w:t>
+              <w:t>11.7%</w:t>
             </w:r>
           </w:p>
         </w:tc>
@@ -11029,7 +11355,7 @@
               <w:rPr>
                 <w:sz w:val="16"/>
               </w:rPr>
-              <w:t>$723</w:t>
+              <w:t>$726</w:t>
             </w:r>
           </w:p>
         </w:tc>
@@ -11059,7 +11385,7 @@
               <w:rPr>
                 <w:sz w:val="16"/>
               </w:rPr>
-              <w:t>$5,876</w:t>
+              <w:t>$5,874</w:t>
             </w:r>
           </w:p>
         </w:tc>
@@ -11073,7 +11399,7 @@
               <w:rPr>
                 <w:sz w:val="16"/>
               </w:rPr>
-              <w:t>$567</w:t>
+              <w:t>$566</w:t>
             </w:r>
           </w:p>
         </w:tc>
@@ -11131,7 +11457,7 @@
               <w:rPr>
                 <w:sz w:val="16"/>
               </w:rPr>
-              <w:t>−$348</w:t>
+              <w:t>−$358</w:t>
             </w:r>
           </w:p>
         </w:tc>
@@ -11145,7 +11471,7 @@
               <w:rPr>
                 <w:sz w:val="16"/>
               </w:rPr>
-              <w:t>−$175</w:t>
+              <w:t>−$176</w:t>
             </w:r>
           </w:p>
         </w:tc>
@@ -11172,7 +11498,7 @@
               <w:rPr>
                 <w:sz w:val="16"/>
               </w:rPr>
-              <w:t>+$87</w:t>
+              <w:t>+$86</w:t>
             </w:r>
           </w:p>
         </w:tc>
@@ -11202,7 +11528,7 @@
               <w:rPr>
                 <w:sz w:val="16"/>
               </w:rPr>
-              <w:t>−$88</w:t>
+              <w:t>−$90</w:t>
             </w:r>
           </w:p>
         </w:tc>
@@ -11216,7 +11542,7 @@
               <w:rPr>
                 <w:sz w:val="16"/>
               </w:rPr>
-              <w:t>−$175</w:t>
+              <w:t>−$176</w:t>
             </w:r>
           </w:p>
         </w:tc>
@@ -11627,6 +11953,50 @@
               <w:rPr>
                 <w:sz w:val="16"/>
               </w:rPr>
+              <w:t>Weekly</w:t>
+            </w:r>
+          </w:p>
+        </w:tc>
+        <w:tc>
+          <w:tcPr>
+            <w:tcW w:type="dxa" w:w="3118"/>
+          </w:tcPr>
+          <w:p>
+            <w:r/>
+            <w:r>
+              <w:rPr>
+                <w:sz w:val="16"/>
+              </w:rPr>
+              <w:t>Top-of-search share of Exact spend and orders (TOS-first)</w:t>
+            </w:r>
+          </w:p>
+        </w:tc>
+        <w:tc>
+          <w:tcPr>
+            <w:tcW w:type="dxa" w:w="5386"/>
+          </w:tcPr>
+          <w:p>
+            <w:r/>
+            <w:r>
+              <w:rPr>
+                <w:sz w:val="16"/>
+              </w:rPr>
+              <w:t>Under the path to 86.9% / 89.6% → check held top-of-search prices are still at the CPC paid and that no budget caps before evening</w:t>
+            </w:r>
+          </w:p>
+        </w:tc>
+      </w:tr>
+      <w:tr>
+        <w:tc>
+          <w:tcPr>
+            <w:tcW w:type="dxa" w:w="1701"/>
+          </w:tcPr>
+          <w:p>
+            <w:r/>
+            <w:r>
+              <w:rPr>
+                <w:sz w:val="16"/>
+              </w:rPr>
               <w:t>Daily</w:t>
             </w:r>
           </w:p>
@@ -11655,7 +12025,7 @@
               <w:rPr>
                 <w:sz w:val="16"/>
               </w:rPr>
-              <w:t>Under 14 days → back-up switch</w:t>
+              <w:t>Under 14 days → back-up switch; a child falling below tier A loses its top-of-search raise</w:t>
             </w:r>
           </w:p>
         </w:tc>
@@ -11807,7 +12177,7 @@
         <w:pStyle w:val="ListBullet"/>
       </w:pPr>
       <w:r>
-        <w:t>Spend level (review 1, decision 3): the plan's default lets what a click earns set spend — $567/wk at 31 Dec, 9.5% of last week's sales, $149–268/wk under the envelope. The alternative, keeping the held bases, spends $693/wk (11.6%) for 28 more Exact orders a month — about $23 each against $9.79 of contribution. Confirm the default or choose the alternative.</w:t>
+        <w:t>Spend level (review 1, decision 3): the plan's default lets what a click earns set spend — $566/wk at 31 Dec, 9.5% of last week's sales, $150–269/wk under the envelope. The alternative, keeping the held bases, spends $690/wk (11.6%) for 28 more Exact orders a month — about $23 each against $9.79 of contribution. Confirm the default or choose the alternative.</w:t>
       </w:r>
     </w:p>
     <w:p>
@@ -11959,7 +12329,7 @@
         <w:pStyle w:val="ListBullet"/>
       </w:pPr>
       <w:r>
-        <w:t>No top-of-search price rise and no bid rise anywhere (the $0.50 floor only stops a cut), and no budget raise.</w:t>
+        <w:t>No top-of-search price above its ceiling, no bid rise (the $0.50 floor only stops a cut), and no budget raise; the only top-of-search raises are the two Full rows, to their ceiling.</w:t>
       </w:r>
     </w:p>
     <w:p>
@@ -12056,6 +12426,20 @@
         <w:rPr>
           <w:b/>
         </w:rPr>
+        <w:t xml:space="preserve">Top of search first: </w:t>
+      </w:r>
+      <w:r>
+        <w:t>Exact top of search converts at 21.2% (8.3% on product pages) and is protected; it rises to its ceiling where stock is healthy (two Full rows); product pages and rest of search take the cuts. Top of search goes from 69.8% to 86.9% of Exact spend and from 76.3% to 89.6% of orders by 31 Dec (central).</w:t>
+      </w:r>
+    </w:p>
+    <w:p>
+      <w:pPr>
+        <w:pStyle w:val="ListBullet"/>
+      </w:pPr>
+      <w:r>
+        <w:rPr>
+          <w:b/>
+        </w:rPr>
         <w:t xml:space="preserve">Deal: </w:t>
       </w:r>
       <w:r>
@@ -12087,7 +12471,7 @@
         <w:t xml:space="preserve">Prices: </w:t>
       </w:r>
       <w:r>
-        <w:t>14 of 29 priced Exact rows pay above $3.22 today; the main Queen and King terms pay $3–5 against ceilings of $1.50–2.90. The 16 held page-one campaigns (held per keyword; 10 keywords pending a rank) take a first step to the CPC paid in two waves (22 Oct, 5 Nov) and walk further only after a read. The rest step to their ceilings. No price rises.</w:t>
+        <w:t>14 of 29 priced Exact rows pay above $3.22 today; the main Queen and King terms pay $3–5 against ceilings of $1.50–2.90. The 16 held page-one campaigns (held per keyword; 10 keywords pending a rank) take a first step to the CPC paid in two waves (22 Oct, 5 Nov) and walk further only after a read. The rest step to their ceilings; the two Full rows rise to theirs (TOS-first). No price goes past a ceiling.</w:t>
       </w:r>
     </w:p>
     <w:p>
@@ -12115,7 +12499,7 @@
         <w:t xml:space="preserve">Money: </w:t>
       </w:r>
       <w:r>
-        <w:t>expected spend (central) $701/wk after 2 Oct, $659 at 5 Nov and $567 at 31 Dec, against $742 last week, including a $169/wk rank-hold premium; Exact orders 224 → 178 a month (range 174–190).</w:t>
+        <w:t>expected spend (central) $697/wk after 2 Oct, $655 at 5 Nov and $566 at 31 Dec, against $742 last week, including a $169/wk rank-hold premium; Exact orders 224 → 177 a month (range 170–189).</w:t>
       </w:r>
     </w:p>
     <w:p>
@@ -26401,7 +26785,7 @@
               <w:rPr>
                 <w:sz w:val="14"/>
               </w:rPr>
-              <w:t>2 Oct rider bids 1 keyword(s) by their own bid; 22 Oct price $3.10; 5 Nov base bid $1.35; 19 Nov base bid $1.01; 3 Dec b</w:t>
+              <w:t>2 Oct rest-of-search modifier $0.00; 22 Oct price $3.10; 5 Nov base bid $1.35; 19 Nov base bid $1.01; 3 Dec base bid $0.</w:t>
             </w:r>
           </w:p>
         </w:tc>
@@ -26917,7 +27301,7 @@
               <w:rPr>
                 <w:sz w:val="14"/>
               </w:rPr>
-              <w:t>2 Oct child Full Cool Grey; 22 Oct base bid $0.89; 5 Nov base bid $0.67; 19 Nov base bid $0.54</w:t>
+              <w:t>2 Oct child Full Cool Grey; 22 Oct price $1.38; 5 Nov base bid $0.89; 19 Nov base bid $0.67; 3 Dec base bid $0.54</w:t>
             </w:r>
           </w:p>
         </w:tc>
@@ -27347,7 +27731,7 @@
               <w:rPr>
                 <w:sz w:val="14"/>
               </w:rPr>
-              <w:t>2 Oct child Full Cool Grey</w:t>
+              <w:t>2 Oct child Full Cool Grey; 22 Oct price $0.69; 5 Nov price $0.90; 19 Nov price $1.17; 3 Dec price $1.38</w:t>
             </w:r>
           </w:p>
         </w:tc>
@@ -27519,7 +27903,7 @@
               <w:rPr>
                 <w:sz w:val="14"/>
               </w:rPr>
-              <w:t>5 Nov price $3.40; 19 Nov base bid $1.42</w:t>
+              <w:t>2 Oct rest-of-search modifier $0.00; 5 Nov price $3.40; 19 Nov base bid $1.42</w:t>
             </w:r>
           </w:p>
         </w:tc>
@@ -35665,7 +36049,7 @@
               <w:rPr>
                 <w:sz w:val="14"/>
               </w:rPr>
-              <w:t>2 Oct rider bids 1 keyword(s) by their own bid; 22 Oct TOS $3.10; 5 Nov base bid $1.35; 19 Nov base bid $1.01; 3 Dec base bid $0.83</w:t>
+              <w:t>2 Oct rest-of-search modifier $0.00; 22 Oct TOS $3.10; 5 Nov base bid $1.35; 19 Nov base bid $1.01; 3 Dec base bid $0.83</w:t>
             </w:r>
           </w:p>
         </w:tc>
@@ -36129,7 +36513,7 @@
               <w:rPr>
                 <w:sz w:val="14"/>
               </w:rPr>
-              <w:t>5 Nov TOS $3.40; 19 Nov base bid $1.42</w:t>
+              <w:t>2 Oct rest-of-search modifier $0.00; 5 Nov TOS $3.40; 19 Nov base bid $1.42</w:t>
             </w:r>
           </w:p>
         </w:tc>
@@ -36489,7 +36873,7 @@
         <w:pStyle w:val="ListBullet"/>
       </w:pPr>
       <w:r>
-        <w:t>17 of 29 priced Exact campaigns step their top-of-search price down; 12 hold it (at or under the ceiling) and may still cut the base. 16 held page-one campaigns take a first step to the CPC paid (22 Oct, 5 Nov); 5 prices move on 2 Oct.</w:t>
+        <w:t>17 of 29 priced Exact campaigns step their top-of-search price down; 10 hold it (at or under the ceiling) and may still cut the base. 16 held page-one campaigns take a first step to the CPC paid (22 Oct, 5 Nov); 5 prices move on 2 Oct.</w:t>
       </w:r>
     </w:p>
     <w:p>
@@ -41361,7 +41745,7 @@
               <w:rPr>
                 <w:sz w:val="16"/>
               </w:rPr>
-              <w:t>$5,857</w:t>
+              <w:t>$5,840</w:t>
             </w:r>
           </w:p>
         </w:tc>
@@ -41375,7 +41759,7 @@
               <w:rPr>
                 <w:sz w:val="16"/>
               </w:rPr>
-              <w:t>$701</w:t>
+              <w:t>$697</w:t>
             </w:r>
           </w:p>
         </w:tc>
@@ -41389,7 +41773,7 @@
               <w:rPr>
                 <w:sz w:val="16"/>
               </w:rPr>
-              <w:t>12.0%</w:t>
+              <w:t>11.9%</w:t>
             </w:r>
           </w:p>
         </w:tc>
@@ -41447,7 +41831,7 @@
               <w:rPr>
                 <w:sz w:val="16"/>
               </w:rPr>
-              <w:t>$5,616</w:t>
+              <w:t>$5,606</w:t>
             </w:r>
           </w:p>
         </w:tc>
@@ -41461,7 +41845,7 @@
               <w:rPr>
                 <w:sz w:val="16"/>
               </w:rPr>
-              <w:t>$567</w:t>
+              <w:t>$566</w:t>
             </w:r>
           </w:p>
         </w:tc>
@@ -41489,7 +41873,7 @@
               <w:rPr>
                 <w:sz w:val="16"/>
               </w:rPr>
-              <w:t>$776</w:t>
+              <w:t>$775</w:t>
             </w:r>
           </w:p>
         </w:tc>
@@ -41503,7 +41887,7 @@
               <w:rPr>
                 <w:sz w:val="16"/>
               </w:rPr>
-              <w:t>+$87</w:t>
+              <w:t>+$86</w:t>
             </w:r>
           </w:p>
         </w:tc>
@@ -41533,7 +41917,7 @@
               <w:rPr>
                 <w:sz w:val="16"/>
               </w:rPr>
-              <w:t>$5,937</w:t>
+              <w:t>$5,933</w:t>
             </w:r>
           </w:p>
         </w:tc>
@@ -41547,7 +41931,7 @@
               <w:rPr>
                 <w:sz w:val="16"/>
               </w:rPr>
-              <w:t>$701</w:t>
+              <w:t>$697</w:t>
             </w:r>
           </w:p>
         </w:tc>
@@ -41561,7 +41945,7 @@
               <w:rPr>
                 <w:sz w:val="16"/>
               </w:rPr>
-              <w:t>11.8%</w:t>
+              <w:t>11.7%</w:t>
             </w:r>
           </w:p>
         </w:tc>
@@ -41575,7 +41959,7 @@
               <w:rPr>
                 <w:sz w:val="16"/>
               </w:rPr>
-              <w:t>$723</w:t>
+              <w:t>$726</w:t>
             </w:r>
           </w:p>
         </w:tc>
@@ -41589,7 +41973,7 @@
               <w:rPr>
                 <w:sz w:val="16"/>
               </w:rPr>
-              <w:t>+$34</w:t>
+              <w:t>+$37</w:t>
             </w:r>
           </w:p>
         </w:tc>
@@ -41619,7 +42003,7 @@
               <w:rPr>
                 <w:sz w:val="16"/>
               </w:rPr>
-              <w:t>$5,876</w:t>
+              <w:t>$5,874</w:t>
             </w:r>
           </w:p>
         </w:tc>
@@ -41633,7 +42017,7 @@
               <w:rPr>
                 <w:sz w:val="16"/>
               </w:rPr>
-              <w:t>$567</w:t>
+              <w:t>$566</w:t>
             </w:r>
           </w:p>
         </w:tc>
@@ -41861,7 +42245,7 @@
               <w:rPr>
                 <w:sz w:val="16"/>
               </w:rPr>
-              <w:t>677</w:t>
+              <w:t>673</w:t>
             </w:r>
           </w:p>
         </w:tc>
@@ -41875,7 +42259,7 @@
               <w:rPr>
                 <w:sz w:val="16"/>
               </w:rPr>
-              <w:t>635</w:t>
+              <w:t>631</w:t>
             </w:r>
           </w:p>
         </w:tc>
@@ -41889,7 +42273,7 @@
               <w:rPr>
                 <w:sz w:val="16"/>
               </w:rPr>
-              <w:t>543</w:t>
+              <w:t>542</w:t>
             </w:r>
           </w:p>
         </w:tc>
@@ -42373,7 +42757,7 @@
               <w:rPr>
                 <w:sz w:val="16"/>
               </w:rPr>
-              <w:t>701</w:t>
+              <w:t>697</w:t>
             </w:r>
           </w:p>
         </w:tc>
@@ -42387,7 +42771,7 @@
               <w:rPr>
                 <w:sz w:val="16"/>
               </w:rPr>
-              <w:t>659</w:t>
+              <w:t>655</w:t>
             </w:r>
           </w:p>
         </w:tc>
@@ -42401,7 +42785,7 @@
               <w:rPr>
                 <w:sz w:val="16"/>
               </w:rPr>
-              <w:t>567</w:t>
+              <w:t>566</w:t>
             </w:r>
           </w:p>
         </w:tc>
@@ -43041,7 +43425,7 @@
     <w:p/>
     <w:p>
       <w:r>
-        <w:t>Checks (E Checks): Sellerboard per-SKU units = family total, 1 Apr–30 Sep — PASS; Exact spend = plan rows (Command Center, 30 days) — PASS; Audit decisions reconciled — PASS; No top-of-search price rises — PASS; No bid rises anywhere — PASS; Non-held price paths end within 5% of their ceiling; held paths end where the guard stops them — PASS; First held step at the CPC paid (review 1) — PASS; Deal window (SOP-32): no write on any campaign 6–21 Oct — PASS; Rank-hold premium on the ceiling rate — PASS; One lever per write on held and re-pointed campaigns — PASS; Held rollout split across two dates (review 1) — PASS; Held test per keyword (review 1) — PASS; Rank coverage (review 1) — OPEN; Twin at the Cal King rule (review 1) — PASS; Held status read on every live keyword, either rank source (7-day medians) — PASS; Audit single-day ranks checked against 7-day medians — PASS; Non-held bases end within 5% of what a product-page click affords; held bases stop where the order guard binds — PASS; One stock clock; tiers and triggers on confirmed stock only — PASS; Held terms keep more of their delivery than the rest (central) — PASS; Rows priced on the plan child — PASS; No row advertises a child that loses money before ads — PASS; Spend envelope — PASS; Shipments: units reconcile; arrival not confirmed — OPEN; FC transfers dated — OPEN; Top-of-search impression share (guard metric) — OPEN.</w:t>
+        <w:t>Checks (E Checks): Sellerboard per-SKU units = family total, 1 Apr–30 Sep — PASS; Exact spend = plan rows (Command Center, 30 days) — PASS; Audit decisions reconciled — PASS; No top-of-search price above its ceiling; rises only to the ceiling on tier-A children (TOS-first) — PASS; TOS-first: top of search gains share of Exact spend and orders — PASS; No bid rises anywhere — PASS; Non-held price paths end within 5% of their ceiling; held paths end where the guard stops them — PASS; First held step at the CPC paid (review 1) — PASS; Deal window (SOP-32): no write on any campaign 6–21 Oct — PASS; Rank-hold premium on the ceiling rate — PASS; One lever per write on held and re-pointed campaigns — PASS; Held rollout split across two dates (review 1) — PASS; Held test per keyword (review 1) — PASS; Rank coverage (review 1) — OPEN; Twin at the Cal King rule (review 1) — PASS; Held status read on every live keyword, either rank source (7-day medians) — PASS; Audit single-day ranks checked against 7-day medians — PASS; Non-held bases end within 5% of what a product-page click affords; held bases stop where the order guard binds — PASS; One stock clock; tiers and triggers on confirmed stock only — PASS; Held terms keep more of their delivery than the rest (central) — PASS; Rows priced on the plan child — PASS; No row advertises a child that loses money before ads — PASS; Spend envelope — PASS; Shipments: units reconcile; arrival not confirmed — OPEN; FC transfers dated — OPEN; Top-of-search impression share (guard metric) — OPEN.</w:t>
       </w:r>
     </w:p>
     <w:p>

</xml_diff>

<commit_message>
SCFS final plan: one voice across the document and workbook
- Sections 2d/2e and the two fix tabs merged into one 'Key choices' section and tab, written as the plan's own choices with how each is checked
- Review tags removed from section 10, Owner decisions and E Checks; 'SCS4 rules applied' renamed 'Shared rules'

Co-Authored-By: Claude Opus 5.5 <noreply@anthropic.com>
Claude-Session: https://claude.ai/code/session_01LdWeCD4TJ4W4nS4vdsqjHm
</commit_message>
<xml_diff>
--- a/reviews/SCFS-20260929/SCFS_Final_Plan_20261002.docx
+++ b/reviews/SCFS-20260929/SCFS_Final_Plan_20261002.docx
@@ -12,7 +12,7 @@
     </w:p>
     <w:p>
       <w:r>
-        <w:t>2 October 2026 · Amazon US · parent B0F7M4DPM6, 65 SKUs with sales or stock (five sizes, 13 colours) · built from the same model as the action plan workbook (SCFS_Action_Plan_20261002.xlsx) and its evidence tabs · every rule the Cooling Sheets 4 Piece pack ended with after its three reviews is applied here (section 2c), and both reviews of this pack are applied (sections 2d and 2e): every count in this document and the workbook is read from one model, so the two cannot disagree.</w:t>
+        <w:t>2 October 2026 · Amazon US · parent B0F7M4DPM6, 65 SKUs with sales or stock (five sizes, 13 colours) · built from the same model as the action plan workbook (SCFS_Action_Plan_20261002.xlsx) and its evidence tabs · the rules it shares with the Cooling Sheets 4 Piece plan are listed in section 2c and its key choices in section 2d: every count in this document and the workbook is read from one model, so the two cannot disagree.</w:t>
       </w:r>
     </w:p>
     <w:p>
@@ -718,7 +718,7 @@
         <w:pStyle w:val="Heading1"/>
       </w:pPr>
       <w:r>
-        <w:t>2b. Reviewed against 'Bids and placements on Exact campaigns'</w:t>
+        <w:t>2b. Checked against the method 'Bids and placements on Exact campaigns'</w:t>
       </w:r>
     </w:p>
     <w:tbl>
@@ -1144,12 +1144,12 @@
         <w:pStyle w:val="Heading1"/>
       </w:pPr>
       <w:r>
-        <w:t>2c. The SCS4 review findings, applied here</w:t>
+        <w:t>2c. Rules shared with the Cooling Sheets 4 Piece plan</w:t>
       </w:r>
     </w:p>
     <w:p>
       <w:r>
-        <w:t>The Cooling Sheets 4 Piece pack went through three reviews (19 issues, 18 contradictions). Every rule it ended with is applied to this product; the workbook tab "SCS4 rules applied" lists them with this product's figures. One rule changes after this product's own review (2d): the first held step is the CPC paid, not 90% of it. What is new here: the deal window, the audit's single-day rank reads, keyword-level held status, unconfirmed shipments and the children that lose money before ads.</w:t>
+        <w:t>This plan prices, schedules and forecasts the same way as the Cooling Sheets 4 Piece plan; the workbook tab "Shared rules" lists each rule with this product's figures. One rule differs here (2d): the first held step is the CPC paid, not 90% of it. What this product adds: the deal window, the audit's single-day rank reads, keyword-level held status, unconfirmed shipments and the children that lose money before ads.</w:t>
       </w:r>
     </w:p>
     <w:tbl>
@@ -1509,7 +1509,7 @@
               <w:rPr>
                 <w:sz w:val="16"/>
               </w:rPr>
-              <w:t>Held steps — changed by review 1: the first step is the CPC paid, 90% steps only after a read; no −15% step on held terms</w:t>
+              <w:t>Held steps — here the first step is the CPC paid, 90% steps only after a read; no −15% step on held terms</w:t>
             </w:r>
           </w:p>
         </w:tc>
@@ -1565,12 +1565,12 @@
         <w:pStyle w:val="Heading1"/>
       </w:pPr>
       <w:r>
-        <w:t>2d. Review 1 (2 Oct): the corrections, and the acceptance checks</w:t>
+        <w:t>2d. The key choices in this plan, and how each is checked</w:t>
       </w:r>
     </w:p>
     <w:p>
       <w:r>
-        <w:t>Each reviewer figure was re-checked against the workbook rows or live Sellerboard before it was applied; all seven corrections hold. One reviewer reading was incomplete: the Full sibling costs came from the first inventory page only — 10 of the 13 Full colours are recorded at about $15.45 (Colour costs tab). The workbook tab 'Review 1 fixes' lists the seven smaller points as well.</w:t>
+        <w:t>Each choice below is made from the data in this pack; the right-hand column says how it is checked or what is still open. The owner decisions among them are in section 10, each with the plan's default.</w:t>
       </w:r>
     </w:p>
     <w:tbl>
@@ -1580,14 +1580,15 @@
         <w:tblLook w:firstColumn="1" w:firstRow="1" w:lastColumn="0" w:lastRow="0" w:noHBand="0" w:noVBand="1" w:val="04A0"/>
       </w:tblPr>
       <w:tblGrid>
-        <w:gridCol w:w="3324"/>
-        <w:gridCol w:w="3324"/>
-        <w:gridCol w:w="3324"/>
+        <w:gridCol w:w="2493"/>
+        <w:gridCol w:w="2493"/>
+        <w:gridCol w:w="2493"/>
+        <w:gridCol w:w="2493"/>
       </w:tblGrid>
       <w:tr>
         <w:tc>
           <w:tcPr>
-            <w:tcW w:type="dxa" w:w="454"/>
+            <w:tcW w:type="dxa" w:w="397"/>
             <w:shd w:val="clear" w:color="auto" w:fill="1F3864"/>
           </w:tcPr>
           <w:p>
@@ -1596,7 +1597,7 @@
               <w:rPr>
                 <w:b/>
                 <w:color w:val="FFFFFF"/>
-                <w:sz w:val="16"/>
+                <w:sz w:val="14"/>
               </w:rPr>
               <w:t>#</w:t>
             </w:r>
@@ -1604,7 +1605,7 @@
         </w:tc>
         <w:tc>
           <w:tcPr>
-            <w:tcW w:type="dxa" w:w="2948"/>
+            <w:tcW w:type="dxa" w:w="1701"/>
             <w:shd w:val="clear" w:color="auto" w:fill="1F3864"/>
           </w:tcPr>
           <w:p>
@@ -1613,15 +1614,15 @@
               <w:rPr>
                 <w:b/>
                 <w:color w:val="FFFFFF"/>
-                <w:sz w:val="16"/>
-              </w:rPr>
-              <w:t>Correction</w:t>
-            </w:r>
-          </w:p>
-        </w:tc>
-        <w:tc>
-          <w:tcPr>
-            <w:tcW w:type="dxa" w:w="6803"/>
+                <w:sz w:val="14"/>
+              </w:rPr>
+              <w:t>Choice</w:t>
+            </w:r>
+          </w:p>
+        </w:tc>
+        <w:tc>
+          <w:tcPr>
+            <w:tcW w:type="dxa" w:w="6406"/>
             <w:shd w:val="clear" w:color="auto" w:fill="1F3864"/>
           </w:tcPr>
           <w:p>
@@ -1630,9 +1631,26 @@
               <w:rPr>
                 <w:b/>
                 <w:color w:val="FFFFFF"/>
-                <w:sz w:val="16"/>
-              </w:rPr>
-              <w:t>What this version does</w:t>
+                <w:sz w:val="14"/>
+              </w:rPr>
+              <w:t>What the plan does</w:t>
+            </w:r>
+          </w:p>
+        </w:tc>
+        <w:tc>
+          <w:tcPr>
+            <w:tcW w:type="dxa" w:w="1701"/>
+            <w:shd w:val="clear" w:color="auto" w:fill="1F3864"/>
+          </w:tcPr>
+          <w:p>
+            <w:r/>
+            <w:r>
+              <w:rPr>
+                <w:b/>
+                <w:color w:val="FFFFFF"/>
+                <w:sz w:val="14"/>
+              </w:rPr>
+              <w:t>Check</w:t>
             </w:r>
           </w:p>
         </w:tc>
@@ -1640,13 +1658,13 @@
       <w:tr>
         <w:tc>
           <w:tcPr>
-            <w:tcW w:type="dxa" w:w="454"/>
-          </w:tcPr>
-          <w:p>
-            <w:r/>
-            <w:r>
-              <w:rPr>
-                <w:sz w:val="16"/>
+            <w:tcW w:type="dxa" w:w="397"/>
+          </w:tcPr>
+          <w:p>
+            <w:r/>
+            <w:r>
+              <w:rPr>
+                <w:sz w:val="14"/>
               </w:rPr>
               <w:t>1</w:t>
             </w:r>
@@ -1654,29 +1672,43 @@
         </w:tc>
         <w:tc>
           <w:tcPr>
-            <w:tcW w:type="dxa" w:w="2948"/>
-          </w:tcPr>
-          <w:p>
-            <w:r/>
-            <w:r>
-              <w:rPr>
-                <w:sz w:val="16"/>
-              </w:rPr>
-              <w:t>First held step below what the auctions clear at</w:t>
-            </w:r>
-          </w:p>
-        </w:tc>
-        <w:tc>
-          <w:tcPr>
-            <w:tcW w:type="dxa" w:w="6803"/>
-          </w:tcPr>
-          <w:p>
-            <w:r/>
-            <w:r>
-              <w:rPr>
-                <w:sz w:val="16"/>
-              </w:rPr>
-              <w:t>First step = the CPC paid; a 90% step on today's prices could keep at most 45–84% of the clicks. Wave A 2 campaigns 22 Oct, wave B 4 on 5 Nov; further 90% steps only after a read. The step can keep up to every click, not every click: wave A cases in section 5b (review 2).</w:t>
+            <w:tcW w:type="dxa" w:w="1701"/>
+          </w:tcPr>
+          <w:p>
+            <w:r/>
+            <w:r>
+              <w:rPr>
+                <w:sz w:val="14"/>
+              </w:rPr>
+              <w:t>The first held price step</w:t>
+            </w:r>
+          </w:p>
+        </w:tc>
+        <w:tc>
+          <w:tcPr>
+            <w:tcW w:type="dxa" w:w="6406"/>
+          </w:tcPr>
+          <w:p>
+            <w:r/>
+            <w:r>
+              <w:rPr>
+                <w:sz w:val="14"/>
+              </w:rPr>
+              <w:t>The first step on a held page-one term is the CPC paid itself, never under it: a step to 90% of the CPC paid on today's prices could keep at most 45–84% of the clicks. The step is checked on each held keyword's own price (bid × (1 + modifier)), not on the campaign base. Where a held keyword's bid sits under the base, a step on the campaign would take it under the CPC paid ('cooling fitted sheet queen' $4.11 → $3.36 (85% of the CPC paid); 'cooling fitted sheet king' $3.63 → $3.07 (87% of the CPC paid); 'king size fitted sheet cooling' $1.65 → $1.41 (39% of the CPC paid); 'king size cooling fitted sheet' $3.50 → $2.89 (92% of the CPC paid); 'king fitted sheet only cooling' $3.99 → $2.79 (73% of the CPC paid); 'queen size fitted sheet only cooling' $3.19 → $2.84 (94% of the CPC paid)), so those 6 campaigns keep their modifier and the held keyword's bid, and only riders step (2 of them have riders; in the other 4 every keyword is held and no top-of-search price moves). 'king size fitted sheet cooling' sits far under its campaign's CPC: its own clicks and CPC are read in the console before any step. Further steps (90% of the new CPC paid) only after a read.</w:t>
+            </w:r>
+          </w:p>
+        </w:tc>
+        <w:tc>
+          <w:tcPr>
+            <w:tcW w:type="dxa" w:w="1701"/>
+          </w:tcPr>
+          <w:p>
+            <w:r/>
+            <w:r>
+              <w:rPr>
+                <w:sz w:val="14"/>
+              </w:rPr>
+              <w:t>Lowest held keyword after a step: 100% of the CPC paid</w:t>
             </w:r>
           </w:p>
         </w:tc>
@@ -1684,13 +1716,13 @@
       <w:tr>
         <w:tc>
           <w:tcPr>
-            <w:tcW w:type="dxa" w:w="454"/>
-          </w:tcPr>
-          <w:p>
-            <w:r/>
-            <w:r>
-              <w:rPr>
-                <w:sz w:val="16"/>
+            <w:tcW w:type="dxa" w:w="397"/>
+          </w:tcPr>
+          <w:p>
+            <w:r/>
+            <w:r>
+              <w:rPr>
+                <w:sz w:val="14"/>
               </w:rPr>
               <w:t>2</w:t>
             </w:r>
@@ -1698,29 +1730,43 @@
         </w:tc>
         <w:tc>
           <w:tcPr>
-            <w:tcW w:type="dxa" w:w="2948"/>
-          </w:tcPr>
-          <w:p>
-            <w:r/>
-            <w:r>
-              <w:rPr>
-                <w:sz w:val="16"/>
-              </w:rPr>
-              <w:t>Held status decided on 17 of 53 Exact keywords</w:t>
-            </w:r>
-          </w:p>
-        </w:tc>
-        <w:tc>
-          <w:tcPr>
-            <w:tcW w:type="dxa" w:w="6803"/>
-          </w:tcPr>
-          <w:p>
-            <w:r/>
-            <w:r>
-              <w:rPr>
-                <w:sz w:val="16"/>
-              </w:rPr>
-              <w:t>Confirmed: no tracker (Command Center, Data Dive, ASINsight) covers the other 36. Held is read per keyword; untracked keywords with ≥5 September orders are held pending a rank (10); 4 riders priced by their own bid on 2 Oct; keyword-level bids in T3k; trackers to add listed (owner).</w:t>
+            <w:tcW w:type="dxa" w:w="1701"/>
+          </w:tcPr>
+          <w:p>
+            <w:r/>
+            <w:r>
+              <w:rPr>
+                <w:sz w:val="14"/>
+              </w:rPr>
+              <w:t>Two waves, and what the first step can cost</w:t>
+            </w:r>
+          </w:p>
+        </w:tc>
+        <w:tc>
+          <w:tcPr>
+            <w:tcW w:type="dxa" w:w="6406"/>
+          </w:tcPr>
+          <w:p>
+            <w:r/>
+            <w:r>
+              <w:rPr>
+                <w:sz w:val="14"/>
+              </w:rPr>
+              <w:t>Wave A (2 campaigns: 'cooling fitted sheet', 'cooling king fitted sheet') steps on 22 Oct, wave B (4) on 5 Nov. The CPC paid is an average, so a step to it can keep up to every click, not every click: for wave A (46 of 191 held orders) keeps every top-of-search click (the most it can keep): $743 and 40 orders a month; top-of-search clicks −25%: $586 and 32 orders a month; top-of-search clicks −50%: $429 and 24 orders a month. 5 Nov read, before wave B: wave B steps only if every wave A held keyword keeps at least 85% of its 6–19 Sep top-of-search impression share (keyword rows; 2–6 Oct where the keyword share is not reported) and its rank has not slipped more than 3 places. Between 70% and 85% the wave A step is kept but wave B waits one read (19 Nov); under 70% the wave A step is undone and wave B does not step this season.</w:t>
+            </w:r>
+          </w:p>
+        </w:tc>
+        <w:tc>
+          <w:tcPr>
+            <w:tcW w:type="dxa" w:w="1701"/>
+          </w:tcPr>
+          <w:p>
+            <w:r/>
+            <w:r>
+              <w:rPr>
+                <w:sz w:val="14"/>
+              </w:rPr>
+              <w:t>Cases and stop rule stated</w:t>
             </w:r>
           </w:p>
         </w:tc>
@@ -1728,13 +1774,13 @@
       <w:tr>
         <w:tc>
           <w:tcPr>
-            <w:tcW w:type="dxa" w:w="454"/>
-          </w:tcPr>
-          <w:p>
-            <w:r/>
-            <w:r>
-              <w:rPr>
-                <w:sz w:val="16"/>
+            <w:tcW w:type="dxa" w:w="397"/>
+          </w:tcPr>
+          <w:p>
+            <w:r/>
+            <w:r>
+              <w:rPr>
+                <w:sz w:val="14"/>
               </w:rPr>
               <w:t>3</w:t>
             </w:r>
@@ -1742,29 +1788,43 @@
         </w:tc>
         <w:tc>
           <w:tcPr>
-            <w:tcW w:type="dxa" w:w="2948"/>
-          </w:tcPr>
-          <w:p>
-            <w:r/>
-            <w:r>
-              <w:rPr>
-                <w:sz w:val="16"/>
-              </w:rPr>
-              <w:t>Premium list named the wrong keyword</w:t>
-            </w:r>
-          </w:p>
-        </w:tc>
-        <w:tc>
-          <w:tcPr>
-            <w:tcW w:type="dxa" w:w="6803"/>
-          </w:tcPr>
-          <w:p>
-            <w:r/>
-            <w:r>
-              <w:rPr>
-                <w:sz w:val="16"/>
-              </w:rPr>
-              <w:t>Every premium row is labelled by its held term and campaign ID.</w:t>
+            <w:tcW w:type="dxa" w:w="1701"/>
+          </w:tcPr>
+          <w:p>
+            <w:r/>
+            <w:r>
+              <w:rPr>
+                <w:sz w:val="14"/>
+              </w:rPr>
+              <w:t>The guard</w:t>
+            </w:r>
+          </w:p>
+        </w:tc>
+        <w:tc>
+          <w:tcPr>
+            <w:tcW w:type="dxa" w:w="6406"/>
+          </w:tcPr>
+          <w:p>
+            <w:r/>
+            <w:r>
+              <w:rPr>
+                <w:sz w:val="14"/>
+              </w:rPr>
+              <w:t>The guard reads each held keyword's own top-of-search impression share (keyword rows of the targeting report) since the last write against 6–19 Sep, the 14 days before the Best Deal, leaving out 7–21 Oct; 70% or more keeps the walk going, under 70% undoes the last step. Where a keyword share is not reported, only periods after 2 Oct are compared (2–6 Oct for wave A, 22 Oct–4 Nov for wave B), so the keyword set is the same on both sides; then top-of-search clicks ÷ the season factor.</w:t>
+            </w:r>
+          </w:p>
+        </w:tc>
+        <w:tc>
+          <w:tcPr>
+            <w:tcW w:type="dxa" w:w="1701"/>
+          </w:tcPr>
+          <w:p>
+            <w:r/>
+            <w:r>
+              <w:rPr>
+                <w:sz w:val="14"/>
+              </w:rPr>
+              <w:t>25 held keyword rows to read</w:t>
             </w:r>
           </w:p>
         </w:tc>
@@ -1772,13 +1832,13 @@
       <w:tr>
         <w:tc>
           <w:tcPr>
-            <w:tcW w:type="dxa" w:w="454"/>
-          </w:tcPr>
-          <w:p>
-            <w:r/>
-            <w:r>
-              <w:rPr>
-                <w:sz w:val="16"/>
+            <w:tcW w:type="dxa" w:w="397"/>
+          </w:tcPr>
+          <w:p>
+            <w:r/>
+            <w:r>
+              <w:rPr>
+                <w:sz w:val="14"/>
               </w:rPr>
               <w:t>4</w:t>
             </w:r>
@@ -1786,29 +1846,43 @@
         </w:tc>
         <w:tc>
           <w:tcPr>
-            <w:tcW w:type="dxa" w:w="2948"/>
-          </w:tcPr>
-          <w:p>
-            <w:r/>
-            <w:r>
-              <w:rPr>
-                <w:sz w:val="16"/>
-              </w:rPr>
-              <w:t>16 Oct arrivals not confirmed</w:t>
-            </w:r>
-          </w:p>
-        </w:tc>
-        <w:tc>
-          <w:tcPr>
-            <w:tcW w:type="dxa" w:w="6803"/>
-          </w:tcPr>
-          <w:p>
-            <w:r/>
-            <w:r>
-              <w:rPr>
-                <w:sz w:val="16"/>
-              </w:rPr>
-              <w:t>Confirmed: 1,884 units 'ready to ship', 15 receiving. Tiers, triggers and run-outs now count only confirmed stock; shipment status per line in Stock &amp; reorder; the check reads OPEN.</w:t>
+            <w:tcW w:type="dxa" w:w="1701"/>
+          </w:tcPr>
+          <w:p>
+            <w:r/>
+            <w:r>
+              <w:rPr>
+                <w:sz w:val="14"/>
+              </w:rPr>
+              <w:t>Held status, keyword by keyword</w:t>
+            </w:r>
+          </w:p>
+        </w:tc>
+        <w:tc>
+          <w:tcPr>
+            <w:tcW w:type="dxa" w:w="6406"/>
+          </w:tcPr>
+          <w:p>
+            <w:r/>
+            <w:r>
+              <w:rPr>
+                <w:sz w:val="14"/>
+              </w:rPr>
+              <w:t>Only 17 of 53 Exact keywords have a rank in any source; the other 36 carry $1,985 and 136 orders. A keyword is held when it ranks ≤20 on Command Center or Data Dive (7-day medians), or, with no tracker, took ≥5 orders in September (10 terms on 11 keyword rows ('cool fitted sheet king' sits in two campaigns), held pending a rank). 4 riders above the ceiling step by their own bid on 2 Oct.</w:t>
+            </w:r>
+          </w:p>
+        </w:tc>
+        <w:tc>
+          <w:tcPr>
+            <w:tcW w:type="dxa" w:w="1701"/>
+          </w:tcPr>
+          <w:p>
+            <w:r/>
+            <w:r>
+              <w:rPr>
+                <w:sz w:val="14"/>
+              </w:rPr>
+              <w:t>Open: the owner adds the trackers before 22 Oct</w:t>
             </w:r>
           </w:p>
         </w:tc>
@@ -1816,13 +1890,13 @@
       <w:tr>
         <w:tc>
           <w:tcPr>
-            <w:tcW w:type="dxa" w:w="454"/>
-          </w:tcPr>
-          <w:p>
-            <w:r/>
-            <w:r>
-              <w:rPr>
-                <w:sz w:val="16"/>
+            <w:tcW w:type="dxa" w:w="397"/>
+          </w:tcPr>
+          <w:p>
+            <w:r/>
+            <w:r>
+              <w:rPr>
+                <w:sz w:val="14"/>
               </w:rPr>
               <w:t>5</w:t>
             </w:r>
@@ -1830,29 +1904,43 @@
         </w:tc>
         <w:tc>
           <w:tcPr>
-            <w:tcW w:type="dxa" w:w="2948"/>
-          </w:tcPr>
-          <w:p>
-            <w:r/>
-            <w:r>
-              <w:rPr>
-                <w:sz w:val="16"/>
-              </w:rPr>
-              <w:t>Twin campaigns armed at $5.18 and $3.80</w:t>
-            </w:r>
-          </w:p>
-        </w:tc>
-        <w:tc>
-          <w:tcPr>
-            <w:tcW w:type="dxa" w:w="6803"/>
-          </w:tcPr>
-          <w:p>
-            <w:r/>
-            <w:r>
-              <w:rPr>
-                <w:sz w:val="16"/>
-              </w:rPr>
-              <w:t>Both pause on 2 Oct by the Cal King rule.</w:t>
+            <w:tcW w:type="dxa" w:w="1701"/>
+          </w:tcPr>
+          <w:p>
+            <w:r/>
+            <w:r>
+              <w:rPr>
+                <w:sz w:val="14"/>
+              </w:rPr>
+              <w:t>Top of search first, campaign by campaign</w:t>
+            </w:r>
+          </w:p>
+        </w:tc>
+        <w:tc>
+          <w:tcPr>
+            <w:tcW w:type="dxa" w:w="6406"/>
+          </w:tcPr>
+          <w:p>
+            <w:r/>
+            <w:r>
+              <w:rPr>
+                <w:sz w:val="14"/>
+              </w:rPr>
+              <w:t>Exact top of search converts best on the product average, so it is held for rank and product pages and rest of search take the cuts. The comparison is made per campaign wherever a placement has 50 or more clicks, the product average only below that: 'cooling fitted sheet' keeps its 20% rest-of-search modifier ($14.96 an order there against $20.62 at top of search); the other rest-of-search cut stands. Product pages are priced on the campaign's own conversion from 50 clicks: 'cooling fitted sheet' 101 clicks, 10.89% → $1.17; 'cool fitted sheet queen' 93 clicks, 6.45% → $0.69; 'cool fitted sheet king' 59 clicks, 8.47% → $0.76.</w:t>
+            </w:r>
+          </w:p>
+        </w:tc>
+        <w:tc>
+          <w:tcPr>
+            <w:tcW w:type="dxa" w:w="1701"/>
+          </w:tcPr>
+          <w:p>
+            <w:r/>
+            <w:r>
+              <w:rPr>
+                <w:sz w:val="14"/>
+              </w:rPr>
+              <w:t>Owner decision: per campaign (default) or product-wide</w:t>
             </w:r>
           </w:p>
         </w:tc>
@@ -1860,13 +1948,13 @@
       <w:tr>
         <w:tc>
           <w:tcPr>
-            <w:tcW w:type="dxa" w:w="454"/>
-          </w:tcPr>
-          <w:p>
-            <w:r/>
-            <w:r>
-              <w:rPr>
-                <w:sz w:val="16"/>
+            <w:tcW w:type="dxa" w:w="397"/>
+          </w:tcPr>
+          <w:p>
+            <w:r/>
+            <w:r>
+              <w:rPr>
+                <w:sz w:val="14"/>
               </w:rPr>
               <w:t>6</w:t>
             </w:r>
@@ -1874,29 +1962,43 @@
         </w:tc>
         <w:tc>
           <w:tcPr>
-            <w:tcW w:type="dxa" w:w="2948"/>
-          </w:tcPr>
-          <w:p>
-            <w:r/>
-            <w:r>
-              <w:rPr>
-                <w:sz w:val="16"/>
-              </w:rPr>
-              <w:t>No stated cause for the loss-making colours</w:t>
-            </w:r>
-          </w:p>
-        </w:tc>
-        <w:tc>
-          <w:tcPr>
-            <w:tcW w:type="dxa" w:w="6803"/>
-          </w:tcPr>
-          <w:p>
-            <w:r/>
-            <w:r>
-              <w:rPr>
-                <w:sz w:val="16"/>
-              </w:rPr>
-              <w:t>Recorded cost, the size's usual cost, standard and realised price, and contribution three ways per colour; Queen Cool Blue's pace marked clearance demand; the Full move restated (it stands).</w:t>
+            <w:tcW w:type="dxa" w:w="1701"/>
+          </w:tcPr>
+          <w:p>
+            <w:r/>
+            <w:r>
+              <w:rPr>
+                <w:sz w:val="14"/>
+              </w:rPr>
+              <w:t>The two Full raises</w:t>
+            </w:r>
+          </w:p>
+        </w:tc>
+        <w:tc>
+          <w:tcPr>
+            <w:tcW w:type="dxa" w:w="6406"/>
+          </w:tcPr>
+          <w:p>
+            <w:r/>
+            <w:r>
+              <w:rPr>
+                <w:sz w:val="14"/>
+              </w:rPr>
+              <w:t>'full size cooling fitted sheet' at $1.18; 'cooling fitted sheet full size' at $0.53 would rise to the $1.38 ceiling on Full Cool Grey (tier A). That ceiling rests on an $11.49 cost record where 10 of 13 Full colours carry about $15.45; at $15.45 the unit earns $4.19, top of search affords $0.71 and product pages $0.28, under the $0.50 floor. Both raises wait for the cost to be checked against the supplier invoice: $11.49 confirmed → they start on the write after the first conversion read on Full Cool Grey; $15.45 → no raise, the Full ceiling is re-solved and the no-margin test re-run. No price rises before then.</w:t>
+            </w:r>
+          </w:p>
+        </w:tc>
+        <w:tc>
+          <w:tcPr>
+            <w:tcW w:type="dxa" w:w="1701"/>
+          </w:tcPr>
+          <w:p>
+            <w:r/>
+            <w:r>
+              <w:rPr>
+                <w:sz w:val="14"/>
+              </w:rPr>
+              <w:t>No raise dated before the check</w:t>
             </w:r>
           </w:p>
         </w:tc>
@@ -1904,13 +2006,13 @@
       <w:tr>
         <w:tc>
           <w:tcPr>
-            <w:tcW w:type="dxa" w:w="454"/>
-          </w:tcPr>
-          <w:p>
-            <w:r/>
-            <w:r>
-              <w:rPr>
-                <w:sz w:val="16"/>
+            <w:tcW w:type="dxa" w:w="397"/>
+          </w:tcPr>
+          <w:p>
+            <w:r/>
+            <w:r>
+              <w:rPr>
+                <w:sz w:val="14"/>
               </w:rPr>
               <w:t>7</w:t>
             </w:r>
@@ -1918,77 +2020,43 @@
         </w:tc>
         <w:tc>
           <w:tcPr>
-            <w:tcW w:type="dxa" w:w="2948"/>
-          </w:tcPr>
-          <w:p>
-            <w:r/>
-            <w:r>
-              <w:rPr>
-                <w:sz w:val="16"/>
-              </w:rPr>
-              <w:t>Plan ends near 8% TACoS against a 12–14% envelope</w:t>
-            </w:r>
-          </w:p>
-        </w:tc>
-        <w:tc>
-          <w:tcPr>
-            <w:tcW w:type="dxa" w:w="6803"/>
-          </w:tcPr>
-          <w:p>
-            <w:r/>
-            <w:r>
-              <w:rPr>
-                <w:sz w:val="16"/>
-              </w:rPr>
-              <w:t>The rule is stated: spend is set by what a click earns, the envelope is an upper limit. The plan now ends at 9.7%; keeping held bases instead is priced (section 10).</w:t>
-            </w:r>
-          </w:p>
-        </w:tc>
-      </w:tr>
-    </w:tbl>
-    <w:p/>
-    <w:tbl>
-      <w:tblPr>
-        <w:tblStyle w:val="TableGrid"/>
-        <w:tblW w:type="auto" w:w="0"/>
-        <w:tblLook w:firstColumn="1" w:firstRow="1" w:lastColumn="0" w:lastRow="0" w:noHBand="0" w:noVBand="1" w:val="04A0"/>
-      </w:tblPr>
-      <w:tblGrid>
-        <w:gridCol w:w="4986"/>
-        <w:gridCol w:w="4986"/>
-      </w:tblGrid>
-      <w:tr>
-        <w:tc>
-          <w:tcPr>
-            <w:tcW w:type="dxa" w:w="5102"/>
-            <w:shd w:val="clear" w:color="auto" w:fill="1F3864"/>
-          </w:tcPr>
-          <w:p>
-            <w:r/>
-            <w:r>
-              <w:rPr>
-                <w:b/>
-                <w:color w:val="FFFFFF"/>
-                <w:sz w:val="16"/>
-              </w:rPr>
-              <w:t>Acceptance check (review 1)</w:t>
-            </w:r>
-          </w:p>
-        </w:tc>
-        <w:tc>
-          <w:tcPr>
-            <w:tcW w:type="dxa" w:w="5102"/>
-            <w:shd w:val="clear" w:color="auto" w:fill="1F3864"/>
-          </w:tcPr>
-          <w:p>
-            <w:r/>
-            <w:r>
-              <w:rPr>
-                <w:b/>
-                <w:color w:val="FFFFFF"/>
-                <w:sz w:val="16"/>
-              </w:rPr>
-              <w:t>State</w:t>
+            <w:tcW w:type="dxa" w:w="1701"/>
+          </w:tcPr>
+          <w:p>
+            <w:r/>
+            <w:r>
+              <w:rPr>
+                <w:sz w:val="14"/>
+              </w:rPr>
+              <w:t>Stock: confirmed arrivals only</w:t>
+            </w:r>
+          </w:p>
+        </w:tc>
+        <w:tc>
+          <w:tcPr>
+            <w:tcW w:type="dxa" w:w="6406"/>
+          </w:tcPr>
+          <w:p>
+            <w:r/>
+            <w:r>
+              <w:rPr>
+                <w:sz w:val="14"/>
+              </w:rPr>
+              <w:t>Tiers, triggers and run-outs count stock in hand, FC transfers (1,178) and the 15 units Amazon is receiving. The 1,884 units on August–October shipments Sellerboard shows 'ready to ship' count for reorders only until the forwarder confirms them; Stock &amp; reorder shows the confirmed run-out date beside the date if every shipment lands. Full White's 468 units are a planned PO due 25 Jan 2027, not a shipment.</w:t>
+            </w:r>
+          </w:p>
+        </w:tc>
+        <w:tc>
+          <w:tcPr>
+            <w:tcW w:type="dxa" w:w="1701"/>
+          </w:tcPr>
+          <w:p>
+            <w:r/>
+            <w:r>
+              <w:rPr>
+                <w:sz w:val="14"/>
+              </w:rPr>
+              <w:t>Open: the forwarder confirms the shipments</w:t>
             </w:r>
           </w:p>
         </w:tc>
@@ -1996,29 +2064,57 @@
       <w:tr>
         <w:tc>
           <w:tcPr>
-            <w:tcW w:type="dxa" w:w="5102"/>
-          </w:tcPr>
-          <w:p>
-            <w:r/>
-            <w:r>
-              <w:rPr>
-                <w:sz w:val="16"/>
-              </w:rPr>
-              <w:t>No held row's first price below its CPC paid</w:t>
-            </w:r>
-          </w:p>
-        </w:tc>
-        <w:tc>
-          <w:tcPr>
-            <w:tcW w:type="dxa" w:w="5102"/>
-          </w:tcPr>
-          <w:p>
-            <w:r/>
-            <w:r>
-              <w:rPr>
-                <w:sz w:val="16"/>
-              </w:rPr>
-              <w:t>Met, now on each held keyword's own price (review 2): lowest 100%</w:t>
+            <w:tcW w:type="dxa" w:w="397"/>
+          </w:tcPr>
+          <w:p>
+            <w:r/>
+            <w:r>
+              <w:rPr>
+                <w:sz w:val="14"/>
+              </w:rPr>
+              <w:t>8</w:t>
+            </w:r>
+          </w:p>
+        </w:tc>
+        <w:tc>
+          <w:tcPr>
+            <w:tcW w:type="dxa" w:w="1701"/>
+          </w:tcPr>
+          <w:p>
+            <w:r/>
+            <w:r>
+              <w:rPr>
+                <w:sz w:val="14"/>
+              </w:rPr>
+              <w:t>Twin and Cal King</w:t>
+            </w:r>
+          </w:p>
+        </w:tc>
+        <w:tc>
+          <w:tcPr>
+            <w:tcW w:type="dxa" w:w="6406"/>
+          </w:tcPr>
+          <w:p>
+            <w:r/>
+            <w:r>
+              <w:rPr>
+                <w:sz w:val="14"/>
+              </w:rPr>
+              <w:t>Paused on 2 Oct for no margin: product pages afford under half the $0.50 base floor (Twin $0.24). Neither restarts by itself when stock lands.</w:t>
+            </w:r>
+          </w:p>
+        </w:tc>
+        <w:tc>
+          <w:tcPr>
+            <w:tcW w:type="dxa" w:w="1701"/>
+          </w:tcPr>
+          <w:p>
+            <w:r/>
+            <w:r>
+              <w:rPr>
+                <w:sz w:val="14"/>
+              </w:rPr>
+              <w:t>Paused</w:t>
             </w:r>
           </w:p>
         </w:tc>
@@ -2026,29 +2122,57 @@
       <w:tr>
         <w:tc>
           <w:tcPr>
-            <w:tcW w:type="dxa" w:w="5102"/>
-          </w:tcPr>
-          <w:p>
-            <w:r/>
-            <w:r>
-              <w:rPr>
-                <w:sz w:val="16"/>
-              </w:rPr>
-              <w:t>Held campaigns split across at least two write dates</w:t>
-            </w:r>
-          </w:p>
-        </w:tc>
-        <w:tc>
-          <w:tcPr>
-            <w:tcW w:type="dxa" w:w="5102"/>
-          </w:tcPr>
-          <w:p>
-            <w:r/>
-            <w:r>
-              <w:rPr>
-                <w:sz w:val="16"/>
-              </w:rPr>
-              <w:t>Met: 22 Oct (2), 5 Nov (4)</w:t>
+            <w:tcW w:type="dxa" w:w="397"/>
+          </w:tcPr>
+          <w:p>
+            <w:r/>
+            <w:r>
+              <w:rPr>
+                <w:sz w:val="14"/>
+              </w:rPr>
+              <w:t>9</w:t>
+            </w:r>
+          </w:p>
+        </w:tc>
+        <w:tc>
+          <w:tcPr>
+            <w:tcW w:type="dxa" w:w="1701"/>
+          </w:tcPr>
+          <w:p>
+            <w:r/>
+            <w:r>
+              <w:rPr>
+                <w:sz w:val="14"/>
+              </w:rPr>
+              <w:t>Loss-making colours</w:t>
+            </w:r>
+          </w:p>
+        </w:tc>
+        <w:tc>
+          <w:tcPr>
+            <w:tcW w:type="dxa" w:w="6406"/>
+          </w:tcPr>
+          <w:p>
+            <w:r/>
+            <w:r>
+              <w:rPr>
+                <w:sz w:val="14"/>
+              </w:rPr>
+              <w:t>Colour costs tab: recorded cost, the size's usual cost, standard and realised price, and contribution three ways. Queen Cool Blue and Light Pink carry $16.00–16.20 against $12.48 on most Queen colours and sell below list; Cal King Graphite earns little because of fees; Queen Cool Blue's pace is clearance demand. These are held out of the spring order until their cost records are checked. Full Cool Blue earns less than Full Cool Grey at the standard price, so Full moves to Full Cool Grey.</w:t>
+            </w:r>
+          </w:p>
+        </w:tc>
+        <w:tc>
+          <w:tcPr>
+            <w:tcW w:type="dxa" w:w="1701"/>
+          </w:tcPr>
+          <w:p>
+            <w:r/>
+            <w:r>
+              <w:rPr>
+                <w:sz w:val="14"/>
+              </w:rPr>
+              <w:t>Owner checks the cost records</w:t>
             </w:r>
           </w:p>
         </w:tc>
@@ -2056,29 +2180,57 @@
       <w:tr>
         <w:tc>
           <w:tcPr>
-            <w:tcW w:type="dxa" w:w="5102"/>
-          </w:tcPr>
-          <w:p>
-            <w:r/>
-            <w:r>
-              <w:rPr>
-                <w:sz w:val="16"/>
-              </w:rPr>
-              <w:t>A forecast line if the first held steps are undone</w:t>
-            </w:r>
-          </w:p>
-        </w:tc>
-        <w:tc>
-          <w:tcPr>
-            <w:tcW w:type="dxa" w:w="5102"/>
-          </w:tcPr>
-          <w:p>
-            <w:r/>
-            <w:r>
-              <w:rPr>
-                <w:sz w:val="16"/>
-              </w:rPr>
-              <w:t>Met (section 5b, Budget &amp; envelope)</w:t>
+            <w:tcW w:type="dxa" w:w="397"/>
+          </w:tcPr>
+          <w:p>
+            <w:r/>
+            <w:r>
+              <w:rPr>
+                <w:sz w:val="14"/>
+              </w:rPr>
+              <w:t>10</w:t>
+            </w:r>
+          </w:p>
+        </w:tc>
+        <w:tc>
+          <w:tcPr>
+            <w:tcW w:type="dxa" w:w="1701"/>
+          </w:tcPr>
+          <w:p>
+            <w:r/>
+            <w:r>
+              <w:rPr>
+                <w:sz w:val="14"/>
+              </w:rPr>
+              <w:t>What sets spend</w:t>
+            </w:r>
+          </w:p>
+        </w:tc>
+        <w:tc>
+          <w:tcPr>
+            <w:tcW w:type="dxa" w:w="6406"/>
+          </w:tcPr>
+          <w:p>
+            <w:r/>
+            <w:r>
+              <w:rPr>
+                <w:sz w:val="14"/>
+              </w:rPr>
+              <w:t>What a click earns sets spend; the envelope (12–14% of trailing-7-day sales) is an upper limit, not a target. On that rule the plan ends at $579/wk (9.7%). Keeping the held bases instead costs $690/wk (11.6%); undoing the first held steps (base cuts kept) gives 181 orders at $579/wk.</w:t>
+            </w:r>
+          </w:p>
+        </w:tc>
+        <w:tc>
+          <w:tcPr>
+            <w:tcW w:type="dxa" w:w="1701"/>
+          </w:tcPr>
+          <w:p>
+            <w:r/>
+            <w:r>
+              <w:rPr>
+                <w:sz w:val="14"/>
+              </w:rPr>
+              <w:t>Owner decision: default is the ceiling rule</w:t>
             </w:r>
           </w:p>
         </w:tc>
@@ -2086,29 +2238,57 @@
       <w:tr>
         <w:tc>
           <w:tcPr>
-            <w:tcW w:type="dxa" w:w="5102"/>
-          </w:tcPr>
-          <w:p>
-            <w:r/>
-            <w:r>
-              <w:rPr>
-                <w:sz w:val="16"/>
-              </w:rPr>
-              <w:t>Every Exact keyword with ≥5 September orders has a 7-day rank</w:t>
-            </w:r>
-          </w:p>
-        </w:tc>
-        <w:tc>
-          <w:tcPr>
-            <w:tcW w:type="dxa" w:w="5102"/>
-          </w:tcPr>
-          <w:p>
-            <w:r/>
-            <w:r>
-              <w:rPr>
-                <w:sz w:val="16"/>
-              </w:rPr>
-              <w:t>Open: 10 need a tracker (owner); held pending a rank until then</w:t>
+            <w:tcW w:type="dxa" w:w="397"/>
+          </w:tcPr>
+          <w:p>
+            <w:r/>
+            <w:r>
+              <w:rPr>
+                <w:sz w:val="14"/>
+              </w:rPr>
+              <w:t>11</w:t>
+            </w:r>
+          </w:p>
+        </w:tc>
+        <w:tc>
+          <w:tcPr>
+            <w:tcW w:type="dxa" w:w="1701"/>
+          </w:tcPr>
+          <w:p>
+            <w:r/>
+            <w:r>
+              <w:rPr>
+                <w:sz w:val="14"/>
+              </w:rPr>
+              <w:t>The rank-hold premium</w:t>
+            </w:r>
+          </w:p>
+        </w:tc>
+        <w:tc>
+          <w:tcPr>
+            <w:tcW w:type="dxa" w:w="6406"/>
+          </w:tcPr>
+          <w:p>
+            <w:r/>
+            <w:r>
+              <w:rPr>
+                <w:sz w:val="14"/>
+              </w:rPr>
+              <w:t>(CPC paid − ceiling) × forecast top-of-search clicks on every held row: $866 a month, $169/wk, each row labelled by its held term and campaign ID.</w:t>
+            </w:r>
+          </w:p>
+        </w:tc>
+        <w:tc>
+          <w:tcPr>
+            <w:tcW w:type="dxa" w:w="1701"/>
+          </w:tcPr>
+          <w:p>
+            <w:r/>
+            <w:r>
+              <w:rPr>
+                <w:sz w:val="14"/>
+              </w:rPr>
+              <w:t>Every held row filled</w:t>
             </w:r>
           </w:p>
         </w:tc>
@@ -2116,1024 +2296,57 @@
       <w:tr>
         <w:tc>
           <w:tcPr>
-            <w:tcW w:type="dxa" w:w="5102"/>
-          </w:tcPr>
-          <w:p>
-            <w:r/>
-            <w:r>
-              <w:rPr>
-                <w:sz w:val="16"/>
-              </w:rPr>
-              <w:t>Held test per keyword; keyword-level bids</w:t>
-            </w:r>
-          </w:p>
-        </w:tc>
-        <w:tc>
-          <w:tcPr>
-            <w:tcW w:type="dxa" w:w="5102"/>
-          </w:tcPr>
-          <w:p>
-            <w:r/>
-            <w:r>
-              <w:rPr>
-                <w:sz w:val="16"/>
-              </w:rPr>
-              <w:t>Met (T3, T3k)</w:t>
-            </w:r>
-          </w:p>
-        </w:tc>
-      </w:tr>
-      <w:tr>
-        <w:tc>
-          <w:tcPr>
-            <w:tcW w:type="dxa" w:w="5102"/>
-          </w:tcPr>
-          <w:p>
-            <w:r/>
-            <w:r>
-              <w:rPr>
-                <w:sz w:val="16"/>
-              </w:rPr>
-              <w:t>Premium rows name the held term and campaign ID</w:t>
-            </w:r>
-          </w:p>
-        </w:tc>
-        <w:tc>
-          <w:tcPr>
-            <w:tcW w:type="dxa" w:w="5102"/>
-          </w:tcPr>
-          <w:p>
-            <w:r/>
-            <w:r>
-              <w:rPr>
-                <w:sz w:val="16"/>
-              </w:rPr>
-              <w:t>Met (sections 3, 5b, 10; Owner decisions)</w:t>
-            </w:r>
-          </w:p>
-        </w:tc>
-      </w:tr>
-      <w:tr>
-        <w:tc>
-          <w:tcPr>
-            <w:tcW w:type="dxa" w:w="5102"/>
-          </w:tcPr>
-          <w:p>
-            <w:r/>
-            <w:r>
-              <w:rPr>
-                <w:sz w:val="16"/>
-              </w:rPr>
-              <w:t>Shipment status and units received per line; the check reads OPEN or CONFIRMED</w:t>
-            </w:r>
-          </w:p>
-        </w:tc>
-        <w:tc>
-          <w:tcPr>
-            <w:tcW w:type="dxa" w:w="5102"/>
-          </w:tcPr>
-          <w:p>
-            <w:r/>
-            <w:r>
-              <w:rPr>
-                <w:sz w:val="16"/>
-              </w:rPr>
-              <w:t>Met: OPEN</w:t>
-            </w:r>
-          </w:p>
-        </w:tc>
-      </w:tr>
-      <w:tr>
-        <w:tc>
-          <w:tcPr>
-            <w:tcW w:type="dxa" w:w="5102"/>
-          </w:tcPr>
-          <w:p>
-            <w:r/>
-            <w:r>
-              <w:rPr>
-                <w:sz w:val="16"/>
-              </w:rPr>
-              <w:t>Both Twin campaigns at the ceiling or paused on 2 Oct</w:t>
-            </w:r>
-          </w:p>
-        </w:tc>
-        <w:tc>
-          <w:tcPr>
-            <w:tcW w:type="dxa" w:w="5102"/>
-          </w:tcPr>
-          <w:p>
-            <w:r/>
-            <w:r>
-              <w:rPr>
-                <w:sz w:val="16"/>
-              </w:rPr>
-              <w:t>Met: paused</w:t>
-            </w:r>
-          </w:p>
-        </w:tc>
-      </w:tr>
-      <w:tr>
-        <w:tc>
-          <w:tcPr>
-            <w:tcW w:type="dxa" w:w="5102"/>
-          </w:tcPr>
-          <w:p>
-            <w:r/>
-            <w:r>
-              <w:rPr>
-                <w:sz w:val="16"/>
-              </w:rPr>
-              <w:t>Each held-back colour shows recorded cost, list and realised price beside its contribution</w:t>
-            </w:r>
-          </w:p>
-        </w:tc>
-        <w:tc>
-          <w:tcPr>
-            <w:tcW w:type="dxa" w:w="5102"/>
-          </w:tcPr>
-          <w:p>
-            <w:r/>
-            <w:r>
-              <w:rPr>
-                <w:sz w:val="16"/>
-              </w:rPr>
-              <w:t>Met (Colour costs)</w:t>
-            </w:r>
-          </w:p>
-        </w:tc>
-      </w:tr>
-      <w:tr>
-        <w:tc>
-          <w:tcPr>
-            <w:tcW w:type="dxa" w:w="5102"/>
-          </w:tcPr>
-          <w:p>
-            <w:r/>
-            <w:r>
-              <w:rPr>
-                <w:sz w:val="16"/>
-              </w:rPr>
-              <w:t>Section 2 states which rule sets spend; the owner decision is recorded</w:t>
-            </w:r>
-          </w:p>
-        </w:tc>
-        <w:tc>
-          <w:tcPr>
-            <w:tcW w:type="dxa" w:w="5102"/>
-          </w:tcPr>
-          <w:p>
-            <w:r/>
-            <w:r>
-              <w:rPr>
-                <w:sz w:val="16"/>
-              </w:rPr>
-              <w:t>Met; decision recorded with the default (section 10)</w:t>
-            </w:r>
-          </w:p>
-        </w:tc>
-      </w:tr>
-      <w:tr>
-        <w:tc>
-          <w:tcPr>
-            <w:tcW w:type="dxa" w:w="5102"/>
-          </w:tcPr>
-          <w:p>
-            <w:r/>
-            <w:r>
-              <w:rPr>
-                <w:sz w:val="16"/>
-              </w:rPr>
-              <w:t>Deal SKUs, price and units in the pack</w:t>
-            </w:r>
-          </w:p>
-        </w:tc>
-        <w:tc>
-          <w:tcPr>
-            <w:tcW w:type="dxa" w:w="5102"/>
-          </w:tcPr>
-          <w:p>
-            <w:r/>
-            <w:r>
-              <w:rPr>
-                <w:sz w:val="16"/>
-              </w:rPr>
-              <w:t>Open: in no source the plan can read; asked of the owner</w:t>
-            </w:r>
-          </w:p>
-        </w:tc>
-      </w:tr>
-      <w:tr>
-        <w:tc>
-          <w:tcPr>
-            <w:tcW w:type="dxa" w:w="5102"/>
-          </w:tcPr>
-          <w:p>
-            <w:r/>
-            <w:r>
-              <w:rPr>
-                <w:sz w:val="16"/>
-              </w:rPr>
-              <w:t>No placeholder text printed where a value is missing</w:t>
-            </w:r>
-          </w:p>
-        </w:tc>
-        <w:tc>
-          <w:tcPr>
-            <w:tcW w:type="dxa" w:w="5102"/>
-          </w:tcPr>
-          <w:p>
-            <w:r/>
-            <w:r>
-              <w:rPr>
-                <w:sz w:val="16"/>
-              </w:rPr>
-              <w:t>Met (searched both files)</w:t>
-            </w:r>
-          </w:p>
-        </w:tc>
-      </w:tr>
-    </w:tbl>
-    <w:p/>
-    <w:p>
-      <w:pPr>
-        <w:pStyle w:val="Heading1"/>
-      </w:pPr>
-      <w:r>
-        <w:t>2e. Review 2 (2 Oct): the corrections, and the acceptance checks</w:t>
-      </w:r>
-    </w:p>
-    <w:p>
-      <w:r>
-        <w:t>The second review checked the seven review 1 corrections against this version's rows and found them applied; it raised five corrections and six contradictions from the two things the previous version added, keyword-level held status and the top-of-search-first rule. Each figure was recomputed from the model before it was applied, and all hold. The workbook tab 'Review 2 fixes' lists every row.</w:t>
-      </w:r>
-    </w:p>
-    <w:tbl>
-      <w:tblPr>
-        <w:tblStyle w:val="TableGrid"/>
-        <w:tblW w:type="auto" w:w="0"/>
-        <w:tblLook w:firstColumn="1" w:firstRow="1" w:lastColumn="0" w:lastRow="0" w:noHBand="0" w:noVBand="1" w:val="04A0"/>
-      </w:tblPr>
-      <w:tblGrid>
-        <w:gridCol w:w="3324"/>
-        <w:gridCol w:w="3324"/>
-        <w:gridCol w:w="3324"/>
-      </w:tblGrid>
-      <w:tr>
-        <w:tc>
-          <w:tcPr>
-            <w:tcW w:type="dxa" w:w="454"/>
-            <w:shd w:val="clear" w:color="auto" w:fill="1F3864"/>
-          </w:tcPr>
-          <w:p>
-            <w:r/>
-            <w:r>
-              <w:rPr>
-                <w:b/>
-                <w:color w:val="FFFFFF"/>
-                <w:sz w:val="16"/>
-              </w:rPr>
-              <w:t>#</w:t>
-            </w:r>
-          </w:p>
-        </w:tc>
-        <w:tc>
-          <w:tcPr>
-            <w:tcW w:type="dxa" w:w="2948"/>
-            <w:shd w:val="clear" w:color="auto" w:fill="1F3864"/>
-          </w:tcPr>
-          <w:p>
-            <w:r/>
-            <w:r>
-              <w:rPr>
-                <w:b/>
-                <w:color w:val="FFFFFF"/>
-                <w:sz w:val="16"/>
-              </w:rPr>
-              <w:t>Correction</w:t>
-            </w:r>
-          </w:p>
-        </w:tc>
-        <w:tc>
-          <w:tcPr>
-            <w:tcW w:type="dxa" w:w="6803"/>
-            <w:shd w:val="clear" w:color="auto" w:fill="1F3864"/>
-          </w:tcPr>
-          <w:p>
-            <w:r/>
-            <w:r>
-              <w:rPr>
-                <w:b/>
-                <w:color w:val="FFFFFF"/>
-                <w:sz w:val="16"/>
-              </w:rPr>
-              <w:t>What this version does</w:t>
-            </w:r>
-          </w:p>
-        </w:tc>
-      </w:tr>
-      <w:tr>
-        <w:tc>
-          <w:tcPr>
-            <w:tcW w:type="dxa" w:w="454"/>
-          </w:tcPr>
-          <w:p>
-            <w:r/>
-            <w:r>
-              <w:rPr>
-                <w:sz w:val="16"/>
-              </w:rPr>
-              <w:t>1</w:t>
-            </w:r>
-          </w:p>
-        </w:tc>
-        <w:tc>
-          <w:tcPr>
-            <w:tcW w:type="dxa" w:w="2948"/>
-          </w:tcPr>
-          <w:p>
-            <w:r/>
-            <w:r>
-              <w:rPr>
-                <w:sz w:val="16"/>
-              </w:rPr>
-              <w:t>Six held keywords landed below the CPC paid (the step was solved on the campaign base)</w:t>
-            </w:r>
-          </w:p>
-        </w:tc>
-        <w:tc>
-          <w:tcPr>
-            <w:tcW w:type="dxa" w:w="6803"/>
-          </w:tcPr>
-          <w:p>
-            <w:r/>
-            <w:r>
-              <w:rPr>
-                <w:sz w:val="16"/>
-              </w:rPr>
-              <w:t>The step is checked on each held keyword's own price (bid × (1 + modifier)). 6 held keywords whose bid sits under the base would land under the CPC paid: 'cooling fitted sheet queen' $4.11 → $3.36 (85% of the CPC paid); 'cooling fitted sheet king' $3.63 → $3.07 (87% of the CPC paid); 'king size fitted sheet cooling' $1.65 → $1.41 (39% of the CPC paid); 'king size cooling fitted sheet' $3.50 → $2.89 (92% of the CPC paid); 'king fitted sheet only cooling' $3.99 → $2.79 (73% of the CPC paid); 'queen size fitted sheet only cooling' $3.19 → $2.84 (94% of the CPC paid). Their 6 campaigns keep the modifier and the held keyword's bid; only the riders step, by their own bid (2 of the 6 campaigns have riders; in the other 4 every keyword is held and no top-of-search price moves). 'king size fitted sheet cooling' is read in the console (own clicks and CPC) before any step.</w:t>
-            </w:r>
-          </w:p>
-        </w:tc>
-      </w:tr>
-      <w:tr>
-        <w:tc>
-          <w:tcPr>
-            <w:tcW w:type="dxa" w:w="454"/>
-          </w:tcPr>
-          <w:p>
-            <w:r/>
-            <w:r>
-              <w:rPr>
-                <w:sz w:val="16"/>
-              </w:rPr>
-              <w:t>2</w:t>
-            </w:r>
-          </w:p>
-        </w:tc>
-        <w:tc>
-          <w:tcPr>
-            <w:tcW w:type="dxa" w:w="2948"/>
-          </w:tcPr>
-          <w:p>
-            <w:r/>
-            <w:r>
-              <w:rPr>
-                <w:sz w:val="16"/>
-              </w:rPr>
-              <w:t>The guard read the campaign, not the held keyword</w:t>
-            </w:r>
-          </w:p>
-        </w:tc>
-        <w:tc>
-          <w:tcPr>
-            <w:tcW w:type="dxa" w:w="6803"/>
-          </w:tcPr>
-          <w:p>
-            <w:r/>
-            <w:r>
-              <w:rPr>
-                <w:sz w:val="16"/>
-              </w:rPr>
-              <w:t>The guard reads each held keyword's own top-of-search impression share (keyword rows of the targeting report), 6–19 Sep and since the last write; 25 keyword rows replace the campaign rows in Needs console IDs. Where a keyword share is not reported, only periods after 2 Oct are compared, so the keyword set is the same on both sides.</w:t>
-            </w:r>
-          </w:p>
-        </w:tc>
-      </w:tr>
-      <w:tr>
-        <w:tc>
-          <w:tcPr>
-            <w:tcW w:type="dxa" w:w="454"/>
-          </w:tcPr>
-          <w:p>
-            <w:r/>
-            <w:r>
-              <w:rPr>
-                <w:sz w:val="16"/>
-              </w:rPr>
-              <w:t>3</w:t>
-            </w:r>
-          </w:p>
-        </w:tc>
-        <w:tc>
-          <w:tcPr>
-            <w:tcW w:type="dxa" w:w="2948"/>
-          </w:tcPr>
-          <w:p>
-            <w:r/>
-            <w:r>
-              <w:rPr>
-                <w:sz w:val="16"/>
-              </w:rPr>
-              <w:t>Top-of-search-first was applied from the product average</w:t>
-            </w:r>
-          </w:p>
-        </w:tc>
-        <w:tc>
-          <w:tcPr>
-            <w:tcW w:type="dxa" w:w="6803"/>
-          </w:tcPr>
-          <w:p>
-            <w:r/>
-            <w:r>
-              <w:rPr>
-                <w:sz w:val="16"/>
-              </w:rPr>
-              <w:t>Applied campaign by campaign where a placement has 50 or more clicks, the product average below that. 'cooling fitted sheet' keeps its rest-of-search modifier (20%: $14.96 an order there against $20.62 at top of search); the other cut (under 50 clicks) stands. Product pages use their own conversion from 50 clicks: 'cooling fitted sheet' 10.89% → $1.17; 'cool fitted sheet queen' 6.45% → $0.69; 'cool fitted sheet king' 8.47% → $0.76. Top of search is held for rank, not because it is the cheapest order everywhere (section 5c).</w:t>
-            </w:r>
-          </w:p>
-        </w:tc>
-      </w:tr>
-      <w:tr>
-        <w:tc>
-          <w:tcPr>
-            <w:tcW w:type="dxa" w:w="454"/>
-          </w:tcPr>
-          <w:p>
-            <w:r/>
-            <w:r>
-              <w:rPr>
-                <w:sz w:val="16"/>
-              </w:rPr>
-              <w:t>4</w:t>
-            </w:r>
-          </w:p>
-        </w:tc>
-        <w:tc>
-          <w:tcPr>
-            <w:tcW w:type="dxa" w:w="2948"/>
-          </w:tcPr>
-          <w:p>
-            <w:r/>
-            <w:r>
-              <w:rPr>
-                <w:sz w:val="16"/>
-              </w:rPr>
-              <w:t>The two Full raises rested on a questioned cost record</w:t>
-            </w:r>
-          </w:p>
-        </w:tc>
-        <w:tc>
-          <w:tcPr>
-            <w:tcW w:type="dxa" w:w="6803"/>
-          </w:tcPr>
-          <w:p>
-            <w:r/>
-            <w:r>
-              <w:rPr>
-                <w:sz w:val="16"/>
-              </w:rPr>
-              <w:t>Both held until Full Cool Grey's $11.49 cost is checked against the supplier invoice. Ceiling $1.38 at $11.49, $0.71 at the usual $15.45 (product pages $0.28, under the $0.50 floor). If $11.49 holds, the raises start on the write after the first conversion read on Full Cool Grey; if $15.45, no raise, the ceiling is re-solved and the no-margin test re-run.</w:t>
-            </w:r>
-          </w:p>
-        </w:tc>
-      </w:tr>
-      <w:tr>
-        <w:tc>
-          <w:tcPr>
-            <w:tcW w:type="dxa" w:w="454"/>
-          </w:tcPr>
-          <w:p>
-            <w:r/>
-            <w:r>
-              <w:rPr>
-                <w:sz w:val="16"/>
-              </w:rPr>
-              <w:t>5</w:t>
-            </w:r>
-          </w:p>
-        </w:tc>
-        <w:tc>
-          <w:tcPr>
-            <w:tcW w:type="dxa" w:w="2948"/>
-          </w:tcPr>
-          <w:p>
-            <w:r/>
-            <w:r>
-              <w:rPr>
-                <w:sz w:val="16"/>
-              </w:rPr>
-              <w:t>The forecast treated the step to the CPC paid as free</w:t>
-            </w:r>
-          </w:p>
-        </w:tc>
-        <w:tc>
-          <w:tcPr>
-            <w:tcW w:type="dxa" w:w="6803"/>
-          </w:tcPr>
-          <w:p>
-            <w:r/>
-            <w:r>
-              <w:rPr>
-                <w:sz w:val="16"/>
-              </w:rPr>
-              <w:t>The CPC paid is an average, so the step can keep up to every click. Wave A (2 campaigns, 46 of 191 held orders): keeps every top-of-search click (the most it can keep) $743 / 40 orders a month; top-of-search clicks −25% $586 / 32 orders a month; top-of-search clicks −50% $429 / 24 orders a month. 5 Nov read, before wave B: wave B steps only if every wave A held keyword keeps at least 85% of its 6–19 Sep top-of-search impression share (keyword rows; 2–6 Oct where the keyword share is not reported) and its rank has not slipped more than 3 places. Between 70% and 85% the wave A step is kept but wave B waits one read (19 Nov); under 70% the wave A step is undone and wave B does not step this season.</w:t>
-            </w:r>
-          </w:p>
-        </w:tc>
-      </w:tr>
-    </w:tbl>
-    <w:p/>
-    <w:tbl>
-      <w:tblPr>
-        <w:tblStyle w:val="TableGrid"/>
-        <w:tblW w:type="auto" w:w="0"/>
-        <w:tblLook w:firstColumn="1" w:firstRow="1" w:lastColumn="0" w:lastRow="0" w:noHBand="0" w:noVBand="1" w:val="04A0"/>
-      </w:tblPr>
-      <w:tblGrid>
-        <w:gridCol w:w="4986"/>
-        <w:gridCol w:w="4986"/>
-      </w:tblGrid>
-      <w:tr>
-        <w:tc>
-          <w:tcPr>
-            <w:tcW w:type="dxa" w:w="4535"/>
-            <w:shd w:val="clear" w:color="auto" w:fill="1F3864"/>
-          </w:tcPr>
-          <w:p>
-            <w:r/>
-            <w:r>
-              <w:rPr>
-                <w:b/>
-                <w:color w:val="FFFFFF"/>
-                <w:sz w:val="16"/>
-              </w:rPr>
-              <w:t>Contradiction (review 2)</w:t>
-            </w:r>
-          </w:p>
-        </w:tc>
-        <w:tc>
-          <w:tcPr>
-            <w:tcW w:type="dxa" w:w="5669"/>
-            <w:shd w:val="clear" w:color="auto" w:fill="1F3864"/>
-          </w:tcPr>
-          <w:p>
-            <w:r/>
-            <w:r>
-              <w:rPr>
-                <w:b/>
-                <w:color w:val="FFFFFF"/>
-                <w:sz w:val="16"/>
-              </w:rPr>
-              <w:t>Now</w:t>
-            </w:r>
-          </w:p>
-        </w:tc>
-      </w:tr>
-      <w:tr>
-        <w:tc>
-          <w:tcPr>
-            <w:tcW w:type="dxa" w:w="4535"/>
-          </w:tcPr>
-          <w:p>
-            <w:r/>
-            <w:r>
-              <w:rPr>
-                <w:sz w:val="16"/>
-              </w:rPr>
-              <w:t>Section 5 said no price goes up; two raises elsewhere</w:t>
-            </w:r>
-          </w:p>
-        </w:tc>
-        <w:tc>
-          <w:tcPr>
-            <w:tcW w:type="dxa" w:w="5669"/>
-          </w:tcPr>
-          <w:p>
-            <w:r/>
-            <w:r>
-              <w:rPr>
-                <w:sz w:val="16"/>
-              </w:rPr>
-              <w:t>No price rises: the two Full raises to the ceiling are held for the cost check (section 5, 5c, E Checks agree)</w:t>
-            </w:r>
-          </w:p>
-        </w:tc>
-      </w:tr>
-      <w:tr>
-        <w:tc>
-          <w:tcPr>
-            <w:tcW w:type="dxa" w:w="4535"/>
-          </w:tcPr>
-          <w:p>
-            <w:r/>
-            <w:r>
-              <w:rPr>
-                <w:sz w:val="16"/>
-              </w:rPr>
-              <w:t>Run-outs said to count confirmed stock, but the table counted unconfirmed shipments</w:t>
-            </w:r>
-          </w:p>
-        </w:tc>
-        <w:tc>
-          <w:tcPr>
-            <w:tcW w:type="dxa" w:w="5669"/>
-          </w:tcPr>
-          <w:p>
-            <w:r/>
-            <w:r>
-              <w:rPr>
-                <w:sz w:val="16"/>
-              </w:rPr>
-              <w:t>Section 6, A16 and Stock &amp; reorder show the confirmed run-out date beside the date if every shipment lands</w:t>
-            </w:r>
-          </w:p>
-        </w:tc>
-      </w:tr>
-      <w:tr>
-        <w:tc>
-          <w:tcPr>
-            <w:tcW w:type="dxa" w:w="4535"/>
-          </w:tcPr>
-          <w:p>
-            <w:r/>
-            <w:r>
-              <w:rPr>
-                <w:sz w:val="16"/>
-              </w:rPr>
-              <w:t>Budget &amp; envelope 'first held steps undone' cell (204 orders, $690/wk)</w:t>
-            </w:r>
-          </w:p>
-        </w:tc>
-        <w:tc>
-          <w:tcPr>
-            <w:tcW w:type="dxa" w:w="5669"/>
-          </w:tcPr>
-          <w:p>
-            <w:r/>
-            <w:r>
-              <w:rPr>
-                <w:sz w:val="16"/>
-              </w:rPr>
-              <w:t>Corrected: undoing the first steps keeps the base cuts — 181 orders, $579/wk</w:t>
-            </w:r>
-          </w:p>
-        </w:tc>
-      </w:tr>
-      <w:tr>
-        <w:tc>
-          <w:tcPr>
-            <w:tcW w:type="dxa" w:w="4535"/>
-          </w:tcPr>
-          <w:p>
-            <w:r/>
-            <w:r>
-              <w:rPr>
-                <w:sz w:val="16"/>
-              </w:rPr>
-              <w:t>10 vs 11 keywords held pending a rank</w:t>
-            </w:r>
-          </w:p>
-        </w:tc>
-        <w:tc>
-          <w:tcPr>
-            <w:tcW w:type="dxa" w:w="5669"/>
-          </w:tcPr>
-          <w:p>
-            <w:r/>
-            <w:r>
-              <w:rPr>
-                <w:sz w:val="16"/>
-              </w:rPr>
-              <w:t>10 terms on 11 keyword rows ('cool fitted sheet king' sits in two campaigns), everywhere</w:t>
-            </w:r>
-          </w:p>
-        </w:tc>
-      </w:tr>
-      <w:tr>
-        <w:tc>
-          <w:tcPr>
-            <w:tcW w:type="dxa" w:w="4535"/>
-          </w:tcPr>
-          <w:p>
-            <w:r/>
-            <w:r>
-              <w:rPr>
-                <w:sz w:val="16"/>
-              </w:rPr>
-              <w:t>Full White 468 units shown as shipments 'ready to ship'</w:t>
-            </w:r>
-          </w:p>
-        </w:tc>
-        <w:tc>
-          <w:tcPr>
-            <w:tcW w:type="dxa" w:w="5669"/>
-          </w:tcPr>
-          <w:p>
-            <w:r/>
-            <w:r>
-              <w:rPr>
-                <w:sz w:val="16"/>
-              </w:rPr>
-              <w:t>Labelled as the planned PO due 25 Jan 2027</w:t>
-            </w:r>
-          </w:p>
-        </w:tc>
-      </w:tr>
-      <w:tr>
-        <w:tc>
-          <w:tcPr>
-            <w:tcW w:type="dxa" w:w="4535"/>
-          </w:tcPr>
-          <w:p>
-            <w:r/>
-            <w:r>
-              <w:rPr>
-                <w:sz w:val="16"/>
-              </w:rPr>
-              <w:t>Table 3 rows printed '2 Oct ;' with no action</w:t>
-            </w:r>
-          </w:p>
-        </w:tc>
-        <w:tc>
-          <w:tcPr>
-            <w:tcW w:type="dxa" w:w="5669"/>
-          </w:tcPr>
-          <w:p>
-            <w:r/>
-            <w:r>
-              <w:rPr>
-                <w:sz w:val="16"/>
-              </w:rPr>
-              <w:t>Every write is printed with its action; modifier changes as percentages</w:t>
-            </w:r>
-          </w:p>
-        </w:tc>
-      </w:tr>
-    </w:tbl>
-    <w:p/>
-    <w:tbl>
-      <w:tblPr>
-        <w:tblStyle w:val="TableGrid"/>
-        <w:tblW w:type="auto" w:w="0"/>
-        <w:tblLook w:firstColumn="1" w:firstRow="1" w:lastColumn="0" w:lastRow="0" w:noHBand="0" w:noVBand="1" w:val="04A0"/>
-      </w:tblPr>
-      <w:tblGrid>
-        <w:gridCol w:w="4986"/>
-        <w:gridCol w:w="4986"/>
-      </w:tblGrid>
-      <w:tr>
-        <w:tc>
-          <w:tcPr>
-            <w:tcW w:type="dxa" w:w="5102"/>
-            <w:shd w:val="clear" w:color="auto" w:fill="1F3864"/>
-          </w:tcPr>
-          <w:p>
-            <w:r/>
-            <w:r>
-              <w:rPr>
-                <w:b/>
-                <w:color w:val="FFFFFF"/>
-                <w:sz w:val="16"/>
-              </w:rPr>
-              <w:t>Acceptance check (review 2)</w:t>
-            </w:r>
-          </w:p>
-        </w:tc>
-        <w:tc>
-          <w:tcPr>
-            <w:tcW w:type="dxa" w:w="5102"/>
-            <w:shd w:val="clear" w:color="auto" w:fill="1F3864"/>
-          </w:tcPr>
-          <w:p>
-            <w:r/>
-            <w:r>
-              <w:rPr>
-                <w:b/>
-                <w:color w:val="FFFFFF"/>
-                <w:sz w:val="16"/>
-              </w:rPr>
-              <w:t>State</w:t>
-            </w:r>
-          </w:p>
-        </w:tc>
-      </w:tr>
-      <w:tr>
-        <w:tc>
-          <w:tcPr>
-            <w:tcW w:type="dxa" w:w="5102"/>
-          </w:tcPr>
-          <w:p>
-            <w:r/>
-            <w:r>
-              <w:rPr>
-                <w:sz w:val="16"/>
-              </w:rPr>
-              <w:t>Each held keyword's price after the first step at or above the CPC paid, or its bid and modifier unchanged</w:t>
-            </w:r>
-          </w:p>
-        </w:tc>
-        <w:tc>
-          <w:tcPr>
-            <w:tcW w:type="dxa" w:w="5102"/>
-          </w:tcPr>
-          <w:p>
-            <w:r/>
-            <w:r>
-              <w:rPr>
-                <w:sz w:val="16"/>
-              </w:rPr>
-              <w:t>Met: lowest 100% where a step is taken; 6 campaigns unchanged</w:t>
-            </w:r>
-          </w:p>
-        </w:tc>
-      </w:tr>
-      <w:tr>
-        <w:tc>
-          <w:tcPr>
-            <w:tcW w:type="dxa" w:w="5102"/>
-          </w:tcPr>
-          <w:p>
-            <w:r/>
-            <w:r>
-              <w:rPr>
-                <w:sz w:val="16"/>
-              </w:rPr>
-              <w:t>Guard read per held keyword</w:t>
-            </w:r>
-          </w:p>
-        </w:tc>
-        <w:tc>
-          <w:tcPr>
-            <w:tcW w:type="dxa" w:w="5102"/>
-          </w:tcPr>
-          <w:p>
-            <w:r/>
-            <w:r>
-              <w:rPr>
-                <w:sz w:val="16"/>
-              </w:rPr>
-              <w:t>Met: 25 keyword rows in Needs console IDs</w:t>
-            </w:r>
-          </w:p>
-        </w:tc>
-      </w:tr>
-      <w:tr>
-        <w:tc>
-          <w:tcPr>
-            <w:tcW w:type="dxa" w:w="5102"/>
-          </w:tcPr>
-          <w:p>
-            <w:r/>
-            <w:r>
-              <w:rPr>
-                <w:sz w:val="16"/>
-              </w:rPr>
-              <w:t>Placement rule per campaign from 50 clicks; the 'cooling fitted sheet' rest-of-search modifier kept or the reason stated</w:t>
-            </w:r>
-          </w:p>
-        </w:tc>
-        <w:tc>
-          <w:tcPr>
-            <w:tcW w:type="dxa" w:w="5102"/>
-          </w:tcPr>
-          <w:p>
-            <w:r/>
-            <w:r>
-              <w:rPr>
-                <w:sz w:val="16"/>
-              </w:rPr>
-              <w:t>Met: kept</w:t>
-            </w:r>
-          </w:p>
-        </w:tc>
-      </w:tr>
-      <w:tr>
-        <w:tc>
-          <w:tcPr>
-            <w:tcW w:type="dxa" w:w="5102"/>
-          </w:tcPr>
-          <w:p>
-            <w:r/>
-            <w:r>
-              <w:rPr>
-                <w:sz w:val="16"/>
-              </w:rPr>
-              <w:t>Product-page ceiling on own conversion from 50 clicks</w:t>
-            </w:r>
-          </w:p>
-        </w:tc>
-        <w:tc>
-          <w:tcPr>
-            <w:tcW w:type="dxa" w:w="5102"/>
-          </w:tcPr>
-          <w:p>
-            <w:r/>
-            <w:r>
-              <w:rPr>
-                <w:sz w:val="16"/>
-              </w:rPr>
-              <w:t>Met: 3 campaigns</w:t>
-            </w:r>
-          </w:p>
-        </w:tc>
-      </w:tr>
-      <w:tr>
-        <w:tc>
-          <w:tcPr>
-            <w:tcW w:type="dxa" w:w="5102"/>
-          </w:tcPr>
-          <w:p>
-            <w:r/>
-            <w:r>
-              <w:rPr>
-                <w:sz w:val="16"/>
-              </w:rPr>
-              <w:t>Full raises dated after the cost check, ceiling at both costs</w:t>
-            </w:r>
-          </w:p>
-        </w:tc>
-        <w:tc>
-          <w:tcPr>
-            <w:tcW w:type="dxa" w:w="5102"/>
-          </w:tcPr>
-          <w:p>
-            <w:r/>
-            <w:r>
-              <w:rPr>
-                <w:sz w:val="16"/>
-              </w:rPr>
-              <w:t>Met: no date until the check; both ceilings shown</w:t>
-            </w:r>
-          </w:p>
-        </w:tc>
-      </w:tr>
-      <w:tr>
-        <w:tc>
-          <w:tcPr>
-            <w:tcW w:type="dxa" w:w="5102"/>
-          </w:tcPr>
-          <w:p>
-            <w:r/>
-            <w:r>
-              <w:rPr>
-                <w:sz w:val="16"/>
-              </w:rPr>
-              <w:t>Wave A cases at 25% and 50% click loss, and the rule that stops wave B</w:t>
-            </w:r>
-          </w:p>
-        </w:tc>
-        <w:tc>
-          <w:tcPr>
-            <w:tcW w:type="dxa" w:w="5102"/>
-          </w:tcPr>
-          <w:p>
-            <w:r/>
-            <w:r>
-              <w:rPr>
-                <w:sz w:val="16"/>
-              </w:rPr>
-              <w:t>Met (section 5b, Monitoring)</w:t>
-            </w:r>
-          </w:p>
-        </w:tc>
-      </w:tr>
-      <w:tr>
-        <w:tc>
-          <w:tcPr>
-            <w:tcW w:type="dxa" w:w="5102"/>
-          </w:tcPr>
-          <w:p>
-            <w:r/>
-            <w:r>
-              <w:rPr>
-                <w:sz w:val="16"/>
-              </w:rPr>
-              <w:t>The six contradictions read the same in both places; confirmed run-outs shown</w:t>
-            </w:r>
-          </w:p>
-        </w:tc>
-        <w:tc>
-          <w:tcPr>
-            <w:tcW w:type="dxa" w:w="5102"/>
-          </w:tcPr>
-          <w:p>
-            <w:r/>
-            <w:r>
-              <w:rPr>
-                <w:sz w:val="16"/>
-              </w:rPr>
-              <w:t>Met</w:t>
+            <w:tcW w:type="dxa" w:w="397"/>
+          </w:tcPr>
+          <w:p>
+            <w:r/>
+            <w:r>
+              <w:rPr>
+                <w:sz w:val="14"/>
+              </w:rPr>
+              <w:t>12</w:t>
+            </w:r>
+          </w:p>
+        </w:tc>
+        <w:tc>
+          <w:tcPr>
+            <w:tcW w:type="dxa" w:w="1701"/>
+          </w:tcPr>
+          <w:p>
+            <w:r/>
+            <w:r>
+              <w:rPr>
+                <w:sz w:val="14"/>
+              </w:rPr>
+              <w:t>The 7 Oct Lightning Deal</w:t>
+            </w:r>
+          </w:p>
+        </w:tc>
+        <w:tc>
+          <w:tcPr>
+            <w:tcW w:type="dxa" w:w="6406"/>
+          </w:tcPr>
+          <w:p>
+            <w:r/>
+            <w:r>
+              <w:rPr>
+                <w:sz w:val="14"/>
+              </w:rPr>
+              <w:t>SOP-32: writes on 2 Oct, arming 6 Oct, bids hold through the deal, no write 6–21 Oct, and those days leave every read. The campaigns expected to cap first are named in Monitoring. The deal SKUs, price and units are in no source the plan can read.</w:t>
+            </w:r>
+          </w:p>
+        </w:tc>
+        <w:tc>
+          <w:tcPr>
+            <w:tcW w:type="dxa" w:w="1701"/>
+          </w:tcPr>
+          <w:p>
+            <w:r/>
+            <w:r>
+              <w:rPr>
+                <w:sz w:val="14"/>
+              </w:rPr>
+              <w:t>Open: the owner sends the deal details</w:t>
             </w:r>
           </w:p>
         </w:tc>
@@ -13841,7 +13054,7 @@
         <w:pStyle w:val="ListBullet"/>
       </w:pPr>
       <w:r>
-        <w:t>Spend level (review 1, decision 3): the plan's default lets what a click earns set spend — $579/wk at 31 Dec, 9.7% of last week's sales, $137–256/wk under the envelope. The alternative, keeping the held bases, spends $690/wk (11.6%) for 23 more Exact orders a month — about $25 each against $9.79 of contribution. Confirm the default or choose the alternative.</w:t>
+        <w:t>Spend level: the plan's default lets what a click earns set spend — $579/wk at 31 Dec, 9.7% of last week's sales, $137–256/wk under the envelope. The alternative, keeping the held bases, spends $690/wk (11.6%) for 23 more Exact orders a month — about $25 each against $9.79 of contribution. Confirm the default or choose the alternative.</w:t>
       </w:r>
     </w:p>
     <w:p>
@@ -13849,7 +13062,7 @@
         <w:pStyle w:val="ListBullet"/>
       </w:pPr>
       <w:r>
-        <w:t>Placement rule (review 2, the decision): the plan's default applies top-of-search-first campaign by campaign wherever a placement has 50 or more clicks, and the product average only below that (so 'cooling fitted sheet' keeps its rest-of-search modifier); the alternative keeps it as one product-wide rule.</w:t>
+        <w:t>Placement rule: the plan's default applies top-of-search-first campaign by campaign wherever a placement has 50 or more clicks, and the product average only below that (so 'cooling fitted sheet' keeps its rest-of-search modifier); the alternative keeps it as one product-wide rule.</w:t>
       </w:r>
     </w:p>
     <w:p>
@@ -13865,7 +13078,7 @@
         <w:pStyle w:val="ListBullet"/>
       </w:pPr>
       <w:r>
-        <w:t>First held step (review 1, decision 1): the plan's default is the CPC paid, in two waves; the alternative is the 90% step on all held rows at once (at most 45–84% of the clicks kept).</w:t>
+        <w:t>First held step: the plan's default is the CPC paid, in two waves; the alternative is the 90% step on all held rows at once (at most 45–84% of the clicks kept).</w:t>
       </w:r>
     </w:p>
     <w:p>
@@ -13873,7 +13086,7 @@
         <w:pStyle w:val="ListBullet"/>
       </w:pPr>
       <w:r>
-        <w:t>Loss-making colours (review 1, decision 2): the plan's default holds Cal King Graphite, Queen Cool Blue, Queen Light Pink out of the spring order until their cost records are checked against the supplier invoices; the alternative is to fix the records first and reorder on the corrected contribution.</w:t>
+        <w:t>Loss-making colours: the plan's default holds Cal King Graphite, Queen Cool Blue, Queen Light Pink out of the spring order until their cost records are checked against the supplier invoices; the alternative is to fix the records first and reorder on the corrected contribution.</w:t>
       </w:r>
     </w:p>
     <w:p>
@@ -14046,7 +13259,7 @@
     </w:p>
     <w:p>
       <w:r>
-        <w:t>Files: this document is the plan; the full review follows as its appendix (sections A0–A19). SCFS_Action_Plan_20261002.xlsx is the upload file — action list, bulk rows, the four pricing tables, stock, monitoring, the SCS4 rules applied — with the evidence tabs (marked E) after them. All read-only analysis; nothing was changed in any tool.</w:t>
+        <w:t>Files: this document is the plan; the full analysis follows as its appendix (sections A0–A19). SCFS_Action_Plan_20261002.xlsx is the upload file — action list, bulk rows, the four pricing tables, stock, monitoring, the key choices and the shared rules — with the evidence tabs (marked E) after them. All read-only analysis; nothing was changed in any tool.</w:t>
       </w:r>
     </w:p>
     <w:p>
@@ -14054,12 +13267,12 @@
         <w:pStyle w:val="Heading1"/>
       </w:pPr>
       <w:r>
-        <w:t>Appendix — the full review</w:t>
+        <w:t>Appendix — the full analysis</w:t>
       </w:r>
     </w:p>
     <w:p>
       <w:r>
-        <w:t>Sleephoria Cooling Fitted Sheet — PPC, ranking and stock review — 2 October 2026 · Amazon US · 65 SKUs with sales or stock · data to 1 Oct · every number traced to its source</w:t>
+        <w:t>Sleephoria Cooling Fitted Sheet — PPC, ranking and stock analysis — 2 October 2026 · Amazon US · 65 SKUs with sales or stock · data to 1 Oct · every number traced to its source</w:t>
       </w:r>
     </w:p>
     <w:p>
@@ -37119,7 +36332,7 @@
     </w:p>
     <w:p>
       <w:r>
-        <w:t>The audit's run takes spend from $140.08 to $222.40 a day and TACoS from 12.56% to 19.95% — all of the increase in new campaigns — on a 31.3% contribution; its own review cuts that to $171.54 and 15.4%. On the realised margins (Queen White 28%, King White 23% break-even) the held-to-the-cent top-of-search prices lose money on every order there, and the new spend arrives as the season turns down. Its forecast is not used.</w:t>
+        <w:t>The audit's run takes spend from $140.08 to $222.40 a day and TACoS from 12.56% to 19.95% — all of the increase in new campaigns — on a 31.3% contribution; the audit's own reviewer agent cuts that to $171.54 and 15.4%. On the realised margins (Queen White 28%, King White 23% break-even) the held-to-the-cent top-of-search prices lose money on every order there, and the new spend arrives as the season turns down. Its forecast is not used.</w:t>
       </w:r>
     </w:p>
     <w:p>
@@ -45531,7 +44744,7 @@
     <w:p/>
     <w:p>
       <w:r>
-        <w:t>Checks (E Checks): Sellerboard per-SKU units = family total, 1 Apr–30 Sep — PASS; Exact spend = plan rows (Command Center, 30 days) — PASS; Audit decisions reconciled — PASS; No top-of-search price above its ceiling; rises only to the ceiling on tier-A children (TOS-first) — PASS; TOS-first: top of search gains share of Exact spend and orders — PASS; No bid rises anywhere — PASS; Non-held price paths end within 5% of their ceiling; held paths end where the guard stops them — PASS; First held step at the CPC paid on every held keyword's own price (review 2) — PASS; Guard read per held keyword (review 2) — PASS; Placement rule per campaign from 50 clicks (review 2) — PASS; Product-page ceiling on own conversion from 50 clicks (review 2) — PASS; Full raises held for the cost check (review 2) — PASS; Wave A forecast cases and the wave B stop rule (review 2) — PASS; Deal window (SOP-32): no write on any campaign 6–21 Oct — PASS; Rank-hold premium on the ceiling rate — PASS; One lever per write on held and re-pointed campaigns — PASS; Held rollout split across two dates (review 1) — PASS; Held test per keyword (review 1) — PASS; Rank coverage (review 1) — OPEN; Twin at the Cal King rule (review 1) — PASS; Held status read on every live keyword, either rank source (7-day medians) — PASS; Audit single-day ranks checked against 7-day medians — PASS; Non-held bases end within 5% of what a product-page click affords; held bases stop where the order guard binds — PASS; One stock clock; tiers and triggers on confirmed stock only — PASS; Held terms keep more of their delivery than the rest (central) — PASS; Rows priced on the plan child — PASS; No row advertises a child that loses money before ads — PASS; Spend envelope — PASS; Shipments: units reconcile; arrival not confirmed — OPEN; FC transfers dated — OPEN; Top-of-search impression share (guard metric) — OPEN.</w:t>
+        <w:t>Checks (E Checks): Sellerboard per-SKU units = family total, 1 Apr–30 Sep — PASS; Exact spend = plan rows (Command Center, 30 days) — PASS; Audit decisions reconciled — PASS; No top-of-search price above its ceiling; rises only to the ceiling on tier-A children (TOS-first) — PASS; TOS-first: top of search gains share of Exact spend and orders — PASS; No bid rises anywhere — PASS; Non-held price paths end within 5% of their ceiling; held paths end where the guard stops them — PASS; First held step at the CPC paid on every held keyword's own price — PASS; Guard read per held keyword — PASS; Placement rule per campaign from 50 clicks — PASS; Product-page ceiling on own conversion from 50 clicks — PASS; Full raises held for the cost check — PASS; Wave A forecast cases and the wave B stop rule — PASS; Deal window (SOP-32): no write on any campaign 6–21 Oct — PASS; Rank-hold premium on the ceiling rate — PASS; One lever per write on held and re-pointed campaigns — PASS; Held rollout split across two dates — PASS; Held test per keyword — PASS; Rank coverage — OPEN; Twin at the Cal King rule — PASS; Held status read on every live keyword, either rank source (7-day medians) — PASS; Audit single-day ranks checked against 7-day medians — PASS; Non-held bases end within 5% of what a product-page click affords; held bases stop where the order guard binds — PASS; One stock clock; tiers and triggers on confirmed stock only — PASS; Held terms keep more of their delivery than the rest (central) — PASS; Rows priced on the plan child — PASS; No row advertises a child that loses money before ads — PASS; Spend envelope — PASS; Shipments: units reconcile; arrival not confirmed — OPEN; FC transfers dated — OPEN; Top-of-search impression share (guard metric) — OPEN.</w:t>
       </w:r>
     </w:p>
     <w:p>

</xml_diff>